<commit_message>
docs(fase1): incorporar indice, introduccion, seguridad, mockups y conclusiones
</commit_message>
<xml_diff>
--- a/Borradores/Entrega 1/INFORME_FASE_1_DEFINICION_PROYECTO_ACE.docx
+++ b/Borradores/Entrega 1/INFORME_FASE_1_DEFINICION_PROYECTO_ACE.docx
@@ -807,10 +807,11 @@
     </w:p>
     <w:p>
       <w:pPr>
-        <w:rPr>
-          <w:rFonts w:ascii="Calibri" w:cs="Calibri" w:eastAsia="Calibri" w:hAnsi="Calibri"/>
-        </w:rPr>
-      </w:pPr>
+        <w:pStyle w:val="Heading1"/>
+        <w:rPr/>
+      </w:pPr>
+      <w:bookmarkStart w:colFirst="0" w:colLast="0" w:name="_heading=h.lbhydplrdblv" w:id="2"/>
+      <w:bookmarkEnd w:id="2"/>
       <w:r>
         <w:rPr>
           <w:rtl w:val="0"/>
@@ -819,7 +820,7 @@
     </w:p>
     <w:sdt>
       <w:sdtPr>
-        <w:id w:val="-1193711159"/>
+        <w:id w:val="630554338"/>
         <w:docPartObj>
           <w:docPartGallery w:val="Table of Contents"/>
           <w:docPartUnique w:val="1"/>
@@ -1947,14 +1948,387 @@
       </w:r>
     </w:p>
     <w:p>
+      <w:r>
+        <w:rPr>
+          <w:b/>
+          <w:color w:val="003366"/>
+          <w:sz w:val="32"/>
+        </w:rPr>
+        <w:t>ÍNDICE GENERAL</w:t>
+      </w:r>
+    </w:p>
+    <w:p>
+      <w:r>
+        <w:rPr>
+          <w:b/>
+          <w:sz w:val="21"/>
+        </w:rPr>
+        <w:t>INTRODUCCIÓN                                                                    3</w:t>
+      </w:r>
+    </w:p>
+    <w:p>
+      <w:r>
+        <w:rPr>
+          <w:b/>
+          <w:sz w:val="21"/>
+        </w:rPr>
+        <w:t>PARTE I: DEFINICIÓN Y CONTEXTO DEL PROYECTO                                     4</w:t>
+      </w:r>
+    </w:p>
+    <w:p>
+      <w:r>
+        <w:rPr>
+          <w:sz w:val="21"/>
+        </w:rPr>
+        <w:t xml:space="preserve">   1.1 Antecedentes Generales y del Equipo                                      4</w:t>
+      </w:r>
+    </w:p>
+    <w:p>
+      <w:r>
+        <w:rPr>
+          <w:sz w:val="21"/>
+        </w:rPr>
+        <w:t xml:space="preserve">   1.2 Descripción del Proyecto APT y Relevancia en el Campo Laboral            5</w:t>
+      </w:r>
+    </w:p>
+    <w:p>
+      <w:r>
+        <w:rPr>
+          <w:sz w:val="21"/>
+        </w:rPr>
+        <w:t xml:space="preserve">   1.3 Relación con las Competencias del Perfil de Egreso                       6</w:t>
+      </w:r>
+    </w:p>
+    <w:p>
+      <w:r>
+        <w:rPr>
+          <w:sz w:val="21"/>
+        </w:rPr>
+        <w:t xml:space="preserve">   1.4 Relación del Proyecto con los Intereses Profesionales                    7</w:t>
+      </w:r>
+    </w:p>
+    <w:p>
+      <w:r>
+        <w:rPr>
+          <w:sz w:val="21"/>
+        </w:rPr>
+        <w:t xml:space="preserve">   1.5 Factibilidad del Proyecto y Modelo Operacional                           8</w:t>
+      </w:r>
+    </w:p>
+    <w:p>
+      <w:r>
+        <w:rPr>
+          <w:sz w:val="21"/>
+        </w:rPr>
+        <w:t xml:space="preserve">      1.5.1 Factibilidad Temporal                                               8</w:t>
+      </w:r>
+    </w:p>
+    <w:p>
+      <w:r>
+        <w:rPr>
+          <w:sz w:val="21"/>
+        </w:rPr>
+        <w:t xml:space="preserve">      1.5.2 Factibilidad Técnica y de Recursos                                  8</w:t>
+      </w:r>
+    </w:p>
+    <w:p>
+      <w:r>
+        <w:rPr>
+          <w:sz w:val="21"/>
+        </w:rPr>
+        <w:t xml:space="preserve">      1.5.3 Factores Facilitadores                                              9</w:t>
+      </w:r>
+    </w:p>
+    <w:p>
+      <w:r>
+        <w:rPr>
+          <w:sz w:val="21"/>
+        </w:rPr>
+        <w:t xml:space="preserve">      1.5.4 Factores Obstaculizadores y Plan de Mitigación                      9</w:t>
+      </w:r>
+    </w:p>
+    <w:p>
+      <w:r>
+        <w:rPr>
+          <w:sz w:val="21"/>
+        </w:rPr>
+        <w:t xml:space="preserve">      1.5.5 Modelo de Negocio e Impacto Operacional para Lumina Motion         10</w:t>
+      </w:r>
+    </w:p>
+    <w:p>
+      <w:r>
+        <w:rPr>
+          <w:b/>
+          <w:color w:val="003366"/>
+          <w:sz w:val="24"/>
+        </w:rPr>
+        <w:t>1.5.5 Modelo de Negocio e Impacto Operacional para Lumina Motion</w:t>
+      </w:r>
+    </w:p>
+    <w:p>
+      <w:r>
+        <w:rPr>
+          <w:sz w:val="22"/>
+        </w:rPr>
+        <w:t>A diferencia de las soluciones genéricas de cartelería digital que operan bajo suscripciones comerciales públicas tipo SaaS, el proyecto ACE adopta un modelo de software a medida para uso operacional interno (Internal Tooling) de Lumina Motion Studio. Este enfoque estratégico genera un triple impacto financiero y competitivo:</w:t>
+        <w:br/>
+        <w:t>1. Eliminación de Licenciamiento Recurrente: Se sustituye el pago mensual por pantalla de licencias comerciales fragmentadas (como MadMapper y Arena.im) por una plataforma propia, escalable y sin costo marginal por dispositivo incorporado.</w:t>
+        <w:br/>
+        <w:t>2. Reducción a Cero de Gastos Logísticos: Se erradica la necesidad de traslados físicos de técnicos in situ para actualizaciones de anuncios vía dispositivos USB en centros comerciales, ahorrando costos directos en horas-hombre, traslados y viáticos.</w:t>
+        <w:br/>
+        <w:t>3. Blindaje Contractual ante Clientes Finales: Al asegurar tolerancia total ante caídas de internet (resiliencia offline), Lumina Motion elimina el riesgo de sanciones comerciales y pérdida de ingresos publicitarios derivados de pantallas en negro durante eventos corporativos o campañas masivas.</w:t>
+      </w:r>
+    </w:p>
+    <w:p/>
+    <w:p>
+      <w:r>
+        <w:rPr>
+          <w:b/>
+          <w:sz w:val="21"/>
+        </w:rPr>
+        <w:t>PARTE II: OBJETIVOS, METODOLOGÍA Y PLANIFICACIÓN                               11</w:t>
+      </w:r>
+    </w:p>
+    <w:p>
+      <w:r>
+        <w:rPr>
+          <w:sz w:val="21"/>
+        </w:rPr>
+        <w:t xml:space="preserve">   2.1 Formulación de Objetivos (General y 6 Específicos)                      11</w:t>
+      </w:r>
+    </w:p>
+    <w:p>
+      <w:r>
+        <w:rPr>
+          <w:sz w:val="21"/>
+        </w:rPr>
+        <w:t xml:space="preserve">   2.2 Metodología de Trabajo y Roles Disciplinares (Scrum Adaptado)           12</w:t>
+      </w:r>
+    </w:p>
+    <w:p>
+      <w:r>
+        <w:rPr>
+          <w:sz w:val="21"/>
+        </w:rPr>
+        <w:t xml:space="preserve">   2.3 Plan de Trabajo Articulado por Competencias (22 Actividades)            13</w:t>
+      </w:r>
+    </w:p>
+    <w:p>
+      <w:r>
+        <w:rPr>
+          <w:sz w:val="21"/>
+        </w:rPr>
+        <w:t xml:space="preserve">   2.4 Determinación y Justificación de Evidencias                             15</w:t>
+      </w:r>
+    </w:p>
+    <w:p>
+      <w:r>
+        <w:rPr>
+          <w:sz w:val="21"/>
+        </w:rPr>
+        <w:t xml:space="preserve">   2.5 Cronograma de Trabajo y Carta Gantt (18 Semanas)                        16</w:t>
+      </w:r>
+    </w:p>
+    <w:p>
+      <w:r>
+        <w:rPr>
+          <w:sz w:val="21"/>
+        </w:rPr>
+        <w:t xml:space="preserve">   2.6 Políticas de Seguridad y Protección de la Información                   17</w:t>
+      </w:r>
+    </w:p>
+    <w:p>
+      <w:r>
+        <w:rPr>
+          <w:sz w:val="21"/>
+        </w:rPr>
+        <w:t xml:space="preserve">   2.7 Prototipos Visuales y Wireframes de Interfaz (Mockups UI/UX)            18</w:t>
+      </w:r>
+    </w:p>
+    <w:p>
+      <w:r>
+        <w:rPr>
+          <w:b/>
+          <w:sz w:val="21"/>
+        </w:rPr>
+        <w:t>PARTE III: CONCLUSIONES Y VALOR AGREGADO                                       19</w:t>
+      </w:r>
+    </w:p>
+    <w:p>
+      <w:r>
+        <w:rPr>
+          <w:b/>
+          <w:color w:val="003366"/>
+          <w:sz w:val="24"/>
+        </w:rPr>
+        <w:t>2.6 Políticas de Seguridad y Protección de la Información</w:t>
+      </w:r>
+    </w:p>
+    <w:p>
+      <w:r>
+        <w:rPr>
+          <w:sz w:val="22"/>
+        </w:rPr>
+        <w:t>La plataforma ACE implementa medidas de seguridad y privacidad en tres capas fundamentales:</w:t>
+        <w:br/>
+        <w:t>• Autenticación y Control de Accesos por Locación: El acceso a la interfaz web administrativa se gestiona mediante tokens JWT y Laravel Sanctum. Se aplican dos roles diferenciados: Administrador (acceso global irrestricto, utilizado por Cristóbal Manzo) y Operador (acceso estrictamente restringido a las locaciones autorizadas mediante la tabla relacional usuarios_locaciones), impidiendo la visualización o manipulación de contenidos no asignados.</w:t>
+        <w:br/>
+        <w:t>• Verificación de Integridad Criptográfica (SHA-256): Para mitigar el riesgo de inyección o corrupción de archivos multimedia durante transferencias de red, el reproductor local (NUC) calcula mandatoriamente el hash SHA-256 de cada archivo descargado y lo valida contra el catálogo central antes de autorizar su exhibición.</w:t>
+        <w:br/>
+        <w:t>• Seguridad en Comunicaciones y Aislamiento Offline: El canal de sincronización combina endpoints HTTPS REST con WebSockets autenticados (wss://). Ante la caída de conexión exterior, el reproductor no expone puertos vulnerables a internet y restringe la gestión manual de contingencia exclusivamente a la red de área local autorizada.</w:t>
+        <w:br/>
+        <w:t>• Privacidad y Protección de Datos Personales: En estricto cumplimiento de directrices éticas y de protección de identidad, ningún dato personal sensible de los integrantes (tales como números de RUT) se registra en repositorios Git públicos o archivos Markdown, reservándose exclusivamente para el canal privado de titulación.</w:t>
+      </w:r>
+    </w:p>
+    <w:p/>
+    <w:p>
+      <w:r>
+        <w:rPr>
+          <w:b/>
+          <w:color w:val="003366"/>
+          <w:sz w:val="24"/>
+        </w:rPr>
+        <w:t>2.7 Prototipos Visuales y Wireframes de Interfaz (Mockups UI/UX)</w:t>
+      </w:r>
+    </w:p>
+    <w:p>
+      <w:r>
+        <w:rPr>
+          <w:sz w:val="22"/>
+        </w:rPr>
+        <w:t>En concordancia con el plan de trabajo de ingeniería (Actividad 2.3: Diseño UI/UX), la plataforma web administrativa contempla interfaces optimizadas para la usabilidad y rapidez operativa de Lumina Motion. Los componentes esenciales incluyen: (a) Panel de control de pantallas con semáforo de telemetría en vivo, (b) Gestor de catálogos multimedia con verificación de códecs y pesos, y (c) Parrilla interactiva para la asignación de horarios sin solapamientos entre locaciones y sectores.</w:t>
+      </w:r>
+    </w:p>
+    <w:tbl>
+      <w:tblPr>
+        <w:tblW w:type="auto" w:w="0"/>
+        <w:jc w:val="center"/>
+        <w:tblLook w:firstColumn="1" w:firstRow="1" w:lastColumn="0" w:lastRow="0" w:noHBand="0" w:noVBand="1" w:val="04A0"/>
+      </w:tblPr>
+      <w:tblGrid>
+        <w:gridCol w:w="9360"/>
+      </w:tblGrid>
+      <w:tr>
+        <w:tc>
+          <w:tcPr>
+            <w:tcW w:type="dxa" w:w="9360"/>
+            <w:shd w:fill="F4F6F9"/>
+            <w:tcBorders>
+              <w:top w:val="dashed" w:sz="12" w:space="0" w:color="003366"/>
+              <w:left w:val="dashed" w:sz="12" w:space="0" w:color="003366"/>
+              <w:bottom w:val="dashed" w:sz="12" w:space="0" w:color="003366"/>
+              <w:right w:val="dashed" w:sz="12" w:space="0" w:color="003366"/>
+            </w:tcBorders>
+          </w:tcPr>
+          <w:p>
+            <w:pPr>
+              <w:jc w:val="center"/>
+            </w:pPr>
+            <w:r>
+              <w:rPr>
+                <w:b/>
+                <w:color w:val="003366"/>
+                <w:sz w:val="24"/>
+              </w:rPr>
+              <w:br/>
+              <w:br/>
+              <w:t>🖼️ [ESPACIO RESERVADO PARA INSERCIÓN DE CAPTURAS / WIREFRAMES DE FIGMA]</w:t>
+              <w:br/>
+              <w:br/>
+            </w:r>
+            <w:r>
+              <w:rPr>
+                <w:i/>
+                <w:color w:val="646464"/>
+                <w:sz w:val="20"/>
+              </w:rPr>
+              <w:t>Panel Administrativo Centralizado • Parrilla Horaria de Pautas • Monitoreo de Pantallas NUC en Tiempo Real</w:t>
+              <w:br/>
+              <w:t>(Pegue o inserte aquí las imágenes de los prototipos diseñados en Figma antes de la exportación final a PDF)</w:t>
+              <w:br/>
+              <w:br/>
+            </w:r>
+          </w:p>
+        </w:tc>
+      </w:tr>
+    </w:tbl>
+    <w:p/>
+    <w:p>
+      <w:r>
+        <w:rPr>
+          <w:b/>
+          <w:color w:val="003366"/>
+          <w:sz w:val="28"/>
+        </w:rPr>
+        <w:t>PARTE III: CONCLUSIONES Y VALOR AGREGADO</w:t>
+      </w:r>
+    </w:p>
+    <w:p>
+      <w:r>
+        <w:rPr>
+          <w:sz w:val="22"/>
+        </w:rPr>
+        <w:t>La culminación de esta primera fase evaluativa (Fase 1: Definición del Proyecto APT) permite extraer las siguientes conclusiones fundamentales:</w:t>
+        <w:br/>
+        <w:br/>
+        <w:t>1. Solución de Ingeniería de Alto Valor Industrial: El proyecto ACE trasciende un ejercicio teórico al resolver una problemática operativa auténtica de Lumina Motion Studio. La arquitectura desacoplada propuesta mitiga efectivamente los puntos de falla críticos (actualización manual por USB y vulnerabilidad a pantallas en negro por caídas de internet), asegurando continuidad de negocio y retención publicitaria.</w:t>
+        <w:br/>
+        <w:br/>
+        <w:t>2. Viabilidad y Factibilidad Acreditadas: El análisis multidimensional confirma la plena viabilidad de ejecutar la plataforma en las 18 semanas lectivas. La delimitación rigurosa del alcance —enfocado estrictamente en la distribución, programación y resiliencia offline de contenidos— resguarda al equipo de desviaciones temporales, mientras que la planificación en 22 actividades articuladas por sprints y la disponibilidad de hardware de pruebas garantizan el cumplimiento de los hitos evaluativos de Duoc UC.</w:t>
+        <w:br/>
+        <w:br/>
+        <w:t>3. Articulación Transversal del Perfil de Egreso: El diseño de ACE demuestra la aplicación armónica e integrada de las competencias troncales de la carrera de Ingeniería en Informática (Malla Curricular 1446114): desarrollo distribuido fullstack (C1), persistencia relacional íntegra en MariaDB (C2), y metodologías ágiles de ingeniería de software con aseguramiento de calidad (C3). Asimismo, la corresponsabilidad disciplinar establecida entre Tomás Escalante, Matías Salas y Paulo Loyola asegura un trabajo en equipo sinérgico, auditable y con aportes equitativos comprobables a través de GitHub.</w:t>
+        <w:br/>
+        <w:br/>
+        <w:t>En síntesis, ACE establece las bases técnicas, operativas y metodológicas indispensables para afrontar con éxito la Fase 2 (Construcción del Core y Demostración Funcional), consolidando una solución tecnológica robusta, profesional y de impacto directo en el mercado de la cartelería digital.</w:t>
+      </w:r>
+    </w:p>
+    <w:p/>
+    <w:p>
+      <w:r>
+        <w:rPr>
+          <w:b/>
+          <w:color w:val="003366"/>
+          <w:sz w:val="28"/>
+        </w:rPr>
+        <w:t>PARTE IV: REFERENCIAS BIBLIOGRÁFICAS</w:t>
+      </w:r>
+    </w:p>
+    <w:p/>
+    <w:p>
+      <w:r>
+        <w:rPr>
+          <w:b/>
+          <w:color w:val="003366"/>
+          <w:sz w:val="28"/>
+        </w:rPr>
+        <w:t>INTRODUCCIÓN</w:t>
+      </w:r>
+    </w:p>
+    <w:p>
+      <w:r>
+        <w:rPr>
+          <w:sz w:val="22"/>
+        </w:rPr>
+        <w:t>El presente informe formaliza la definición de ingeniería, arquitectura, alcance y planificación del proyecto de titulación ACE (Autonomous Content Engine), desarrollado en el marco de la asignatura Proyecto de Aplicación Práctica (Capstone, PTY4614) de la carrera de Ingeniería en Informática de Duoc UC, Sede Antonio Varas.</w:t>
+        <w:br/>
+        <w:br/>
+        <w:t>El proyecto aborda una problemática crítica en el ámbito de la cartelería digital (Digital Signage) para el estudio multimedia Lumina Motion Studio: la descentralización operativa de sus pantallas, los altos costos recurrentes de licenciamiento propietario y la vulnerabilidad frente a pérdidas de conectividad en recintos comerciales masivos. A través de una arquitectura cliente-servidor híbrida desacoplada, ACE centraliza la administración remota de medios, locaciones y parrillas de programación, asegurando simultáneamente la continuidad ininterrumpida de reproducción y la capacidad de modificación local ante contingencias sin conexión a internet.</w:t>
+        <w:br/>
+        <w:br/>
+        <w:t>A lo largo de este documento se detallan los antecedentes del equipo, la articulación directa con las competencias del perfil de egreso, el análisis de factibilidad y modelo operacional, la formulación de los 6 objetivos específicos acordados, el marco ágil de desarrollo (Scrum adaptado), la Carta Gantt de 18 semanas, las directrices de seguridad de la información, el espacio para prototipos de interfaz (mockups) y las conclusiones que sustentan la rigurosidad técnica de esta primera fase evaluativa.</w:t>
+      </w:r>
+    </w:p>
+    <w:p/>
+    <w:p>
       <w:pPr>
         <w:pStyle w:val="Heading1"/>
         <w:keepNext w:val="1"/>
         <w:spacing w:after="120" w:before="360" w:lineRule="auto"/>
         <w:rPr/>
       </w:pPr>
-      <w:bookmarkStart w:colFirst="0" w:colLast="0" w:name="_heading=h.iklnied1bnrg" w:id="2"/>
-      <w:bookmarkEnd w:id="2"/>
+      <w:bookmarkStart w:colFirst="0" w:colLast="0" w:name="_heading=h.iklnied1bnrg" w:id="3"/>
+      <w:bookmarkEnd w:id="3"/>
       <w:r>
         <w:rPr>
           <w:rtl w:val="0"/>
@@ -1969,8 +2343,8 @@
         <w:spacing w:after="80" w:before="280" w:lineRule="auto"/>
         <w:rPr/>
       </w:pPr>
-      <w:bookmarkStart w:colFirst="0" w:colLast="0" w:name="_heading=h.josnt27larj8" w:id="3"/>
-      <w:bookmarkEnd w:id="3"/>
+      <w:bookmarkStart w:colFirst="0" w:colLast="0" w:name="_heading=h.josnt27larj8" w:id="4"/>
+      <w:bookmarkEnd w:id="4"/>
       <w:r>
         <w:rPr>
           <w:rtl w:val="0"/>
@@ -2525,8 +2899,8 @@
         <w:spacing w:after="80" w:before="280" w:lineRule="auto"/>
         <w:rPr/>
       </w:pPr>
-      <w:bookmarkStart w:colFirst="0" w:colLast="0" w:name="_heading=h.fhyubvtgds10" w:id="4"/>
-      <w:bookmarkEnd w:id="4"/>
+      <w:bookmarkStart w:colFirst="0" w:colLast="0" w:name="_heading=h.fhyubvtgds10" w:id="5"/>
+      <w:bookmarkEnd w:id="5"/>
       <w:r>
         <w:rPr>
           <w:rtl w:val="0"/>
@@ -2541,8 +2915,8 @@
         <w:spacing w:after="40" w:before="200" w:lineRule="auto"/>
         <w:rPr/>
       </w:pPr>
-      <w:bookmarkStart w:colFirst="0" w:colLast="0" w:name="_heading=h.wmsx5fvuekd" w:id="5"/>
-      <w:bookmarkEnd w:id="5"/>
+      <w:bookmarkStart w:colFirst="0" w:colLast="0" w:name="_heading=h.wmsx5fvuekd" w:id="6"/>
+      <w:bookmarkEnd w:id="6"/>
       <w:r>
         <w:rPr>
           <w:rtl w:val="0"/>
@@ -3085,8 +3459,8 @@
           <w:color w:val="1b365d"/>
         </w:rPr>
       </w:pPr>
-      <w:bookmarkStart w:colFirst="0" w:colLast="0" w:name="_heading=h.qg8iqlhupppz" w:id="6"/>
-      <w:bookmarkEnd w:id="6"/>
+      <w:bookmarkStart w:colFirst="0" w:colLast="0" w:name="_heading=h.qg8iqlhupppz" w:id="7"/>
+      <w:bookmarkEnd w:id="7"/>
       <w:r>
         <w:rPr>
           <w:rtl w:val="0"/>
@@ -3419,8 +3793,8 @@
         <w:spacing w:after="80" w:before="280" w:lineRule="auto"/>
         <w:rPr/>
       </w:pPr>
-      <w:bookmarkStart w:colFirst="0" w:colLast="0" w:name="_heading=h.hsf0rg4nv3ug" w:id="7"/>
-      <w:bookmarkEnd w:id="7"/>
+      <w:bookmarkStart w:colFirst="0" w:colLast="0" w:name="_heading=h.hsf0rg4nv3ug" w:id="8"/>
+      <w:bookmarkEnd w:id="8"/>
       <w:r>
         <w:rPr>
           <w:rtl w:val="0"/>
@@ -3850,8 +4224,8 @@
         <w:spacing w:after="80" w:before="280" w:lineRule="auto"/>
         <w:rPr/>
       </w:pPr>
-      <w:bookmarkStart w:colFirst="0" w:colLast="0" w:name="_heading=h.wu4ro6en6gyz" w:id="8"/>
-      <w:bookmarkEnd w:id="8"/>
+      <w:bookmarkStart w:colFirst="0" w:colLast="0" w:name="_heading=h.wu4ro6en6gyz" w:id="9"/>
+      <w:bookmarkEnd w:id="9"/>
       <w:r>
         <w:rPr>
           <w:rtl w:val="0"/>
@@ -3887,8 +4261,8 @@
           <w:color w:val="1b365d"/>
         </w:rPr>
       </w:pPr>
-      <w:bookmarkStart w:colFirst="0" w:colLast="0" w:name="_heading=h.wc32q3doo5nt" w:id="9"/>
-      <w:bookmarkEnd w:id="9"/>
+      <w:bookmarkStart w:colFirst="0" w:colLast="0" w:name="_heading=h.wc32q3doo5nt" w:id="10"/>
+      <w:bookmarkEnd w:id="10"/>
       <w:r>
         <w:rPr>
           <w:rtl w:val="0"/>
@@ -3899,6 +4273,26 @@
         <w:rPr>
           <w:rtl w:val="0"/>
         </w:rPr>
+      </w:r>
+    </w:p>
+    <w:p>
+      <w:pPr>
+        <w:spacing w:after="160" w:before="80" w:line="276" w:lineRule="auto"/>
+        <w:ind w:left="576" w:right="576" w:firstLine="0"/>
+        <w:rPr>
+          <w:rFonts w:ascii="Calibri" w:cs="Calibri" w:eastAsia="Calibri" w:hAnsi="Calibri"/>
+          <w:sz w:val="21"/>
+          <w:szCs w:val="21"/>
+        </w:rPr>
+      </w:pPr>
+      <w:r>
+        <w:rPr>
+          <w:rFonts w:ascii="Calibri" w:cs="Calibri" w:eastAsia="Calibri" w:hAnsi="Calibri"/>
+          <w:sz w:val="21"/>
+          <w:szCs w:val="21"/>
+          <w:rtl w:val="0"/>
+        </w:rPr>
+        <w:t xml:space="preserve">Mi interés profesional se concentra en el desarrollo de software front-end y la formalización rigurosa de la documentación técnica en proyectos de ingeniería. En el proyecto ACE, canalizo estos intereses liderando el diseño y construcción de las interfaces de usuario (UI/UX) para la administración centralizada de pantallas y contenidos, y el aseguramiento del repositorio documental para garantizar la trazabilidad, mantenibilidad y escalabilidad del producto a lo largo del tiempo.</w:t>
       </w:r>
     </w:p>
     <w:p>
@@ -3916,21 +4310,47 @@
       </w:pPr>
       <w:r>
         <w:rPr>
+          <w:rtl w:val="0"/>
+        </w:rPr>
+      </w:r>
+    </w:p>
+    <w:p>
+      <w:pPr>
+        <w:pStyle w:val="Heading3"/>
+        <w:keepNext w:val="1"/>
+        <w:spacing w:after="40" w:before="200" w:lineRule="auto"/>
+        <w:rPr>
+          <w:color w:val="1b365d"/>
+        </w:rPr>
+      </w:pPr>
+      <w:bookmarkStart w:colFirst="0" w:colLast="0" w:name="_heading=h.nln85i63hxpn" w:id="11"/>
+      <w:bookmarkEnd w:id="11"/>
+      <w:r>
+        <w:rPr>
+          <w:rtl w:val="0"/>
+        </w:rPr>
+        <w:t xml:space="preserve">1.4.2 Tomás Escalante</w:t>
+      </w:r>
+      <w:r>
+        <w:rPr>
+          <w:rtl w:val="0"/>
+        </w:rPr>
+      </w:r>
+    </w:p>
+    <w:p>
+      <w:pPr>
+        <w:spacing w:after="160" w:before="80" w:line="276" w:lineRule="auto"/>
+        <w:ind w:left="576" w:right="576" w:firstLine="0"/>
+        <w:rPr>
           <w:rFonts w:ascii="Calibri" w:cs="Calibri" w:eastAsia="Calibri" w:hAnsi="Calibri"/>
           <w:i w:val="1"/>
           <w:iCs w:val="1"/>
           <w:color w:val="718096"/>
           <w:sz w:val="21"/>
           <w:szCs w:val="21"/>
-          <w:rtl w:val="0"/>
-        </w:rPr>
-        <w:t xml:space="preserve">"Mi interés profesional se concentran en el desarrollo de software frontend, la estructuración y optimización de bases de datos relacionales, y la formalización rigurosa de la documentación técnica en proyectos de ingeniería. En el proyecto ACE, canalizo estos intereses liderando el diseño y construcción de las interfaces de usuario (UI/UX) para la administración centralizada de pantallas y contenidos, el modelamiento e implementación del esquema relacional en MariaDB asegurando integridad de datos, y el aseguramiento del repositorio documental para garantizar la trazabilidad, mantenibilidad y escalabilidad del producto a lo largo del tiempo."</w:t>
-      </w:r>
-    </w:p>
-    <w:p>
-      <w:pPr>
-        <w:spacing w:after="160" w:before="80" w:line="276" w:lineRule="auto"/>
-        <w:ind w:left="576" w:right="576" w:firstLine="0"/>
+        </w:rPr>
+      </w:pPr>
+      <w:r>
         <w:rPr>
           <w:rFonts w:ascii="Calibri" w:cs="Calibri" w:eastAsia="Calibri" w:hAnsi="Calibri"/>
           <w:i w:val="1"/>
@@ -3938,35 +4358,9 @@
           <w:color w:val="718096"/>
           <w:sz w:val="21"/>
           <w:szCs w:val="21"/>
-        </w:rPr>
-      </w:pPr>
-      <w:r>
-        <w:rPr>
-          <w:rtl w:val="0"/>
-        </w:rPr>
-      </w:r>
-    </w:p>
-    <w:p>
-      <w:pPr>
-        <w:pStyle w:val="Heading3"/>
-        <w:keepNext w:val="1"/>
-        <w:spacing w:after="40" w:before="200" w:lineRule="auto"/>
-        <w:rPr>
-          <w:color w:val="1b365d"/>
-        </w:rPr>
-      </w:pPr>
-      <w:bookmarkStart w:colFirst="0" w:colLast="0" w:name="_heading=h.nln85i63hxpn" w:id="10"/>
-      <w:bookmarkEnd w:id="10"/>
-      <w:r>
-        <w:rPr>
-          <w:rtl w:val="0"/>
-        </w:rPr>
-        <w:t xml:space="preserve">1.4.2 Tomás Escalante</w:t>
-      </w:r>
-      <w:r>
-        <w:rPr>
-          <w:rtl w:val="0"/>
-        </w:rPr>
+          <w:rtl w:val="0"/>
+        </w:rPr>
+        <w:t xml:space="preserve">"Mi foco profesional se sitúa en la arquitectura de software distribuida, el desarrollo backend de alto rendimiento y la ingeniería de servicios resilientes ante condiciones de conectividad adversas. En ACE, aplico estas competencias diseñando e implementando la lógica de servidor en Laravel, la arquitectura de microservicios o servicios API, los protocolos de sincronización y control bidireccional vía WebSockets entre la nube y los nodos reproductores locales, garantizando una alta disponibilidad del sistema ante interrupciones de red."</w:t>
       </w:r>
     </w:p>
     <w:p>
@@ -3984,32 +4378,6 @@
       </w:pPr>
       <w:r>
         <w:rPr>
-          <w:rFonts w:ascii="Calibri" w:cs="Calibri" w:eastAsia="Calibri" w:hAnsi="Calibri"/>
-          <w:i w:val="1"/>
-          <w:iCs w:val="1"/>
-          <w:color w:val="718096"/>
-          <w:sz w:val="21"/>
-          <w:szCs w:val="21"/>
-          <w:rtl w:val="0"/>
-        </w:rPr>
-        <w:t xml:space="preserve">"Mi foco profesional se sitúa en la arquitectura de software distribuida, el desarrollo backend de alto rendimiento y la ingeniería de servicios resilientes ante condiciones de conectividad adversas. En ACE, aplico estas competencias diseñando e implementando la lógica de servidor en Laravel, la arquitectura de microservicios o servicios API, los protocolos de sincronización y control bidireccional vía WebSockets entre la nube y los nodos reproductores locales, garantizando una alta disponibilidad del sistema ante interrupciones de red."</w:t>
-      </w:r>
-    </w:p>
-    <w:p>
-      <w:pPr>
-        <w:spacing w:after="160" w:before="80" w:line="276" w:lineRule="auto"/>
-        <w:ind w:left="576" w:right="576" w:firstLine="0"/>
-        <w:rPr>
-          <w:rFonts w:ascii="Calibri" w:cs="Calibri" w:eastAsia="Calibri" w:hAnsi="Calibri"/>
-          <w:i w:val="1"/>
-          <w:iCs w:val="1"/>
-          <w:color w:val="718096"/>
-          <w:sz w:val="21"/>
-          <w:szCs w:val="21"/>
-        </w:rPr>
-      </w:pPr>
-      <w:r>
-        <w:rPr>
           <w:rtl w:val="0"/>
         </w:rPr>
       </w:r>
@@ -4023,8 +4391,8 @@
           <w:color w:val="1b365d"/>
         </w:rPr>
       </w:pPr>
-      <w:bookmarkStart w:colFirst="0" w:colLast="0" w:name="_heading=h.rqvjlu6rhws6" w:id="11"/>
-      <w:bookmarkEnd w:id="11"/>
+      <w:bookmarkStart w:colFirst="0" w:colLast="0" w:name="_heading=h.rqvjlu6rhws6" w:id="12"/>
+      <w:bookmarkEnd w:id="12"/>
       <w:r>
         <w:rPr>
           <w:rtl w:val="0"/>
@@ -4144,8 +4512,8 @@
         <w:spacing w:after="80" w:before="280" w:lineRule="auto"/>
         <w:rPr/>
       </w:pPr>
-      <w:bookmarkStart w:colFirst="0" w:colLast="0" w:name="_heading=h.3fne4z30hwks" w:id="12"/>
-      <w:bookmarkEnd w:id="12"/>
+      <w:bookmarkStart w:colFirst="0" w:colLast="0" w:name="_heading=h.3fne4z30hwks" w:id="13"/>
+      <w:bookmarkEnd w:id="13"/>
       <w:r>
         <w:rPr>
           <w:rtl w:val="0"/>
@@ -4193,8 +4561,8 @@
         <w:spacing w:after="40" w:before="200" w:lineRule="auto"/>
         <w:rPr/>
       </w:pPr>
-      <w:bookmarkStart w:colFirst="0" w:colLast="0" w:name="_heading=h.98vl3q91usm1" w:id="13"/>
-      <w:bookmarkEnd w:id="13"/>
+      <w:bookmarkStart w:colFirst="0" w:colLast="0" w:name="_heading=h.98vl3q91usm1" w:id="14"/>
+      <w:bookmarkEnd w:id="14"/>
       <w:r>
         <w:rPr>
           <w:rtl w:val="0"/>
@@ -4508,8 +4876,8 @@
           <w:color w:val="1b365d"/>
         </w:rPr>
       </w:pPr>
-      <w:bookmarkStart w:colFirst="0" w:colLast="0" w:name="_heading=h.8t4x5b9leec9" w:id="14"/>
-      <w:bookmarkEnd w:id="14"/>
+      <w:bookmarkStart w:colFirst="0" w:colLast="0" w:name="_heading=h.8t4x5b9leec9" w:id="15"/>
+      <w:bookmarkEnd w:id="15"/>
       <w:r>
         <w:rPr>
           <w:rtl w:val="0"/>
@@ -4680,8 +5048,8 @@
           <w:color w:val="1b365d"/>
         </w:rPr>
       </w:pPr>
-      <w:bookmarkStart w:colFirst="0" w:colLast="0" w:name="_heading=h.de48t4gtiegb" w:id="15"/>
-      <w:bookmarkEnd w:id="15"/>
+      <w:bookmarkStart w:colFirst="0" w:colLast="0" w:name="_heading=h.de48t4gtiegb" w:id="16"/>
+      <w:bookmarkEnd w:id="16"/>
       <w:r>
         <w:rPr>
           <w:rtl w:val="0"/>
@@ -5114,8 +5482,8 @@
         <w:spacing w:after="40" w:before="200" w:lineRule="auto"/>
         <w:rPr/>
       </w:pPr>
-      <w:bookmarkStart w:colFirst="0" w:colLast="0" w:name="_heading=h.2z3vtuwyd7l0" w:id="16"/>
-      <w:bookmarkEnd w:id="16"/>
+      <w:bookmarkStart w:colFirst="0" w:colLast="0" w:name="_heading=h.2z3vtuwyd7l0" w:id="17"/>
+      <w:bookmarkEnd w:id="17"/>
       <w:r>
         <w:rPr>
           <w:rtl w:val="0"/>
@@ -5628,8 +5996,8 @@
         <w:spacing w:after="120" w:before="360" w:lineRule="auto"/>
         <w:rPr/>
       </w:pPr>
-      <w:bookmarkStart w:colFirst="0" w:colLast="0" w:name="_heading=h.n4i0344bdmob" w:id="17"/>
-      <w:bookmarkEnd w:id="17"/>
+      <w:bookmarkStart w:colFirst="0" w:colLast="0" w:name="_heading=h.n4i0344bdmob" w:id="18"/>
+      <w:bookmarkEnd w:id="18"/>
       <w:r>
         <w:rPr>
           <w:rtl w:val="0"/>
@@ -5644,8 +6012,8 @@
         <w:spacing w:after="80" w:before="280" w:lineRule="auto"/>
         <w:rPr/>
       </w:pPr>
-      <w:bookmarkStart w:colFirst="0" w:colLast="0" w:name="_heading=h.c6nytzpz9krs" w:id="18"/>
-      <w:bookmarkEnd w:id="18"/>
+      <w:bookmarkStart w:colFirst="0" w:colLast="0" w:name="_heading=h.c6nytzpz9krs" w:id="19"/>
+      <w:bookmarkEnd w:id="19"/>
       <w:r>
         <w:rPr>
           <w:rtl w:val="0"/>
@@ -5672,8 +6040,8 @@
         <w:spacing w:after="40" w:before="200" w:lineRule="auto"/>
         <w:rPr/>
       </w:pPr>
-      <w:bookmarkStart w:colFirst="0" w:colLast="0" w:name="_heading=h.kiovd6eb4qlc" w:id="19"/>
-      <w:bookmarkEnd w:id="19"/>
+      <w:bookmarkStart w:colFirst="0" w:colLast="0" w:name="_heading=h.kiovd6eb4qlc" w:id="20"/>
+      <w:bookmarkEnd w:id="20"/>
       <w:r>
         <w:rPr>
           <w:rtl w:val="0"/>
@@ -5718,8 +6086,8 @@
         <w:spacing w:after="40" w:before="200" w:lineRule="auto"/>
         <w:rPr/>
       </w:pPr>
-      <w:bookmarkStart w:colFirst="0" w:colLast="0" w:name="_heading=h.4i6uqzlecoiy" w:id="20"/>
-      <w:bookmarkEnd w:id="20"/>
+      <w:bookmarkStart w:colFirst="0" w:colLast="0" w:name="_heading=h.4i6uqzlecoiy" w:id="21"/>
+      <w:bookmarkEnd w:id="21"/>
       <w:r>
         <w:rPr>
           <w:rtl w:val="0"/>
@@ -6077,8 +6445,8 @@
         <w:spacing w:after="80" w:before="280" w:lineRule="auto"/>
         <w:rPr/>
       </w:pPr>
-      <w:bookmarkStart w:colFirst="0" w:colLast="0" w:name="_heading=h.1jgg0ppegonj" w:id="21"/>
-      <w:bookmarkEnd w:id="21"/>
+      <w:bookmarkStart w:colFirst="0" w:colLast="0" w:name="_heading=h.1jgg0ppegonj" w:id="22"/>
+      <w:bookmarkEnd w:id="22"/>
       <w:r>
         <w:rPr>
           <w:rtl w:val="0"/>
@@ -6093,8 +6461,8 @@
         <w:spacing w:after="40" w:before="200" w:lineRule="auto"/>
         <w:rPr/>
       </w:pPr>
-      <w:bookmarkStart w:colFirst="0" w:colLast="0" w:name="_heading=h.2qahxkqijv16" w:id="22"/>
-      <w:bookmarkEnd w:id="22"/>
+      <w:bookmarkStart w:colFirst="0" w:colLast="0" w:name="_heading=h.2qahxkqijv16" w:id="23"/>
+      <w:bookmarkEnd w:id="23"/>
       <w:r>
         <w:rPr>
           <w:rtl w:val="0"/>
@@ -6381,8 +6749,8 @@
         <w:spacing w:after="40" w:before="200" w:lineRule="auto"/>
         <w:rPr/>
       </w:pPr>
-      <w:bookmarkStart w:colFirst="0" w:colLast="0" w:name="_heading=h.6odqy81ojh9k" w:id="23"/>
-      <w:bookmarkEnd w:id="23"/>
+      <w:bookmarkStart w:colFirst="0" w:colLast="0" w:name="_heading=h.6odqy81ojh9k" w:id="24"/>
+      <w:bookmarkEnd w:id="24"/>
       <w:r>
         <w:rPr>
           <w:rtl w:val="0"/>
@@ -6972,8 +7340,8 @@
         <w:spacing w:after="80" w:before="280" w:lineRule="auto"/>
         <w:rPr/>
       </w:pPr>
-      <w:bookmarkStart w:colFirst="0" w:colLast="0" w:name="_heading=h.6bunf7rcq2lf" w:id="24"/>
-      <w:bookmarkEnd w:id="24"/>
+      <w:bookmarkStart w:colFirst="0" w:colLast="0" w:name="_heading=h.6bunf7rcq2lf" w:id="25"/>
+      <w:bookmarkEnd w:id="25"/>
       <w:r>
         <w:rPr>
           <w:rtl w:val="0"/>
@@ -10626,8 +10994,8 @@
         <w:spacing w:after="80" w:before="280" w:lineRule="auto"/>
         <w:rPr/>
       </w:pPr>
-      <w:bookmarkStart w:colFirst="0" w:colLast="0" w:name="_heading=h.w2hixefaoh6o" w:id="25"/>
-      <w:bookmarkEnd w:id="25"/>
+      <w:bookmarkStart w:colFirst="0" w:colLast="0" w:name="_heading=h.w2hixefaoh6o" w:id="26"/>
+      <w:bookmarkEnd w:id="26"/>
       <w:r>
         <w:rPr>
           <w:rtl w:val="0"/>
@@ -11703,8 +12071,8 @@
         <w:spacing w:after="80" w:before="280" w:lineRule="auto"/>
         <w:rPr/>
       </w:pPr>
-      <w:bookmarkStart w:colFirst="0" w:colLast="0" w:name="_heading=h.ddmcy04ctvzk" w:id="26"/>
-      <w:bookmarkEnd w:id="26"/>
+      <w:bookmarkStart w:colFirst="0" w:colLast="0" w:name="_heading=h.ddmcy04ctvzk" w:id="27"/>
+      <w:bookmarkEnd w:id="27"/>
       <w:r>
         <w:rPr>
           <w:rtl w:val="0"/>
@@ -12845,8 +13213,8 @@
         <w:spacing w:after="120" w:before="360" w:lineRule="auto"/>
         <w:rPr/>
       </w:pPr>
-      <w:bookmarkStart w:colFirst="0" w:colLast="0" w:name="_heading=h.n6am33p5jfpu" w:id="27"/>
-      <w:bookmarkEnd w:id="27"/>
+      <w:bookmarkStart w:colFirst="0" w:colLast="0" w:name="_heading=h.n6am33p5jfpu" w:id="28"/>
+      <w:bookmarkEnd w:id="28"/>
       <w:r>
         <w:rPr>
           <w:rtl w:val="0"/>
@@ -25501,7 +25869,7 @@
 
 <file path=customXML/item1.xml><?xml version="1.0" encoding="utf-8"?>
 <go:gDocsCustomXmlDataStorage xmlns:go="http://customooxmlschemas.google.com/" xmlns:r="http://schemas.openxmlformats.org/officeDocument/2006/relationships" uri="GoogleDocsCustomDataVersion2">
-  <go:docsCustomData xmlns:go="http://customooxmlschemas.google.com/" roundtripDataSignature="AMtx7mhgplFxxrU2Ns5eWj1o97xKK3VTLw==">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</go:docsCustomData>
+  <go:docsCustomData xmlns:go="http://customooxmlschemas.google.com/" roundtripDataSignature="AMtx7miCtVJ7cLk1lTfahnGKuKk0rQ/Khw==">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</go:docsCustomData>
 </go:gDocsCustomXmlDataStorage>
 </file>
 

</xml_diff>

<commit_message>
docs(fase1): actualizar y pulir informe de entrega Fase 1
</commit_message>
<xml_diff>
--- a/Borradores/Entrega 1/INFORME_FASE_1_DEFINICION_PROYECTO_ACE.docx
+++ b/Borradores/Entrega 1/INFORME_FASE_1_DEFINICION_PROYECTO_ACE.docx
@@ -820,7 +820,7 @@
     </w:p>
     <w:sdt>
       <w:sdtPr>
-        <w:id w:val="630554338"/>
+        <w:id w:val="1205793304"/>
         <w:docPartObj>
           <w:docPartGallery w:val="Table of Contents"/>
           <w:docPartUnique w:val="1"/>
@@ -835,10 +835,19 @@
             </w:tabs>
             <w:spacing w:after="0" w:before="60" w:line="240" w:lineRule="auto"/>
             <w:rPr>
+              <w:rFonts w:ascii="Arial" w:cs="Arial" w:eastAsia="Arial" w:hAnsi="Arial"/>
               <w:b w:val="1"/>
               <w:bCs w:val="1"/>
+              <w:i w:val="0"/>
+              <w:iCs w:val="0"/>
+              <w:smallCaps w:val="0"/>
+              <w:strike w:val="0"/>
               <w:color w:val="000000"/>
+              <w:sz w:val="22"/>
+              <w:szCs w:val="22"/>
               <w:u w:val="none"/>
+              <w:shd w:fill="auto" w:val="clear"/>
+              <w:vertAlign w:val="baseline"/>
             </w:rPr>
           </w:pPr>
           <w:r>
@@ -846,6 +855,58 @@
             <w:instrText xml:space="preserve"> TOC \h \u \z \t "Heading 1,1,Heading 2,2,Heading 3,3,Heading 4,4,Heading 5,5,Heading 6,6,"</w:instrText>
             <w:fldChar w:fldCharType="separate"/>
           </w:r>
+          <w:hyperlink w:anchor="_heading=h.tsvaipc2dt49">
+            <w:r>
+              <w:rPr>
+                <w:rFonts w:ascii="Calibri" w:cs="Calibri" w:eastAsia="Calibri" w:hAnsi="Calibri"/>
+                <w:b w:val="1"/>
+                <w:bCs w:val="1"/>
+                <w:i w:val="0"/>
+                <w:iCs w:val="0"/>
+                <w:smallCaps w:val="0"/>
+                <w:strike w:val="0"/>
+                <w:color w:val="000000"/>
+                <w:sz w:val="22"/>
+                <w:szCs w:val="22"/>
+                <w:u w:val="none"/>
+                <w:shd w:fill="auto" w:val="clear"/>
+                <w:vertAlign w:val="baseline"/>
+                <w:rtl w:val="0"/>
+              </w:rPr>
+              <w:t xml:space="preserve">INTRODUCCIÓN</w:t>
+              <w:tab/>
+              <w:t xml:space="preserve">3</w:t>
+            </w:r>
+          </w:hyperlink>
+          <w:r>
+            <w:rPr>
+              <w:rtl w:val="0"/>
+            </w:rPr>
+          </w:r>
+        </w:p>
+        <w:p>
+          <w:pPr>
+            <w:widowControl w:val="0"/>
+            <w:tabs>
+              <w:tab w:val="right" w:leader="none" w:pos="12000"/>
+            </w:tabs>
+            <w:spacing w:after="0" w:before="60" w:line="240" w:lineRule="auto"/>
+            <w:rPr>
+              <w:rFonts w:ascii="Arial" w:cs="Arial" w:eastAsia="Arial" w:hAnsi="Arial"/>
+              <w:b w:val="1"/>
+              <w:bCs w:val="1"/>
+              <w:i w:val="0"/>
+              <w:iCs w:val="0"/>
+              <w:smallCaps w:val="0"/>
+              <w:strike w:val="0"/>
+              <w:color w:val="000000"/>
+              <w:sz w:val="22"/>
+              <w:szCs w:val="22"/>
+              <w:u w:val="none"/>
+              <w:shd w:fill="auto" w:val="clear"/>
+              <w:vertAlign w:val="baseline"/>
+            </w:rPr>
+          </w:pPr>
           <w:hyperlink w:anchor="_heading=h.iklnied1bnrg">
             <w:r>
               <w:rPr>
@@ -884,8 +945,19 @@
             <w:spacing w:after="0" w:before="60" w:line="240" w:lineRule="auto"/>
             <w:ind w:left="360" w:firstLine="0"/>
             <w:rPr>
+              <w:rFonts w:ascii="Arial" w:cs="Arial" w:eastAsia="Arial" w:hAnsi="Arial"/>
+              <w:b w:val="0"/>
+              <w:bCs w:val="0"/>
+              <w:i w:val="0"/>
+              <w:iCs w:val="0"/>
+              <w:smallCaps w:val="0"/>
+              <w:strike w:val="0"/>
               <w:color w:val="000000"/>
+              <w:sz w:val="22"/>
+              <w:szCs w:val="22"/>
               <w:u w:val="none"/>
+              <w:shd w:fill="auto" w:val="clear"/>
+              <w:vertAlign w:val="baseline"/>
             </w:rPr>
           </w:pPr>
           <w:hyperlink w:anchor="_heading=h.josnt27larj8">
@@ -926,8 +998,19 @@
             <w:spacing w:after="0" w:before="60" w:line="240" w:lineRule="auto"/>
             <w:ind w:left="360" w:firstLine="0"/>
             <w:rPr>
+              <w:rFonts w:ascii="Arial" w:cs="Arial" w:eastAsia="Arial" w:hAnsi="Arial"/>
+              <w:b w:val="0"/>
+              <w:bCs w:val="0"/>
+              <w:i w:val="0"/>
+              <w:iCs w:val="0"/>
+              <w:smallCaps w:val="0"/>
+              <w:strike w:val="0"/>
               <w:color w:val="000000"/>
+              <w:sz w:val="22"/>
+              <w:szCs w:val="22"/>
               <w:u w:val="none"/>
+              <w:shd w:fill="auto" w:val="clear"/>
+              <w:vertAlign w:val="baseline"/>
             </w:rPr>
           </w:pPr>
           <w:hyperlink w:anchor="_heading=h.fhyubvtgds10">
@@ -950,7 +1033,7 @@
               </w:rPr>
               <w:t xml:space="preserve">1.2 Descripción del Proyecto APT y Relevancia en el Campo Laboral</w:t>
               <w:tab/>
-              <w:t xml:space="preserve">3</w:t>
+              <w:t xml:space="preserve">4</w:t>
             </w:r>
           </w:hyperlink>
           <w:r>
@@ -968,8 +1051,19 @@
             <w:spacing w:after="0" w:before="60" w:line="240" w:lineRule="auto"/>
             <w:ind w:left="720" w:firstLine="0"/>
             <w:rPr>
+              <w:rFonts w:ascii="Arial" w:cs="Arial" w:eastAsia="Arial" w:hAnsi="Arial"/>
+              <w:b w:val="0"/>
+              <w:bCs w:val="0"/>
+              <w:i w:val="0"/>
+              <w:iCs w:val="0"/>
+              <w:smallCaps w:val="0"/>
+              <w:strike w:val="0"/>
               <w:color w:val="000000"/>
+              <w:sz w:val="22"/>
+              <w:szCs w:val="22"/>
               <w:u w:val="none"/>
+              <w:shd w:fill="auto" w:val="clear"/>
+              <w:vertAlign w:val="baseline"/>
             </w:rPr>
           </w:pPr>
           <w:hyperlink w:anchor="_heading=h.wmsx5fvuekd">
@@ -992,7 +1086,7 @@
               </w:rPr>
               <w:t xml:space="preserve">1.2.1 Descripción del Proyecto: ACE (Autonomous Content Engine)</w:t>
               <w:tab/>
-              <w:t xml:space="preserve">3</w:t>
+              <w:t xml:space="preserve">4</w:t>
             </w:r>
           </w:hyperlink>
           <w:r>
@@ -1010,8 +1104,19 @@
             <w:spacing w:after="0" w:before="60" w:line="240" w:lineRule="auto"/>
             <w:ind w:left="720" w:firstLine="0"/>
             <w:rPr>
+              <w:rFonts w:ascii="Arial" w:cs="Arial" w:eastAsia="Arial" w:hAnsi="Arial"/>
+              <w:b w:val="0"/>
+              <w:bCs w:val="0"/>
+              <w:i w:val="0"/>
+              <w:iCs w:val="0"/>
+              <w:smallCaps w:val="0"/>
+              <w:strike w:val="0"/>
               <w:color w:val="000000"/>
+              <w:sz w:val="22"/>
+              <w:szCs w:val="22"/>
               <w:u w:val="none"/>
+              <w:shd w:fill="auto" w:val="clear"/>
+              <w:vertAlign w:val="baseline"/>
             </w:rPr>
           </w:pPr>
           <w:hyperlink w:anchor="_heading=h.qg8iqlhupppz">
@@ -1034,7 +1139,7 @@
               </w:rPr>
               <w:t xml:space="preserve">1.2.2 Relevancia, Impacto y Beneficio en el Campo Laboral</w:t>
               <w:tab/>
-              <w:t xml:space="preserve">4</w:t>
+              <w:t xml:space="preserve">5</w:t>
             </w:r>
           </w:hyperlink>
           <w:r>
@@ -1052,8 +1157,19 @@
             <w:spacing w:after="0" w:before="60" w:line="240" w:lineRule="auto"/>
             <w:ind w:left="360" w:firstLine="0"/>
             <w:rPr>
+              <w:rFonts w:ascii="Arial" w:cs="Arial" w:eastAsia="Arial" w:hAnsi="Arial"/>
+              <w:b w:val="0"/>
+              <w:bCs w:val="0"/>
+              <w:i w:val="0"/>
+              <w:iCs w:val="0"/>
+              <w:smallCaps w:val="0"/>
+              <w:strike w:val="0"/>
               <w:color w:val="000000"/>
+              <w:sz w:val="22"/>
+              <w:szCs w:val="22"/>
               <w:u w:val="none"/>
+              <w:shd w:fill="auto" w:val="clear"/>
+              <w:vertAlign w:val="baseline"/>
             </w:rPr>
           </w:pPr>
           <w:hyperlink w:anchor="_heading=h.hsf0rg4nv3ug">
@@ -1094,8 +1210,19 @@
             <w:spacing w:after="0" w:before="60" w:line="240" w:lineRule="auto"/>
             <w:ind w:left="360" w:firstLine="0"/>
             <w:rPr>
+              <w:rFonts w:ascii="Arial" w:cs="Arial" w:eastAsia="Arial" w:hAnsi="Arial"/>
+              <w:b w:val="0"/>
+              <w:bCs w:val="0"/>
+              <w:i w:val="0"/>
+              <w:iCs w:val="0"/>
+              <w:smallCaps w:val="0"/>
+              <w:strike w:val="0"/>
               <w:color w:val="000000"/>
+              <w:sz w:val="22"/>
+              <w:szCs w:val="22"/>
               <w:u w:val="none"/>
+              <w:shd w:fill="auto" w:val="clear"/>
+              <w:vertAlign w:val="baseline"/>
             </w:rPr>
           </w:pPr>
           <w:hyperlink w:anchor="_heading=h.wu4ro6en6gyz">
@@ -1136,8 +1263,19 @@
             <w:spacing w:after="0" w:before="60" w:line="240" w:lineRule="auto"/>
             <w:ind w:left="720" w:firstLine="0"/>
             <w:rPr>
+              <w:rFonts w:ascii="Arial" w:cs="Arial" w:eastAsia="Arial" w:hAnsi="Arial"/>
+              <w:b w:val="0"/>
+              <w:bCs w:val="0"/>
+              <w:i w:val="0"/>
+              <w:iCs w:val="0"/>
+              <w:smallCaps w:val="0"/>
+              <w:strike w:val="0"/>
               <w:color w:val="000000"/>
+              <w:sz w:val="22"/>
+              <w:szCs w:val="22"/>
               <w:u w:val="none"/>
+              <w:shd w:fill="auto" w:val="clear"/>
+              <w:vertAlign w:val="baseline"/>
             </w:rPr>
           </w:pPr>
           <w:hyperlink w:anchor="_heading=h.wc32q3doo5nt">
@@ -1178,8 +1316,19 @@
             <w:spacing w:after="0" w:before="60" w:line="240" w:lineRule="auto"/>
             <w:ind w:left="720" w:firstLine="0"/>
             <w:rPr>
+              <w:rFonts w:ascii="Arial" w:cs="Arial" w:eastAsia="Arial" w:hAnsi="Arial"/>
+              <w:b w:val="0"/>
+              <w:bCs w:val="0"/>
+              <w:i w:val="0"/>
+              <w:iCs w:val="0"/>
+              <w:smallCaps w:val="0"/>
+              <w:strike w:val="0"/>
               <w:color w:val="000000"/>
+              <w:sz w:val="22"/>
+              <w:szCs w:val="22"/>
               <w:u w:val="none"/>
+              <w:shd w:fill="auto" w:val="clear"/>
+              <w:vertAlign w:val="baseline"/>
             </w:rPr>
           </w:pPr>
           <w:hyperlink w:anchor="_heading=h.nln85i63hxpn">
@@ -1220,8 +1369,19 @@
             <w:spacing w:after="0" w:before="60" w:line="240" w:lineRule="auto"/>
             <w:ind w:left="720" w:firstLine="0"/>
             <w:rPr>
+              <w:rFonts w:ascii="Arial" w:cs="Arial" w:eastAsia="Arial" w:hAnsi="Arial"/>
+              <w:b w:val="0"/>
+              <w:bCs w:val="0"/>
+              <w:i w:val="0"/>
+              <w:iCs w:val="0"/>
+              <w:smallCaps w:val="0"/>
+              <w:strike w:val="0"/>
               <w:color w:val="000000"/>
+              <w:sz w:val="22"/>
+              <w:szCs w:val="22"/>
               <w:u w:val="none"/>
+              <w:shd w:fill="auto" w:val="clear"/>
+              <w:vertAlign w:val="baseline"/>
             </w:rPr>
           </w:pPr>
           <w:hyperlink w:anchor="_heading=h.rqvjlu6rhws6">
@@ -1244,7 +1404,7 @@
               </w:rPr>
               <w:t xml:space="preserve">1.4.3 Matías Salas</w:t>
               <w:tab/>
-              <w:t xml:space="preserve">6</w:t>
+              <w:t xml:space="preserve">7</w:t>
             </w:r>
           </w:hyperlink>
           <w:r>
@@ -1262,8 +1422,19 @@
             <w:spacing w:after="0" w:before="60" w:line="240" w:lineRule="auto"/>
             <w:ind w:left="360" w:firstLine="0"/>
             <w:rPr>
+              <w:rFonts w:ascii="Arial" w:cs="Arial" w:eastAsia="Arial" w:hAnsi="Arial"/>
+              <w:b w:val="0"/>
+              <w:bCs w:val="0"/>
+              <w:i w:val="0"/>
+              <w:iCs w:val="0"/>
+              <w:smallCaps w:val="0"/>
+              <w:strike w:val="0"/>
               <w:color w:val="000000"/>
+              <w:sz w:val="22"/>
+              <w:szCs w:val="22"/>
               <w:u w:val="none"/>
+              <w:shd w:fill="auto" w:val="clear"/>
+              <w:vertAlign w:val="baseline"/>
             </w:rPr>
           </w:pPr>
           <w:hyperlink w:anchor="_heading=h.3fne4z30hwks">
@@ -1304,8 +1475,19 @@
             <w:spacing w:after="0" w:before="60" w:line="240" w:lineRule="auto"/>
             <w:ind w:left="720" w:firstLine="0"/>
             <w:rPr>
+              <w:rFonts w:ascii="Arial" w:cs="Arial" w:eastAsia="Arial" w:hAnsi="Arial"/>
+              <w:b w:val="0"/>
+              <w:bCs w:val="0"/>
+              <w:i w:val="0"/>
+              <w:iCs w:val="0"/>
+              <w:smallCaps w:val="0"/>
+              <w:strike w:val="0"/>
               <w:color w:val="000000"/>
+              <w:sz w:val="22"/>
+              <w:szCs w:val="22"/>
               <w:u w:val="none"/>
+              <w:shd w:fill="auto" w:val="clear"/>
+              <w:vertAlign w:val="baseline"/>
             </w:rPr>
           </w:pPr>
           <w:hyperlink w:anchor="_heading=h.98vl3q91usm1">
@@ -1346,8 +1528,19 @@
             <w:spacing w:after="0" w:before="60" w:line="240" w:lineRule="auto"/>
             <w:ind w:left="720" w:firstLine="0"/>
             <w:rPr>
+              <w:rFonts w:ascii="Arial" w:cs="Arial" w:eastAsia="Arial" w:hAnsi="Arial"/>
+              <w:b w:val="0"/>
+              <w:bCs w:val="0"/>
+              <w:i w:val="0"/>
+              <w:iCs w:val="0"/>
+              <w:smallCaps w:val="0"/>
+              <w:strike w:val="0"/>
               <w:color w:val="000000"/>
+              <w:sz w:val="22"/>
+              <w:szCs w:val="22"/>
               <w:u w:val="none"/>
+              <w:shd w:fill="auto" w:val="clear"/>
+              <w:vertAlign w:val="baseline"/>
             </w:rPr>
           </w:pPr>
           <w:hyperlink w:anchor="_heading=h.8t4x5b9leec9">
@@ -1388,8 +1581,19 @@
             <w:spacing w:after="0" w:before="60" w:line="240" w:lineRule="auto"/>
             <w:ind w:left="720" w:firstLine="0"/>
             <w:rPr>
+              <w:rFonts w:ascii="Arial" w:cs="Arial" w:eastAsia="Arial" w:hAnsi="Arial"/>
+              <w:b w:val="0"/>
+              <w:bCs w:val="0"/>
+              <w:i w:val="0"/>
+              <w:iCs w:val="0"/>
+              <w:smallCaps w:val="0"/>
+              <w:strike w:val="0"/>
               <w:color w:val="000000"/>
+              <w:sz w:val="22"/>
+              <w:szCs w:val="22"/>
               <w:u w:val="none"/>
+              <w:shd w:fill="auto" w:val="clear"/>
+              <w:vertAlign w:val="baseline"/>
             </w:rPr>
           </w:pPr>
           <w:hyperlink w:anchor="_heading=h.de48t4gtiegb">
@@ -1430,8 +1634,19 @@
             <w:spacing w:after="0" w:before="60" w:line="240" w:lineRule="auto"/>
             <w:ind w:left="720" w:firstLine="0"/>
             <w:rPr>
+              <w:rFonts w:ascii="Arial" w:cs="Arial" w:eastAsia="Arial" w:hAnsi="Arial"/>
+              <w:b w:val="0"/>
+              <w:bCs w:val="0"/>
+              <w:i w:val="0"/>
+              <w:iCs w:val="0"/>
+              <w:smallCaps w:val="0"/>
+              <w:strike w:val="0"/>
               <w:color w:val="000000"/>
+              <w:sz w:val="22"/>
+              <w:szCs w:val="22"/>
               <w:u w:val="none"/>
+              <w:shd w:fill="auto" w:val="clear"/>
+              <w:vertAlign w:val="baseline"/>
             </w:rPr>
           </w:pPr>
           <w:hyperlink w:anchor="_heading=h.2z3vtuwyd7l0">
@@ -1453,6 +1668,59 @@
                 <w:rtl w:val="0"/>
               </w:rPr>
               <w:t xml:space="preserve">1.5.4 Factores Obstaculizadores y Plan de Mitigación</w:t>
+              <w:tab/>
+              <w:t xml:space="preserve">8</w:t>
+            </w:r>
+          </w:hyperlink>
+          <w:r>
+            <w:rPr>
+              <w:rtl w:val="0"/>
+            </w:rPr>
+          </w:r>
+        </w:p>
+        <w:p>
+          <w:pPr>
+            <w:widowControl w:val="0"/>
+            <w:tabs>
+              <w:tab w:val="right" w:leader="none" w:pos="12000"/>
+            </w:tabs>
+            <w:spacing w:after="0" w:before="60" w:line="240" w:lineRule="auto"/>
+            <w:ind w:left="720" w:firstLine="0"/>
+            <w:rPr>
+              <w:rFonts w:ascii="Arial" w:cs="Arial" w:eastAsia="Arial" w:hAnsi="Arial"/>
+              <w:b w:val="0"/>
+              <w:bCs w:val="0"/>
+              <w:i w:val="0"/>
+              <w:iCs w:val="0"/>
+              <w:smallCaps w:val="0"/>
+              <w:strike w:val="0"/>
+              <w:color w:val="000000"/>
+              <w:sz w:val="22"/>
+              <w:szCs w:val="22"/>
+              <w:u w:val="none"/>
+              <w:shd w:fill="auto" w:val="clear"/>
+              <w:vertAlign w:val="baseline"/>
+            </w:rPr>
+          </w:pPr>
+          <w:hyperlink w:anchor="_heading=h.8zks2l6z8zp1">
+            <w:r>
+              <w:rPr>
+                <w:rFonts w:ascii="Calibri" w:cs="Calibri" w:eastAsia="Calibri" w:hAnsi="Calibri"/>
+                <w:b w:val="0"/>
+                <w:bCs w:val="0"/>
+                <w:i w:val="0"/>
+                <w:iCs w:val="0"/>
+                <w:smallCaps w:val="0"/>
+                <w:strike w:val="0"/>
+                <w:color w:val="000000"/>
+                <w:sz w:val="22"/>
+                <w:szCs w:val="22"/>
+                <w:u w:val="none"/>
+                <w:shd w:fill="auto" w:val="clear"/>
+                <w:vertAlign w:val="baseline"/>
+                <w:rtl w:val="0"/>
+              </w:rPr>
+              <w:t xml:space="preserve">1.5.5 Modelo de Negocio e Impacto Operacional para Lumina Motion</w:t>
               <w:tab/>
               <w:t xml:space="preserve">8</w:t>
             </w:r>
@@ -1471,10 +1739,19 @@
             </w:tabs>
             <w:spacing w:after="0" w:before="60" w:line="240" w:lineRule="auto"/>
             <w:rPr>
+              <w:rFonts w:ascii="Arial" w:cs="Arial" w:eastAsia="Arial" w:hAnsi="Arial"/>
               <w:b w:val="1"/>
               <w:bCs w:val="1"/>
+              <w:i w:val="0"/>
+              <w:iCs w:val="0"/>
+              <w:smallCaps w:val="0"/>
+              <w:strike w:val="0"/>
               <w:color w:val="000000"/>
+              <w:sz w:val="22"/>
+              <w:szCs w:val="22"/>
               <w:u w:val="none"/>
+              <w:shd w:fill="auto" w:val="clear"/>
+              <w:vertAlign w:val="baseline"/>
             </w:rPr>
           </w:pPr>
           <w:hyperlink w:anchor="_heading=h.n4i0344bdmob">
@@ -1497,7 +1774,7 @@
               </w:rPr>
               <w:t xml:space="preserve">II: OBJETIVOS, METODOLOGÍA Y PLANIFICACIÓN</w:t>
               <w:tab/>
-              <w:t xml:space="preserve">9</w:t>
+              <w:t xml:space="preserve">10</w:t>
             </w:r>
           </w:hyperlink>
           <w:r>
@@ -1515,8 +1792,19 @@
             <w:spacing w:after="0" w:before="60" w:line="240" w:lineRule="auto"/>
             <w:ind w:left="360" w:firstLine="0"/>
             <w:rPr>
+              <w:rFonts w:ascii="Arial" w:cs="Arial" w:eastAsia="Arial" w:hAnsi="Arial"/>
+              <w:b w:val="0"/>
+              <w:bCs w:val="0"/>
+              <w:i w:val="0"/>
+              <w:iCs w:val="0"/>
+              <w:smallCaps w:val="0"/>
+              <w:strike w:val="0"/>
               <w:color w:val="000000"/>
+              <w:sz w:val="22"/>
+              <w:szCs w:val="22"/>
               <w:u w:val="none"/>
+              <w:shd w:fill="auto" w:val="clear"/>
+              <w:vertAlign w:val="baseline"/>
             </w:rPr>
           </w:pPr>
           <w:hyperlink w:anchor="_heading=h.c6nytzpz9krs">
@@ -1539,7 +1827,7 @@
               </w:rPr>
               <w:t xml:space="preserve">2.1 Formulación de Objetivos</w:t>
               <w:tab/>
-              <w:t xml:space="preserve">9</w:t>
+              <w:t xml:space="preserve">10</w:t>
             </w:r>
           </w:hyperlink>
           <w:r>
@@ -1557,8 +1845,19 @@
             <w:spacing w:after="0" w:before="60" w:line="240" w:lineRule="auto"/>
             <w:ind w:left="720" w:firstLine="0"/>
             <w:rPr>
+              <w:rFonts w:ascii="Arial" w:cs="Arial" w:eastAsia="Arial" w:hAnsi="Arial"/>
+              <w:b w:val="0"/>
+              <w:bCs w:val="0"/>
+              <w:i w:val="0"/>
+              <w:iCs w:val="0"/>
+              <w:smallCaps w:val="0"/>
+              <w:strike w:val="0"/>
               <w:color w:val="000000"/>
+              <w:sz w:val="22"/>
+              <w:szCs w:val="22"/>
               <w:u w:val="none"/>
+              <w:shd w:fill="auto" w:val="clear"/>
+              <w:vertAlign w:val="baseline"/>
             </w:rPr>
           </w:pPr>
           <w:hyperlink w:anchor="_heading=h.kiovd6eb4qlc">
@@ -1581,7 +1880,7 @@
               </w:rPr>
               <w:t xml:space="preserve">2.1.1 Objetivo General</w:t>
               <w:tab/>
-              <w:t xml:space="preserve">9</w:t>
+              <w:t xml:space="preserve">10</w:t>
             </w:r>
           </w:hyperlink>
           <w:r>
@@ -1599,8 +1898,19 @@
             <w:spacing w:after="0" w:before="60" w:line="240" w:lineRule="auto"/>
             <w:ind w:left="720" w:firstLine="0"/>
             <w:rPr>
+              <w:rFonts w:ascii="Arial" w:cs="Arial" w:eastAsia="Arial" w:hAnsi="Arial"/>
+              <w:b w:val="0"/>
+              <w:bCs w:val="0"/>
+              <w:i w:val="0"/>
+              <w:iCs w:val="0"/>
+              <w:smallCaps w:val="0"/>
+              <w:strike w:val="0"/>
               <w:color w:val="000000"/>
+              <w:sz w:val="22"/>
+              <w:szCs w:val="22"/>
               <w:u w:val="none"/>
+              <w:shd w:fill="auto" w:val="clear"/>
+              <w:vertAlign w:val="baseline"/>
             </w:rPr>
           </w:pPr>
           <w:hyperlink w:anchor="_heading=h.4i6uqzlecoiy">
@@ -1623,7 +1933,7 @@
               </w:rPr>
               <w:t xml:space="preserve">2.1.2 Objetivos Específicos</w:t>
               <w:tab/>
-              <w:t xml:space="preserve">9</w:t>
+              <w:t xml:space="preserve">10</w:t>
             </w:r>
           </w:hyperlink>
           <w:r>
@@ -1641,8 +1951,19 @@
             <w:spacing w:after="0" w:before="60" w:line="240" w:lineRule="auto"/>
             <w:ind w:left="360" w:firstLine="0"/>
             <w:rPr>
+              <w:rFonts w:ascii="Arial" w:cs="Arial" w:eastAsia="Arial" w:hAnsi="Arial"/>
+              <w:b w:val="0"/>
+              <w:bCs w:val="0"/>
+              <w:i w:val="0"/>
+              <w:iCs w:val="0"/>
+              <w:smallCaps w:val="0"/>
+              <w:strike w:val="0"/>
               <w:color w:val="000000"/>
+              <w:sz w:val="22"/>
+              <w:szCs w:val="22"/>
               <w:u w:val="none"/>
+              <w:shd w:fill="auto" w:val="clear"/>
+              <w:vertAlign w:val="baseline"/>
             </w:rPr>
           </w:pPr>
           <w:hyperlink w:anchor="_heading=h.1jgg0ppegonj">
@@ -1665,7 +1986,7 @@
               </w:rPr>
               <w:t xml:space="preserve">2.2 Metodología de Trabajo y Roles Disciplinares</w:t>
               <w:tab/>
-              <w:t xml:space="preserve">10</w:t>
+              <w:t xml:space="preserve">11</w:t>
             </w:r>
           </w:hyperlink>
           <w:r>
@@ -1683,8 +2004,19 @@
             <w:spacing w:after="0" w:before="60" w:line="240" w:lineRule="auto"/>
             <w:ind w:left="720" w:firstLine="0"/>
             <w:rPr>
+              <w:rFonts w:ascii="Arial" w:cs="Arial" w:eastAsia="Arial" w:hAnsi="Arial"/>
+              <w:b w:val="0"/>
+              <w:bCs w:val="0"/>
+              <w:i w:val="0"/>
+              <w:iCs w:val="0"/>
+              <w:smallCaps w:val="0"/>
+              <w:strike w:val="0"/>
               <w:color w:val="000000"/>
+              <w:sz w:val="22"/>
+              <w:szCs w:val="22"/>
               <w:u w:val="none"/>
+              <w:shd w:fill="auto" w:val="clear"/>
+              <w:vertAlign w:val="baseline"/>
             </w:rPr>
           </w:pPr>
           <w:hyperlink w:anchor="_heading=h.2qahxkqijv16">
@@ -1707,7 +2039,7 @@
               </w:rPr>
               <w:t xml:space="preserve">2.2.1 Marco Metodológico: Scrum Adaptado a Proyectos de Ingeniería</w:t>
               <w:tab/>
-              <w:t xml:space="preserve">10</w:t>
+              <w:t xml:space="preserve">11</w:t>
             </w:r>
           </w:hyperlink>
           <w:r>
@@ -1725,8 +2057,19 @@
             <w:spacing w:after="0" w:before="60" w:line="240" w:lineRule="auto"/>
             <w:ind w:left="720" w:firstLine="0"/>
             <w:rPr>
+              <w:rFonts w:ascii="Arial" w:cs="Arial" w:eastAsia="Arial" w:hAnsi="Arial"/>
+              <w:b w:val="0"/>
+              <w:bCs w:val="0"/>
+              <w:i w:val="0"/>
+              <w:iCs w:val="0"/>
+              <w:smallCaps w:val="0"/>
+              <w:strike w:val="0"/>
               <w:color w:val="000000"/>
+              <w:sz w:val="22"/>
+              <w:szCs w:val="22"/>
               <w:u w:val="none"/>
+              <w:shd w:fill="auto" w:val="clear"/>
+              <w:vertAlign w:val="baseline"/>
             </w:rPr>
           </w:pPr>
           <w:hyperlink w:anchor="_heading=h.6odqy81ojh9k">
@@ -1749,7 +2092,7 @@
               </w:rPr>
               <w:t xml:space="preserve">2.2.2 Funciones y Responsabilidades del Equipo</w:t>
               <w:tab/>
-              <w:t xml:space="preserve">10</w:t>
+              <w:t xml:space="preserve">11</w:t>
             </w:r>
           </w:hyperlink>
           <w:r>
@@ -1767,8 +2110,19 @@
             <w:spacing w:after="0" w:before="60" w:line="240" w:lineRule="auto"/>
             <w:ind w:left="360" w:firstLine="0"/>
             <w:rPr>
+              <w:rFonts w:ascii="Arial" w:cs="Arial" w:eastAsia="Arial" w:hAnsi="Arial"/>
+              <w:b w:val="0"/>
+              <w:bCs w:val="0"/>
+              <w:i w:val="0"/>
+              <w:iCs w:val="0"/>
+              <w:smallCaps w:val="0"/>
+              <w:strike w:val="0"/>
               <w:color w:val="000000"/>
+              <w:sz w:val="22"/>
+              <w:szCs w:val="22"/>
               <w:u w:val="none"/>
+              <w:shd w:fill="auto" w:val="clear"/>
+              <w:vertAlign w:val="baseline"/>
             </w:rPr>
           </w:pPr>
           <w:hyperlink w:anchor="_heading=h.6bunf7rcq2lf">
@@ -1791,7 +2145,7 @@
               </w:rPr>
               <w:t xml:space="preserve">2.3 Plan de Trabajo Articulado por Competencias</w:t>
               <w:tab/>
-              <w:t xml:space="preserve">11</w:t>
+              <w:t xml:space="preserve">12</w:t>
             </w:r>
           </w:hyperlink>
           <w:r>
@@ -1809,8 +2163,19 @@
             <w:spacing w:after="0" w:before="60" w:line="240" w:lineRule="auto"/>
             <w:ind w:left="360" w:firstLine="0"/>
             <w:rPr>
+              <w:rFonts w:ascii="Arial" w:cs="Arial" w:eastAsia="Arial" w:hAnsi="Arial"/>
+              <w:b w:val="0"/>
+              <w:bCs w:val="0"/>
+              <w:i w:val="0"/>
+              <w:iCs w:val="0"/>
+              <w:smallCaps w:val="0"/>
+              <w:strike w:val="0"/>
               <w:color w:val="000000"/>
+              <w:sz w:val="22"/>
+              <w:szCs w:val="22"/>
               <w:u w:val="none"/>
+              <w:shd w:fill="auto" w:val="clear"/>
+              <w:vertAlign w:val="baseline"/>
             </w:rPr>
           </w:pPr>
           <w:hyperlink w:anchor="_heading=h.w2hixefaoh6o">
@@ -1833,7 +2198,7 @@
               </w:rPr>
               <w:t xml:space="preserve">2.4 Determinación y Justificación de Evidencias</w:t>
               <w:tab/>
-              <w:t xml:space="preserve">14</w:t>
+              <w:t xml:space="preserve">15</w:t>
             </w:r>
           </w:hyperlink>
           <w:r>
@@ -1851,8 +2216,19 @@
             <w:spacing w:after="0" w:before="60" w:line="240" w:lineRule="auto"/>
             <w:ind w:left="360" w:firstLine="0"/>
             <w:rPr>
+              <w:rFonts w:ascii="Arial" w:cs="Arial" w:eastAsia="Arial" w:hAnsi="Arial"/>
+              <w:b w:val="0"/>
+              <w:bCs w:val="0"/>
+              <w:i w:val="0"/>
+              <w:iCs w:val="0"/>
+              <w:smallCaps w:val="0"/>
+              <w:strike w:val="0"/>
               <w:color w:val="000000"/>
+              <w:sz w:val="22"/>
+              <w:szCs w:val="22"/>
               <w:u w:val="none"/>
+              <w:shd w:fill="auto" w:val="clear"/>
+              <w:vertAlign w:val="baseline"/>
             </w:rPr>
           </w:pPr>
           <w:hyperlink w:anchor="_heading=h.ddmcy04ctvzk">
@@ -1875,7 +2251,113 @@
               </w:rPr>
               <w:t xml:space="preserve">2.5 Cronograma de Trabajo y Carta Gantt — 18 Semanas</w:t>
               <w:tab/>
-              <w:t xml:space="preserve">15</w:t>
+              <w:t xml:space="preserve">16</w:t>
+            </w:r>
+          </w:hyperlink>
+          <w:r>
+            <w:rPr>
+              <w:rtl w:val="0"/>
+            </w:rPr>
+          </w:r>
+        </w:p>
+        <w:p>
+          <w:pPr>
+            <w:widowControl w:val="0"/>
+            <w:tabs>
+              <w:tab w:val="right" w:leader="none" w:pos="12000"/>
+            </w:tabs>
+            <w:spacing w:after="0" w:before="60" w:line="240" w:lineRule="auto"/>
+            <w:ind w:left="360" w:firstLine="0"/>
+            <w:rPr>
+              <w:rFonts w:ascii="Arial" w:cs="Arial" w:eastAsia="Arial" w:hAnsi="Arial"/>
+              <w:b w:val="0"/>
+              <w:bCs w:val="0"/>
+              <w:i w:val="0"/>
+              <w:iCs w:val="0"/>
+              <w:smallCaps w:val="0"/>
+              <w:strike w:val="0"/>
+              <w:color w:val="000000"/>
+              <w:sz w:val="22"/>
+              <w:szCs w:val="22"/>
+              <w:u w:val="none"/>
+              <w:shd w:fill="auto" w:val="clear"/>
+              <w:vertAlign w:val="baseline"/>
+            </w:rPr>
+          </w:pPr>
+          <w:hyperlink w:anchor="_heading=h.ul9lkf47iicy">
+            <w:r>
+              <w:rPr>
+                <w:rFonts w:ascii="Calibri" w:cs="Calibri" w:eastAsia="Calibri" w:hAnsi="Calibri"/>
+                <w:b w:val="0"/>
+                <w:bCs w:val="0"/>
+                <w:i w:val="0"/>
+                <w:iCs w:val="0"/>
+                <w:smallCaps w:val="0"/>
+                <w:strike w:val="0"/>
+                <w:color w:val="000000"/>
+                <w:sz w:val="22"/>
+                <w:szCs w:val="22"/>
+                <w:u w:val="none"/>
+                <w:shd w:fill="auto" w:val="clear"/>
+                <w:vertAlign w:val="baseline"/>
+                <w:rtl w:val="0"/>
+              </w:rPr>
+              <w:t xml:space="preserve">2.6 Políticas de Seguridad y Protección de la Información</w:t>
+              <w:tab/>
+              <w:t xml:space="preserve">17</w:t>
+            </w:r>
+          </w:hyperlink>
+          <w:r>
+            <w:rPr>
+              <w:rtl w:val="0"/>
+            </w:rPr>
+          </w:r>
+        </w:p>
+        <w:p>
+          <w:pPr>
+            <w:widowControl w:val="0"/>
+            <w:tabs>
+              <w:tab w:val="right" w:leader="none" w:pos="12000"/>
+            </w:tabs>
+            <w:spacing w:after="0" w:before="60" w:line="240" w:lineRule="auto"/>
+            <w:ind w:left="360" w:firstLine="0"/>
+            <w:rPr>
+              <w:rFonts w:ascii="Arial" w:cs="Arial" w:eastAsia="Arial" w:hAnsi="Arial"/>
+              <w:b w:val="0"/>
+              <w:bCs w:val="0"/>
+              <w:i w:val="0"/>
+              <w:iCs w:val="0"/>
+              <w:smallCaps w:val="0"/>
+              <w:strike w:val="0"/>
+              <w:color w:val="000000"/>
+              <w:sz w:val="22"/>
+              <w:szCs w:val="22"/>
+              <w:u w:val="none"/>
+              <w:shd w:fill="auto" w:val="clear"/>
+              <w:vertAlign w:val="baseline"/>
+            </w:rPr>
+          </w:pPr>
+          <w:hyperlink w:anchor="_heading=h.5o25aydkdzbb">
+            <w:r>
+              <w:rPr>
+                <w:rFonts w:ascii="Calibri" w:cs="Calibri" w:eastAsia="Calibri" w:hAnsi="Calibri"/>
+                <w:b w:val="0"/>
+                <w:bCs w:val="0"/>
+                <w:i w:val="0"/>
+                <w:iCs w:val="0"/>
+                <w:smallCaps w:val="0"/>
+                <w:strike w:val="0"/>
+                <w:color w:val="000000"/>
+                <w:sz w:val="22"/>
+                <w:szCs w:val="22"/>
+                <w:u w:val="none"/>
+                <w:shd w:fill="auto" w:val="clear"/>
+                <w:vertAlign w:val="baseline"/>
+                <w:rtl w:val="0"/>
+              </w:rPr>
+              <w:t xml:space="preserve">2.7 Prototipos Visuales y Wireframes de Interfaz (Mockups UI/UX)</w:t>
+              <w:tab/>
+              <w:t xml:space="preserve">17</w:t>
             </w:r>
           </w:hyperlink>
           <w:r>
@@ -1892,13 +2374,22 @@
             </w:tabs>
             <w:spacing w:after="0" w:before="60" w:line="240" w:lineRule="auto"/>
             <w:rPr>
+              <w:rFonts w:ascii="Arial" w:cs="Arial" w:eastAsia="Arial" w:hAnsi="Arial"/>
               <w:b w:val="1"/>
               <w:bCs w:val="1"/>
+              <w:i w:val="0"/>
+              <w:iCs w:val="0"/>
+              <w:smallCaps w:val="0"/>
+              <w:strike w:val="0"/>
               <w:color w:val="000000"/>
+              <w:sz w:val="22"/>
+              <w:szCs w:val="22"/>
               <w:u w:val="none"/>
+              <w:shd w:fill="auto" w:val="clear"/>
+              <w:vertAlign w:val="baseline"/>
             </w:rPr>
           </w:pPr>
-          <w:hyperlink w:anchor="_heading=h.n6am33p5jfpu">
+          <w:hyperlink w:anchor="_heading=h.bxchr6a8t4q5">
             <w:r>
               <w:rPr>
                 <w:rFonts w:ascii="Calibri" w:cs="Calibri" w:eastAsia="Calibri" w:hAnsi="Calibri"/>
@@ -1916,9 +2407,61 @@
                 <w:vertAlign w:val="baseline"/>
                 <w:rtl w:val="0"/>
               </w:rPr>
-              <w:t xml:space="preserve">III. REFERENCIAS BIBLIOGRÁFICAS</w:t>
+              <w:t xml:space="preserve">III: CONCLUSIONES Y VALOR AGREGADO</w:t>
               <w:tab/>
-              <w:t xml:space="preserve">16</w:t>
+              <w:t xml:space="preserve">18</w:t>
+            </w:r>
+          </w:hyperlink>
+          <w:r>
+            <w:rPr>
+              <w:rtl w:val="0"/>
+            </w:rPr>
+          </w:r>
+        </w:p>
+        <w:p>
+          <w:pPr>
+            <w:widowControl w:val="0"/>
+            <w:tabs>
+              <w:tab w:val="right" w:leader="none" w:pos="12000"/>
+            </w:tabs>
+            <w:spacing w:after="0" w:before="60" w:line="240" w:lineRule="auto"/>
+            <w:rPr>
+              <w:rFonts w:ascii="Arial" w:cs="Arial" w:eastAsia="Arial" w:hAnsi="Arial"/>
+              <w:b w:val="1"/>
+              <w:bCs w:val="1"/>
+              <w:i w:val="0"/>
+              <w:iCs w:val="0"/>
+              <w:smallCaps w:val="0"/>
+              <w:strike w:val="0"/>
+              <w:color w:val="000000"/>
+              <w:sz w:val="22"/>
+              <w:szCs w:val="22"/>
+              <w:u w:val="none"/>
+              <w:shd w:fill="auto" w:val="clear"/>
+              <w:vertAlign w:val="baseline"/>
+            </w:rPr>
+          </w:pPr>
+          <w:hyperlink w:anchor="_heading=h.g76ws4uo1mqi">
+            <w:r>
+              <w:rPr>
+                <w:rFonts w:ascii="Calibri" w:cs="Calibri" w:eastAsia="Calibri" w:hAnsi="Calibri"/>
+                <w:b w:val="1"/>
+                <w:bCs w:val="1"/>
+                <w:i w:val="0"/>
+                <w:iCs w:val="0"/>
+                <w:smallCaps w:val="0"/>
+                <w:strike w:val="0"/>
+                <w:color w:val="000000"/>
+                <w:sz w:val="22"/>
+                <w:szCs w:val="22"/>
+                <w:u w:val="none"/>
+                <w:shd w:fill="auto" w:val="clear"/>
+                <w:vertAlign w:val="baseline"/>
+                <w:rtl w:val="0"/>
+              </w:rPr>
+              <w:t xml:space="preserve">IV: REFERENCIAS BIBLIOGRÁFICAS</w:t>
+              <w:tab/>
+              <w:t xml:space="preserve">19</w:t>
             </w:r>
           </w:hyperlink>
           <w:r>
@@ -1935,12 +2478,10 @@
     <w:p>
       <w:pPr>
         <w:rPr>
-          <w:rFonts w:ascii="Calibri" w:cs="Calibri" w:eastAsia="Calibri" w:hAnsi="Calibri"/>
+          <w:b w:val="1"/>
+          <w:bCs w:val="1"/>
         </w:rPr>
       </w:pPr>
-      <w:r>
-        <w:br w:type="page"/>
-      </w:r>
       <w:r>
         <w:rPr>
           <w:rtl w:val="0"/>
@@ -1948,378 +2489,56 @@
       </w:r>
     </w:p>
     <w:p>
-      <w:r>
-        <w:rPr>
-          <w:b/>
-          <w:color w:val="003366"/>
-          <w:sz w:val="32"/>
-        </w:rPr>
-        <w:t>ÍNDICE GENERAL</w:t>
+      <w:pPr>
+        <w:rPr>
+          <w:b w:val="1"/>
+          <w:bCs w:val="1"/>
+        </w:rPr>
+      </w:pPr>
+      <w:r>
+        <w:rPr>
+          <w:rtl w:val="0"/>
+        </w:rPr>
       </w:r>
     </w:p>
     <w:p>
-      <w:r>
-        <w:rPr>
-          <w:b/>
-          <w:sz w:val="21"/>
-        </w:rPr>
-        <w:t>INTRODUCCIÓN                                                                    3</w:t>
+      <w:pPr>
+        <w:pStyle w:val="Heading1"/>
+        <w:rPr/>
+      </w:pPr>
+      <w:bookmarkStart w:colFirst="0" w:colLast="0" w:name="_heading=h.tsvaipc2dt49" w:id="3"/>
+      <w:bookmarkEnd w:id="3"/>
+      <w:r>
+        <w:rPr>
+          <w:rtl w:val="0"/>
+        </w:rPr>
+        <w:t xml:space="preserve">INTRODUCCIÓN</w:t>
       </w:r>
     </w:p>
     <w:p>
-      <w:r>
-        <w:rPr>
-          <w:b/>
-          <w:sz w:val="21"/>
-        </w:rPr>
-        <w:t>PARTE I: DEFINICIÓN Y CONTEXTO DEL PROYECTO                                     4</w:t>
+      <w:pPr>
+        <w:rPr/>
+      </w:pPr>
+      <w:r>
+        <w:rPr>
+          <w:sz w:val="22"/>
+          <w:szCs w:val="22"/>
+          <w:rtl w:val="0"/>
+        </w:rPr>
+        <w:t xml:space="preserve">El presente informe formaliza la definición de ingeniería, arquitectura, alcance y planificación del proyecto de titulación ACE (Autonomous Content Engine), desarrollado en el marco de la asignatura Proyecto de Aplicación Práctica (Capstone, PTY4614) de la carrera de Ingeniería en Informática de Duoc UC, Sede Antonio Varas.</w:t>
+        <w:br w:type="textWrapping"/>
+        <w:br w:type="textWrapping"/>
+        <w:t xml:space="preserve">El proyecto aborda una problemática crítica en el ámbito de la cartelería digital (Digital Signage) para el estudio multimedia Lumina Motion Studio: la descentralización operativa de sus pantallas, los altos costos recurrentes de licenciamiento propietario y la vulnerabilidad frente a pérdidas de conectividad en recintos comerciales masivos. A través de una arquitectura cliente-servidor híbrida desacoplada, ACE centraliza la administración remota de medios, locaciones y parrillas de programación, asegurando simultáneamente la continuidad ininterrumpida de reproducción y la capacidad de modificación local ante contingencias sin conexión a internet.</w:t>
+        <w:br w:type="textWrapping"/>
+        <w:br w:type="textWrapping"/>
+        <w:t xml:space="preserve">A lo largo de este documento se detallan los antecedentes del equipo, la articulación directa con las competencias del perfil de egreso, el análisis de factibilidad y modelo operacional, la formulación de los 6 objetivos específicos acordados, el marco ágil de desarrollo (Scrum adaptado), la Carta Gantt de 18 semanas, las directrices de seguridad de la información, el espacio para prototipos de interfaz (mockups) y las conclusiones que sustentan la rigurosidad técnica de esta primera fase evaluativa.</w:t>
+      </w:r>
+      <w:r>
+        <w:rPr>
+          <w:rtl w:val="0"/>
+        </w:rPr>
       </w:r>
     </w:p>
-    <w:p>
-      <w:r>
-        <w:rPr>
-          <w:sz w:val="21"/>
-        </w:rPr>
-        <w:t xml:space="preserve">   1.1 Antecedentes Generales y del Equipo                                      4</w:t>
-      </w:r>
-    </w:p>
-    <w:p>
-      <w:r>
-        <w:rPr>
-          <w:sz w:val="21"/>
-        </w:rPr>
-        <w:t xml:space="preserve">   1.2 Descripción del Proyecto APT y Relevancia en el Campo Laboral            5</w:t>
-      </w:r>
-    </w:p>
-    <w:p>
-      <w:r>
-        <w:rPr>
-          <w:sz w:val="21"/>
-        </w:rPr>
-        <w:t xml:space="preserve">   1.3 Relación con las Competencias del Perfil de Egreso                       6</w:t>
-      </w:r>
-    </w:p>
-    <w:p>
-      <w:r>
-        <w:rPr>
-          <w:sz w:val="21"/>
-        </w:rPr>
-        <w:t xml:space="preserve">   1.4 Relación del Proyecto con los Intereses Profesionales                    7</w:t>
-      </w:r>
-    </w:p>
-    <w:p>
-      <w:r>
-        <w:rPr>
-          <w:sz w:val="21"/>
-        </w:rPr>
-        <w:t xml:space="preserve">   1.5 Factibilidad del Proyecto y Modelo Operacional                           8</w:t>
-      </w:r>
-    </w:p>
-    <w:p>
-      <w:r>
-        <w:rPr>
-          <w:sz w:val="21"/>
-        </w:rPr>
-        <w:t xml:space="preserve">      1.5.1 Factibilidad Temporal                                               8</w:t>
-      </w:r>
-    </w:p>
-    <w:p>
-      <w:r>
-        <w:rPr>
-          <w:sz w:val="21"/>
-        </w:rPr>
-        <w:t xml:space="preserve">      1.5.2 Factibilidad Técnica y de Recursos                                  8</w:t>
-      </w:r>
-    </w:p>
-    <w:p>
-      <w:r>
-        <w:rPr>
-          <w:sz w:val="21"/>
-        </w:rPr>
-        <w:t xml:space="preserve">      1.5.3 Factores Facilitadores                                              9</w:t>
-      </w:r>
-    </w:p>
-    <w:p>
-      <w:r>
-        <w:rPr>
-          <w:sz w:val="21"/>
-        </w:rPr>
-        <w:t xml:space="preserve">      1.5.4 Factores Obstaculizadores y Plan de Mitigación                      9</w:t>
-      </w:r>
-    </w:p>
-    <w:p>
-      <w:r>
-        <w:rPr>
-          <w:sz w:val="21"/>
-        </w:rPr>
-        <w:t xml:space="preserve">      1.5.5 Modelo de Negocio e Impacto Operacional para Lumina Motion         10</w:t>
-      </w:r>
-    </w:p>
-    <w:p>
-      <w:r>
-        <w:rPr>
-          <w:b/>
-          <w:color w:val="003366"/>
-          <w:sz w:val="24"/>
-        </w:rPr>
-        <w:t>1.5.5 Modelo de Negocio e Impacto Operacional para Lumina Motion</w:t>
-      </w:r>
-    </w:p>
-    <w:p>
-      <w:r>
-        <w:rPr>
-          <w:sz w:val="22"/>
-        </w:rPr>
-        <w:t>A diferencia de las soluciones genéricas de cartelería digital que operan bajo suscripciones comerciales públicas tipo SaaS, el proyecto ACE adopta un modelo de software a medida para uso operacional interno (Internal Tooling) de Lumina Motion Studio. Este enfoque estratégico genera un triple impacto financiero y competitivo:</w:t>
-        <w:br/>
-        <w:t>1. Eliminación de Licenciamiento Recurrente: Se sustituye el pago mensual por pantalla de licencias comerciales fragmentadas (como MadMapper y Arena.im) por una plataforma propia, escalable y sin costo marginal por dispositivo incorporado.</w:t>
-        <w:br/>
-        <w:t>2. Reducción a Cero de Gastos Logísticos: Se erradica la necesidad de traslados físicos de técnicos in situ para actualizaciones de anuncios vía dispositivos USB en centros comerciales, ahorrando costos directos en horas-hombre, traslados y viáticos.</w:t>
-        <w:br/>
-        <w:t>3. Blindaje Contractual ante Clientes Finales: Al asegurar tolerancia total ante caídas de internet (resiliencia offline), Lumina Motion elimina el riesgo de sanciones comerciales y pérdida de ingresos publicitarios derivados de pantallas en negro durante eventos corporativos o campañas masivas.</w:t>
-      </w:r>
-    </w:p>
-    <w:p/>
-    <w:p>
-      <w:r>
-        <w:rPr>
-          <w:b/>
-          <w:sz w:val="21"/>
-        </w:rPr>
-        <w:t>PARTE II: OBJETIVOS, METODOLOGÍA Y PLANIFICACIÓN                               11</w:t>
-      </w:r>
-    </w:p>
-    <w:p>
-      <w:r>
-        <w:rPr>
-          <w:sz w:val="21"/>
-        </w:rPr>
-        <w:t xml:space="preserve">   2.1 Formulación de Objetivos (General y 6 Específicos)                      11</w:t>
-      </w:r>
-    </w:p>
-    <w:p>
-      <w:r>
-        <w:rPr>
-          <w:sz w:val="21"/>
-        </w:rPr>
-        <w:t xml:space="preserve">   2.2 Metodología de Trabajo y Roles Disciplinares (Scrum Adaptado)           12</w:t>
-      </w:r>
-    </w:p>
-    <w:p>
-      <w:r>
-        <w:rPr>
-          <w:sz w:val="21"/>
-        </w:rPr>
-        <w:t xml:space="preserve">   2.3 Plan de Trabajo Articulado por Competencias (22 Actividades)            13</w:t>
-      </w:r>
-    </w:p>
-    <w:p>
-      <w:r>
-        <w:rPr>
-          <w:sz w:val="21"/>
-        </w:rPr>
-        <w:t xml:space="preserve">   2.4 Determinación y Justificación de Evidencias                             15</w:t>
-      </w:r>
-    </w:p>
-    <w:p>
-      <w:r>
-        <w:rPr>
-          <w:sz w:val="21"/>
-        </w:rPr>
-        <w:t xml:space="preserve">   2.5 Cronograma de Trabajo y Carta Gantt (18 Semanas)                        16</w:t>
-      </w:r>
-    </w:p>
-    <w:p>
-      <w:r>
-        <w:rPr>
-          <w:sz w:val="21"/>
-        </w:rPr>
-        <w:t xml:space="preserve">   2.6 Políticas de Seguridad y Protección de la Información                   17</w:t>
-      </w:r>
-    </w:p>
-    <w:p>
-      <w:r>
-        <w:rPr>
-          <w:sz w:val="21"/>
-        </w:rPr>
-        <w:t xml:space="preserve">   2.7 Prototipos Visuales y Wireframes de Interfaz (Mockups UI/UX)            18</w:t>
-      </w:r>
-    </w:p>
-    <w:p>
-      <w:r>
-        <w:rPr>
-          <w:b/>
-          <w:sz w:val="21"/>
-        </w:rPr>
-        <w:t>PARTE III: CONCLUSIONES Y VALOR AGREGADO                                       19</w:t>
-      </w:r>
-    </w:p>
-    <w:p>
-      <w:r>
-        <w:rPr>
-          <w:b/>
-          <w:color w:val="003366"/>
-          <w:sz w:val="24"/>
-        </w:rPr>
-        <w:t>2.6 Políticas de Seguridad y Protección de la Información</w:t>
-      </w:r>
-    </w:p>
-    <w:p>
-      <w:r>
-        <w:rPr>
-          <w:sz w:val="22"/>
-        </w:rPr>
-        <w:t>La plataforma ACE implementa medidas de seguridad y privacidad en tres capas fundamentales:</w:t>
-        <w:br/>
-        <w:t>• Autenticación y Control de Accesos por Locación: El acceso a la interfaz web administrativa se gestiona mediante tokens JWT y Laravel Sanctum. Se aplican dos roles diferenciados: Administrador (acceso global irrestricto, utilizado por Cristóbal Manzo) y Operador (acceso estrictamente restringido a las locaciones autorizadas mediante la tabla relacional usuarios_locaciones), impidiendo la visualización o manipulación de contenidos no asignados.</w:t>
-        <w:br/>
-        <w:t>• Verificación de Integridad Criptográfica (SHA-256): Para mitigar el riesgo de inyección o corrupción de archivos multimedia durante transferencias de red, el reproductor local (NUC) calcula mandatoriamente el hash SHA-256 de cada archivo descargado y lo valida contra el catálogo central antes de autorizar su exhibición.</w:t>
-        <w:br/>
-        <w:t>• Seguridad en Comunicaciones y Aislamiento Offline: El canal de sincronización combina endpoints HTTPS REST con WebSockets autenticados (wss://). Ante la caída de conexión exterior, el reproductor no expone puertos vulnerables a internet y restringe la gestión manual de contingencia exclusivamente a la red de área local autorizada.</w:t>
-        <w:br/>
-        <w:t>• Privacidad y Protección de Datos Personales: En estricto cumplimiento de directrices éticas y de protección de identidad, ningún dato personal sensible de los integrantes (tales como números de RUT) se registra en repositorios Git públicos o archivos Markdown, reservándose exclusivamente para el canal privado de titulación.</w:t>
-      </w:r>
-    </w:p>
-    <w:p/>
-    <w:p>
-      <w:r>
-        <w:rPr>
-          <w:b/>
-          <w:color w:val="003366"/>
-          <w:sz w:val="24"/>
-        </w:rPr>
-        <w:t>2.7 Prototipos Visuales y Wireframes de Interfaz (Mockups UI/UX)</w:t>
-      </w:r>
-    </w:p>
-    <w:p>
-      <w:r>
-        <w:rPr>
-          <w:sz w:val="22"/>
-        </w:rPr>
-        <w:t>En concordancia con el plan de trabajo de ingeniería (Actividad 2.3: Diseño UI/UX), la plataforma web administrativa contempla interfaces optimizadas para la usabilidad y rapidez operativa de Lumina Motion. Los componentes esenciales incluyen: (a) Panel de control de pantallas con semáforo de telemetría en vivo, (b) Gestor de catálogos multimedia con verificación de códecs y pesos, y (c) Parrilla interactiva para la asignación de horarios sin solapamientos entre locaciones y sectores.</w:t>
-      </w:r>
-    </w:p>
-    <w:tbl>
-      <w:tblPr>
-        <w:tblW w:type="auto" w:w="0"/>
-        <w:jc w:val="center"/>
-        <w:tblLook w:firstColumn="1" w:firstRow="1" w:lastColumn="0" w:lastRow="0" w:noHBand="0" w:noVBand="1" w:val="04A0"/>
-      </w:tblPr>
-      <w:tblGrid>
-        <w:gridCol w:w="9360"/>
-      </w:tblGrid>
-      <w:tr>
-        <w:tc>
-          <w:tcPr>
-            <w:tcW w:type="dxa" w:w="9360"/>
-            <w:shd w:fill="F4F6F9"/>
-            <w:tcBorders>
-              <w:top w:val="dashed" w:sz="12" w:space="0" w:color="003366"/>
-              <w:left w:val="dashed" w:sz="12" w:space="0" w:color="003366"/>
-              <w:bottom w:val="dashed" w:sz="12" w:space="0" w:color="003366"/>
-              <w:right w:val="dashed" w:sz="12" w:space="0" w:color="003366"/>
-            </w:tcBorders>
-          </w:tcPr>
-          <w:p>
-            <w:pPr>
-              <w:jc w:val="center"/>
-            </w:pPr>
-            <w:r>
-              <w:rPr>
-                <w:b/>
-                <w:color w:val="003366"/>
-                <w:sz w:val="24"/>
-              </w:rPr>
-              <w:br/>
-              <w:br/>
-              <w:t>🖼️ [ESPACIO RESERVADO PARA INSERCIÓN DE CAPTURAS / WIREFRAMES DE FIGMA]</w:t>
-              <w:br/>
-              <w:br/>
-            </w:r>
-            <w:r>
-              <w:rPr>
-                <w:i/>
-                <w:color w:val="646464"/>
-                <w:sz w:val="20"/>
-              </w:rPr>
-              <w:t>Panel Administrativo Centralizado • Parrilla Horaria de Pautas • Monitoreo de Pantallas NUC en Tiempo Real</w:t>
-              <w:br/>
-              <w:t>(Pegue o inserte aquí las imágenes de los prototipos diseñados en Figma antes de la exportación final a PDF)</w:t>
-              <w:br/>
-              <w:br/>
-            </w:r>
-          </w:p>
-        </w:tc>
-      </w:tr>
-    </w:tbl>
-    <w:p/>
-    <w:p>
-      <w:r>
-        <w:rPr>
-          <w:b/>
-          <w:color w:val="003366"/>
-          <w:sz w:val="28"/>
-        </w:rPr>
-        <w:t>PARTE III: CONCLUSIONES Y VALOR AGREGADO</w:t>
-      </w:r>
-    </w:p>
-    <w:p>
-      <w:r>
-        <w:rPr>
-          <w:sz w:val="22"/>
-        </w:rPr>
-        <w:t>La culminación de esta primera fase evaluativa (Fase 1: Definición del Proyecto APT) permite extraer las siguientes conclusiones fundamentales:</w:t>
-        <w:br/>
-        <w:br/>
-        <w:t>1. Solución de Ingeniería de Alto Valor Industrial: El proyecto ACE trasciende un ejercicio teórico al resolver una problemática operativa auténtica de Lumina Motion Studio. La arquitectura desacoplada propuesta mitiga efectivamente los puntos de falla críticos (actualización manual por USB y vulnerabilidad a pantallas en negro por caídas de internet), asegurando continuidad de negocio y retención publicitaria.</w:t>
-        <w:br/>
-        <w:br/>
-        <w:t>2. Viabilidad y Factibilidad Acreditadas: El análisis multidimensional confirma la plena viabilidad de ejecutar la plataforma en las 18 semanas lectivas. La delimitación rigurosa del alcance —enfocado estrictamente en la distribución, programación y resiliencia offline de contenidos— resguarda al equipo de desviaciones temporales, mientras que la planificación en 22 actividades articuladas por sprints y la disponibilidad de hardware de pruebas garantizan el cumplimiento de los hitos evaluativos de Duoc UC.</w:t>
-        <w:br/>
-        <w:br/>
-        <w:t>3. Articulación Transversal del Perfil de Egreso: El diseño de ACE demuestra la aplicación armónica e integrada de las competencias troncales de la carrera de Ingeniería en Informática (Malla Curricular 1446114): desarrollo distribuido fullstack (C1), persistencia relacional íntegra en MariaDB (C2), y metodologías ágiles de ingeniería de software con aseguramiento de calidad (C3). Asimismo, la corresponsabilidad disciplinar establecida entre Tomás Escalante, Matías Salas y Paulo Loyola asegura un trabajo en equipo sinérgico, auditable y con aportes equitativos comprobables a través de GitHub.</w:t>
-        <w:br/>
-        <w:br/>
-        <w:t>En síntesis, ACE establece las bases técnicas, operativas y metodológicas indispensables para afrontar con éxito la Fase 2 (Construcción del Core y Demostración Funcional), consolidando una solución tecnológica robusta, profesional y de impacto directo en el mercado de la cartelería digital.</w:t>
-      </w:r>
-    </w:p>
-    <w:p/>
-    <w:p>
-      <w:r>
-        <w:rPr>
-          <w:b/>
-          <w:color w:val="003366"/>
-          <w:sz w:val="28"/>
-        </w:rPr>
-        <w:t>PARTE IV: REFERENCIAS BIBLIOGRÁFICAS</w:t>
-      </w:r>
-    </w:p>
-    <w:p/>
-    <w:p>
-      <w:r>
-        <w:rPr>
-          <w:b/>
-          <w:color w:val="003366"/>
-          <w:sz w:val="28"/>
-        </w:rPr>
-        <w:t>INTRODUCCIÓN</w:t>
-      </w:r>
-    </w:p>
-    <w:p>
-      <w:r>
-        <w:rPr>
-          <w:sz w:val="22"/>
-        </w:rPr>
-        <w:t>El presente informe formaliza la definición de ingeniería, arquitectura, alcance y planificación del proyecto de titulación ACE (Autonomous Content Engine), desarrollado en el marco de la asignatura Proyecto de Aplicación Práctica (Capstone, PTY4614) de la carrera de Ingeniería en Informática de Duoc UC, Sede Antonio Varas.</w:t>
-        <w:br/>
-        <w:br/>
-        <w:t>El proyecto aborda una problemática crítica en el ámbito de la cartelería digital (Digital Signage) para el estudio multimedia Lumina Motion Studio: la descentralización operativa de sus pantallas, los altos costos recurrentes de licenciamiento propietario y la vulnerabilidad frente a pérdidas de conectividad en recintos comerciales masivos. A través de una arquitectura cliente-servidor híbrida desacoplada, ACE centraliza la administración remota de medios, locaciones y parrillas de programación, asegurando simultáneamente la continuidad ininterrumpida de reproducción y la capacidad de modificación local ante contingencias sin conexión a internet.</w:t>
-        <w:br/>
-        <w:br/>
-        <w:t>A lo largo de este documento se detallan los antecedentes del equipo, la articulación directa con las competencias del perfil de egreso, el análisis de factibilidad y modelo operacional, la formulación de los 6 objetivos específicos acordados, el marco ágil de desarrollo (Scrum adaptado), la Carta Gantt de 18 semanas, las directrices de seguridad de la información, el espacio para prototipos de interfaz (mockups) y las conclusiones que sustentan la rigurosidad técnica de esta primera fase evaluativa.</w:t>
-      </w:r>
-    </w:p>
-    <w:p/>
     <w:p>
       <w:pPr>
         <w:pStyle w:val="Heading1"/>
@@ -2327,8 +2546,8 @@
         <w:spacing w:after="120" w:before="360" w:lineRule="auto"/>
         <w:rPr/>
       </w:pPr>
-      <w:bookmarkStart w:colFirst="0" w:colLast="0" w:name="_heading=h.iklnied1bnrg" w:id="3"/>
-      <w:bookmarkEnd w:id="3"/>
+      <w:bookmarkStart w:colFirst="0" w:colLast="0" w:name="_heading=h.iklnied1bnrg" w:id="4"/>
+      <w:bookmarkEnd w:id="4"/>
       <w:r>
         <w:rPr>
           <w:rtl w:val="0"/>
@@ -2343,8 +2562,8 @@
         <w:spacing w:after="80" w:before="280" w:lineRule="auto"/>
         <w:rPr/>
       </w:pPr>
-      <w:bookmarkStart w:colFirst="0" w:colLast="0" w:name="_heading=h.josnt27larj8" w:id="4"/>
-      <w:bookmarkEnd w:id="4"/>
+      <w:bookmarkStart w:colFirst="0" w:colLast="0" w:name="_heading=h.josnt27larj8" w:id="5"/>
+      <w:bookmarkEnd w:id="5"/>
       <w:r>
         <w:rPr>
           <w:rtl w:val="0"/>
@@ -2386,15 +2605,15 @@
       </w:tblPr>
       <w:tblGrid>
         <w:gridCol w:w="1800"/>
-        <w:gridCol w:w="2550"/>
-        <w:gridCol w:w="1770"/>
-        <w:gridCol w:w="3240"/>
+        <w:gridCol w:w="1590"/>
+        <w:gridCol w:w="1815"/>
+        <w:gridCol w:w="4155"/>
         <w:tblGridChange w:id="0">
           <w:tblGrid>
             <w:gridCol w:w="1800"/>
-            <w:gridCol w:w="2550"/>
-            <w:gridCol w:w="1770"/>
-            <w:gridCol w:w="3240"/>
+            <w:gridCol w:w="1590"/>
+            <w:gridCol w:w="1815"/>
+            <w:gridCol w:w="4155"/>
           </w:tblGrid>
         </w:tblGridChange>
       </w:tblGrid>
@@ -2881,26 +3100,13 @@
     </w:tbl>
     <w:p>
       <w:pPr>
-        <w:spacing w:after="120" w:before="0" w:line="276" w:lineRule="auto"/>
-        <w:rPr>
-          <w:rFonts w:ascii="Calibri" w:cs="Calibri" w:eastAsia="Calibri" w:hAnsi="Calibri"/>
-        </w:rPr>
-      </w:pPr>
-      <w:r>
-        <w:rPr>
-          <w:rtl w:val="0"/>
-        </w:rPr>
-      </w:r>
-    </w:p>
-    <w:p>
-      <w:pPr>
         <w:pStyle w:val="Heading2"/>
         <w:keepNext w:val="1"/>
         <w:spacing w:after="80" w:before="280" w:lineRule="auto"/>
         <w:rPr/>
       </w:pPr>
-      <w:bookmarkStart w:colFirst="0" w:colLast="0" w:name="_heading=h.fhyubvtgds10" w:id="5"/>
-      <w:bookmarkEnd w:id="5"/>
+      <w:bookmarkStart w:colFirst="0" w:colLast="0" w:name="_heading=h.fhyubvtgds10" w:id="6"/>
+      <w:bookmarkEnd w:id="6"/>
       <w:r>
         <w:rPr>
           <w:rtl w:val="0"/>
@@ -2915,8 +3121,8 @@
         <w:spacing w:after="40" w:before="200" w:lineRule="auto"/>
         <w:rPr/>
       </w:pPr>
-      <w:bookmarkStart w:colFirst="0" w:colLast="0" w:name="_heading=h.wmsx5fvuekd" w:id="6"/>
-      <w:bookmarkEnd w:id="6"/>
+      <w:bookmarkStart w:colFirst="0" w:colLast="0" w:name="_heading=h.wmsx5fvuekd" w:id="7"/>
+      <w:bookmarkEnd w:id="7"/>
       <w:r>
         <w:rPr>
           <w:rtl w:val="0"/>
@@ -3103,9 +3309,7 @@
         <w:spacing w:after="0" w:before="0" w:line="276" w:lineRule="auto"/>
         <w:ind w:left="360" w:right="0" w:hanging="360"/>
         <w:jc w:val="left"/>
-        <w:rPr>
-          <w:rFonts w:ascii="Calibri" w:cs="Calibri" w:eastAsia="Calibri" w:hAnsi="Calibri"/>
-        </w:rPr>
+        <w:rPr/>
       </w:pPr>
       <w:r>
         <w:rPr>
@@ -3181,6 +3385,11 @@
         </w:rPr>
         <w:t xml:space="preserve"> La dependencia de la conectividad a internet en recintos masivos genera puntos críticos de falla: caídas en el enlace de red provocan pantallas en negro, congelamiento de visuales o interrupción de pautas comerciales ante el público general.</w:t>
       </w:r>
+      <w:r>
+        <w:rPr>
+          <w:rtl w:val="0"/>
+        </w:rPr>
+      </w:r>
     </w:p>
     <w:p>
       <w:pPr>
@@ -3264,9 +3473,7 @@
         <w:spacing w:after="0" w:before="0" w:line="276" w:lineRule="auto"/>
         <w:ind w:left="360" w:right="0" w:hanging="360"/>
         <w:jc w:val="left"/>
-        <w:rPr>
-          <w:rFonts w:ascii="Calibri" w:cs="Calibri" w:eastAsia="Calibri" w:hAnsi="Calibri"/>
-        </w:rPr>
+        <w:rPr/>
       </w:pPr>
       <w:r>
         <w:rPr>
@@ -3333,9 +3540,7 @@
         <w:spacing w:after="0" w:before="0" w:line="276" w:lineRule="auto"/>
         <w:ind w:left="360" w:right="0" w:hanging="360"/>
         <w:jc w:val="left"/>
-        <w:rPr>
-          <w:rFonts w:ascii="Calibri" w:cs="Calibri" w:eastAsia="Calibri" w:hAnsi="Calibri"/>
-        </w:rPr>
+        <w:rPr/>
       </w:pPr>
       <w:r>
         <w:rPr>
@@ -3402,9 +3607,7 @@
         <w:spacing w:after="60" w:before="0" w:line="276" w:lineRule="auto"/>
         <w:ind w:left="360" w:right="0" w:hanging="360"/>
         <w:jc w:val="left"/>
-        <w:rPr>
-          <w:rFonts w:ascii="Calibri" w:cs="Calibri" w:eastAsia="Calibri" w:hAnsi="Calibri"/>
-        </w:rPr>
+        <w:rPr/>
       </w:pPr>
       <w:r>
         <w:rPr>
@@ -3421,33 +3624,6 @@
           <w:rtl w:val="0"/>
         </w:rPr>
         <w:t xml:space="preserve"> Si se produce una pérdida de conexión a internet en la locación, las pantallas continúan reproduciendo autónomamente la programación vigente en bucle sin interrupción. Asimismo, el sistema habilita la realización de cambios locales de contenido y programación sin internet utilizando los archivos disponibles en la locación.</w:t>
-      </w:r>
-    </w:p>
-    <w:p>
-      <w:pPr>
-        <w:keepNext w:val="0"/>
-        <w:keepLines w:val="0"/>
-        <w:pageBreakBefore w:val="0"/>
-        <w:widowControl w:val="1"/>
-        <w:pBdr>
-          <w:top w:space="0" w:sz="0" w:val="nil"/>
-          <w:left w:space="0" w:sz="0" w:val="nil"/>
-          <w:bottom w:space="0" w:sz="0" w:val="nil"/>
-          <w:right w:space="0" w:sz="0" w:val="nil"/>
-          <w:between w:space="0" w:sz="0" w:val="nil"/>
-        </w:pBdr>
-        <w:shd w:fill="auto" w:val="clear"/>
-        <w:spacing w:after="60" w:before="0" w:line="276" w:lineRule="auto"/>
-        <w:ind w:left="360" w:right="0" w:firstLine="0"/>
-        <w:jc w:val="left"/>
-        <w:rPr>
-          <w:rFonts w:ascii="Calibri" w:cs="Calibri" w:eastAsia="Calibri" w:hAnsi="Calibri"/>
-        </w:rPr>
-      </w:pPr>
-      <w:r>
-        <w:rPr>
-          <w:rtl w:val="0"/>
-        </w:rPr>
       </w:r>
     </w:p>
     <w:p>
@@ -3459,8 +3635,8 @@
           <w:color w:val="1b365d"/>
         </w:rPr>
       </w:pPr>
-      <w:bookmarkStart w:colFirst="0" w:colLast="0" w:name="_heading=h.qg8iqlhupppz" w:id="7"/>
-      <w:bookmarkEnd w:id="7"/>
+      <w:bookmarkStart w:colFirst="0" w:colLast="0" w:name="_heading=h.qg8iqlhupppz" w:id="8"/>
+      <w:bookmarkEnd w:id="8"/>
       <w:r>
         <w:rPr>
           <w:rtl w:val="0"/>
@@ -3552,6 +3728,11 @@
         </w:rPr>
         <w:t xml:space="preserve"> Elimina los costos de licenciamiento de plataformas propietarias y reduce a cero los traslados físicos de personal técnico para actualizaciones rutinarias.</w:t>
       </w:r>
+      <w:r>
+        <w:rPr>
+          <w:rtl w:val="0"/>
+        </w:rPr>
+      </w:r>
     </w:p>
     <w:p>
       <w:pPr>
@@ -3637,6 +3818,11 @@
         </w:rPr>
         <w:t xml:space="preserve"> Evita penalizaciones contractuales derivadas de la indisponibilidad de pantallas publicitarias durante eventos corporativos o activaciones en centros comerciales.</w:t>
       </w:r>
+      <w:r>
+        <w:rPr>
+          <w:rtl w:val="0"/>
+        </w:rPr>
+      </w:r>
     </w:p>
     <w:p>
       <w:pPr>
@@ -3748,37 +3934,22 @@
     </w:p>
     <w:p>
       <w:pPr>
+        <w:keepNext w:val="0"/>
+        <w:keepLines w:val="0"/>
+        <w:pageBreakBefore w:val="0"/>
+        <w:widowControl w:val="1"/>
+        <w:pBdr>
+          <w:top w:space="0" w:sz="0" w:val="nil"/>
+          <w:left w:space="0" w:sz="0" w:val="nil"/>
+          <w:bottom w:space="0" w:sz="0" w:val="nil"/>
+          <w:right w:space="0" w:sz="0" w:val="nil"/>
+          <w:between w:space="0" w:sz="0" w:val="nil"/>
+        </w:pBdr>
+        <w:shd w:fill="auto" w:val="clear"/>
+        <w:spacing w:after="60" w:before="0" w:line="276" w:lineRule="auto"/>
+        <w:ind w:left="360" w:right="0" w:firstLine="0"/>
+        <w:jc w:val="left"/>
         <w:rPr/>
-      </w:pPr>
-      <w:r>
-        <w:rPr>
-          <w:rtl w:val="0"/>
-        </w:rPr>
-      </w:r>
-    </w:p>
-    <w:p>
-      <w:pPr>
-        <w:keepNext w:val="1"/>
-        <w:spacing w:after="80" w:before="280" w:lineRule="auto"/>
-        <w:rPr>
-          <w:rFonts w:ascii="Calibri" w:cs="Calibri" w:eastAsia="Calibri" w:hAnsi="Calibri"/>
-          <w:color w:val="2d3748"/>
-        </w:rPr>
-      </w:pPr>
-      <w:r>
-        <w:rPr>
-          <w:rtl w:val="0"/>
-        </w:rPr>
-      </w:r>
-    </w:p>
-    <w:p>
-      <w:pPr>
-        <w:keepNext w:val="1"/>
-        <w:spacing w:after="80" w:before="280" w:lineRule="auto"/>
-        <w:rPr>
-          <w:rFonts w:ascii="Calibri" w:cs="Calibri" w:eastAsia="Calibri" w:hAnsi="Calibri"/>
-          <w:color w:val="2d3748"/>
-        </w:rPr>
       </w:pPr>
       <w:r>
         <w:rPr>
@@ -3793,8 +3964,8 @@
         <w:spacing w:after="80" w:before="280" w:lineRule="auto"/>
         <w:rPr/>
       </w:pPr>
-      <w:bookmarkStart w:colFirst="0" w:colLast="0" w:name="_heading=h.hsf0rg4nv3ug" w:id="8"/>
-      <w:bookmarkEnd w:id="8"/>
+      <w:bookmarkStart w:colFirst="0" w:colLast="0" w:name="_heading=h.hsf0rg4nv3ug" w:id="9"/>
+      <w:bookmarkEnd w:id="9"/>
       <w:r>
         <w:rPr>
           <w:rtl w:val="0"/>
@@ -3804,11 +3975,7 @@
     </w:p>
     <w:p>
       <w:pPr>
-        <w:spacing w:after="120" w:before="0" w:line="276" w:lineRule="auto"/>
-        <w:rPr>
-          <w:rFonts w:ascii="Calibri" w:cs="Calibri" w:eastAsia="Calibri" w:hAnsi="Calibri"/>
-          <w:color w:val="2d3748"/>
-        </w:rPr>
+        <w:rPr/>
       </w:pPr>
       <w:r>
         <w:rPr>
@@ -3858,12 +4025,12 @@
         <w:tblLook w:val="0400"/>
       </w:tblPr>
       <w:tblGrid>
-        <w:gridCol w:w="4320"/>
-        <w:gridCol w:w="5040"/>
+        <w:gridCol w:w="4185"/>
+        <w:gridCol w:w="5175"/>
         <w:tblGridChange w:id="0">
           <w:tblGrid>
-            <w:gridCol w:w="4320"/>
-            <w:gridCol w:w="5040"/>
+            <w:gridCol w:w="4185"/>
+            <w:gridCol w:w="5175"/>
           </w:tblGrid>
         </w:tblGridChange>
       </w:tblGrid>
@@ -4193,11 +4360,26 @@
     </w:p>
     <w:p>
       <w:pPr>
-        <w:spacing w:after="120" w:before="0" w:line="276" w:lineRule="auto"/>
+        <w:pStyle w:val="Heading2"/>
+        <w:keepNext w:val="1"/>
+        <w:spacing w:after="80" w:before="280" w:lineRule="auto"/>
         <w:rPr>
           <w:rFonts w:ascii="Calibri" w:cs="Calibri" w:eastAsia="Calibri" w:hAnsi="Calibri"/>
+          <w:b w:val="1"/>
+          <w:bCs w:val="1"/>
+          <w:color w:val="2b6cb0"/>
+          <w:sz w:val="26"/>
+          <w:szCs w:val="26"/>
         </w:rPr>
       </w:pPr>
+      <w:bookmarkStart w:colFirst="0" w:colLast="0" w:name="_heading=h.wu4ro6en6gyz" w:id="10"/>
+      <w:bookmarkEnd w:id="10"/>
+      <w:r>
+        <w:rPr>
+          <w:rtl w:val="0"/>
+        </w:rPr>
+        <w:t xml:space="preserve">1.4 Relación del Proyecto con los Intereses Profesionales</w:t>
+      </w:r>
       <w:r>
         <w:rPr>
           <w:rtl w:val="0"/>
@@ -4206,15 +4388,171 @@
     </w:p>
     <w:p>
       <w:pPr>
-        <w:spacing w:after="120" w:before="0" w:line="276" w:lineRule="auto"/>
+        <w:pStyle w:val="Heading3"/>
+        <w:keepNext w:val="1"/>
+        <w:spacing w:after="40" w:before="200" w:lineRule="auto"/>
+        <w:rPr>
+          <w:color w:val="1b365d"/>
+        </w:rPr>
+      </w:pPr>
+      <w:bookmarkStart w:colFirst="0" w:colLast="0" w:name="_heading=h.wc32q3doo5nt" w:id="11"/>
+      <w:bookmarkEnd w:id="11"/>
+      <w:r>
+        <w:rPr>
+          <w:rtl w:val="0"/>
+        </w:rPr>
+        <w:t xml:space="preserve">1.4.1 Paulo Loyola</w:t>
+      </w:r>
+      <w:r>
+        <w:rPr>
+          <w:rtl w:val="0"/>
+        </w:rPr>
+      </w:r>
+    </w:p>
+    <w:p>
+      <w:pPr>
+        <w:spacing w:after="160" w:before="80" w:line="276" w:lineRule="auto"/>
+        <w:ind w:left="576" w:right="576" w:firstLine="0"/>
         <w:rPr>
           <w:rFonts w:ascii="Calibri" w:cs="Calibri" w:eastAsia="Calibri" w:hAnsi="Calibri"/>
+          <w:sz w:val="21"/>
+          <w:szCs w:val="21"/>
         </w:rPr>
       </w:pPr>
       <w:r>
         <w:rPr>
-          <w:rtl w:val="0"/>
-        </w:rPr>
+          <w:rFonts w:ascii="Calibri" w:cs="Calibri" w:eastAsia="Calibri" w:hAnsi="Calibri"/>
+          <w:sz w:val="21"/>
+          <w:szCs w:val="21"/>
+          <w:rtl w:val="0"/>
+        </w:rPr>
+        <w:t xml:space="preserve">Mi interés profesional se concentra en el desarrollo de software front-end y la formalización rigurosa de la documentación técnica en proyectos de ingeniería. En el proyecto ACE, canalizo estos intereses liderando el diseño y construcción de las interfaces de usuario (UI/UX) para la administración centralizada de pantallas y contenidos, y el aseguramiento del repositorio documental para garantizar la trazabilidad, mantenibilidad y escalabilidad del producto a lo largo del tiempo.</w:t>
+      </w:r>
+    </w:p>
+    <w:p>
+      <w:pPr>
+        <w:spacing w:after="160" w:before="80" w:line="276" w:lineRule="auto"/>
+        <w:ind w:left="576" w:right="576" w:firstLine="0"/>
+        <w:rPr>
+          <w:rFonts w:ascii="Calibri" w:cs="Calibri" w:eastAsia="Calibri" w:hAnsi="Calibri"/>
+          <w:i w:val="1"/>
+          <w:iCs w:val="1"/>
+          <w:color w:val="718096"/>
+          <w:sz w:val="21"/>
+          <w:szCs w:val="21"/>
+        </w:rPr>
+      </w:pPr>
+      <w:r>
+        <w:rPr>
+          <w:rtl w:val="0"/>
+        </w:rPr>
+      </w:r>
+    </w:p>
+    <w:p>
+      <w:pPr>
+        <w:pStyle w:val="Heading3"/>
+        <w:keepNext w:val="1"/>
+        <w:spacing w:after="40" w:before="200" w:lineRule="auto"/>
+        <w:rPr>
+          <w:color w:val="1b365d"/>
+        </w:rPr>
+      </w:pPr>
+      <w:bookmarkStart w:colFirst="0" w:colLast="0" w:name="_heading=h.nln85i63hxpn" w:id="12"/>
+      <w:bookmarkEnd w:id="12"/>
+      <w:r>
+        <w:rPr>
+          <w:rtl w:val="0"/>
+        </w:rPr>
+        <w:t xml:space="preserve">1.4.2 Tomás Escalante</w:t>
+      </w:r>
+      <w:r>
+        <w:rPr>
+          <w:rtl w:val="0"/>
+        </w:rPr>
+      </w:r>
+    </w:p>
+    <w:p>
+      <w:pPr>
+        <w:spacing w:after="160" w:before="80" w:line="276" w:lineRule="auto"/>
+        <w:ind w:left="576" w:right="576" w:firstLine="0"/>
+        <w:rPr>
+          <w:rFonts w:ascii="Calibri" w:cs="Calibri" w:eastAsia="Calibri" w:hAnsi="Calibri"/>
+          <w:i w:val="1"/>
+          <w:iCs w:val="1"/>
+          <w:color w:val="718096"/>
+          <w:sz w:val="21"/>
+          <w:szCs w:val="21"/>
+        </w:rPr>
+      </w:pPr>
+      <w:r>
+        <w:rPr>
+          <w:rFonts w:ascii="Calibri" w:cs="Calibri" w:eastAsia="Calibri" w:hAnsi="Calibri"/>
+          <w:i w:val="1"/>
+          <w:iCs w:val="1"/>
+          <w:color w:val="718096"/>
+          <w:sz w:val="21"/>
+          <w:szCs w:val="21"/>
+          <w:rtl w:val="0"/>
+        </w:rPr>
+        <w:t xml:space="preserve">"Mi foco profesional se sitúa en la arquitectura de software distribuida, el desarrollo backend de alto rendimiento y la ingeniería de servicios resilientes ante condiciones de conectividad adversas. En ACE, aplico estas competencias diseñando e implementando la lógica de servidor en Laravel, la arquitectura de microservicios o servicios API, los protocolos de sincronización y control bidireccional vía WebSockets entre la nube y los nodos reproductores locales, garantizando una alta disponibilidad del sistema ante interrupciones de red."</w:t>
+      </w:r>
+    </w:p>
+    <w:p>
+      <w:pPr>
+        <w:spacing w:after="160" w:before="80" w:line="276" w:lineRule="auto"/>
+        <w:ind w:left="576" w:right="576" w:firstLine="0"/>
+        <w:rPr>
+          <w:rFonts w:ascii="Calibri" w:cs="Calibri" w:eastAsia="Calibri" w:hAnsi="Calibri"/>
+          <w:i w:val="1"/>
+          <w:iCs w:val="1"/>
+          <w:color w:val="718096"/>
+          <w:sz w:val="21"/>
+          <w:szCs w:val="21"/>
+        </w:rPr>
+      </w:pPr>
+      <w:r>
+        <w:rPr>
+          <w:rtl w:val="0"/>
+        </w:rPr>
+      </w:r>
+    </w:p>
+    <w:p>
+      <w:pPr>
+        <w:pStyle w:val="Heading3"/>
+        <w:keepNext w:val="1"/>
+        <w:spacing w:after="40" w:before="200" w:lineRule="auto"/>
+        <w:rPr>
+          <w:color w:val="1b365d"/>
+        </w:rPr>
+      </w:pPr>
+      <w:bookmarkStart w:colFirst="0" w:colLast="0" w:name="_heading=h.rqvjlu6rhws6" w:id="13"/>
+      <w:bookmarkEnd w:id="13"/>
+      <w:r>
+        <w:rPr>
+          <w:rtl w:val="0"/>
+        </w:rPr>
+        <w:t xml:space="preserve">1.4.3 Matías Salas</w:t>
+      </w:r>
+      <w:r>
+        <w:rPr>
+          <w:rtl w:val="0"/>
+        </w:rPr>
+      </w:r>
+    </w:p>
+    <w:p>
+      <w:pPr>
+        <w:spacing w:after="160" w:before="80" w:line="276" w:lineRule="auto"/>
+        <w:ind w:left="576" w:right="576" w:firstLine="0"/>
+        <w:rPr>
+          <w:rFonts w:ascii="Calibri" w:cs="Calibri" w:eastAsia="Calibri" w:hAnsi="Calibri"/>
+        </w:rPr>
+      </w:pPr>
+      <w:r>
+        <w:rPr>
+          <w:rFonts w:ascii="Calibri" w:cs="Calibri" w:eastAsia="Calibri" w:hAnsi="Calibri"/>
+          <w:rtl w:val="0"/>
+        </w:rPr>
+        <w:t xml:space="preserve">Mi interés profesional se orienta al desarrollo de software, la gestión del proyecto y la vinculación e interacción directa con el cliente, liderando el levantamiento continuo con Lumina Motion, la planificación operativa, la mitigación de riesgos y la articulación funcional de las entregas del software ante el usuario final.</w:t>
       </w:r>
     </w:p>
     <w:p>
@@ -4224,296 +4562,8 @@
         <w:spacing w:after="80" w:before="280" w:lineRule="auto"/>
         <w:rPr/>
       </w:pPr>
-      <w:bookmarkStart w:colFirst="0" w:colLast="0" w:name="_heading=h.wu4ro6en6gyz" w:id="9"/>
-      <w:bookmarkEnd w:id="9"/>
-      <w:r>
-        <w:rPr>
-          <w:rtl w:val="0"/>
-        </w:rPr>
-        <w:t xml:space="preserve">1.4 Relación del Proyecto con los Intereses Profesionales</w:t>
-      </w:r>
-    </w:p>
-    <w:p>
-      <w:pPr>
-        <w:keepNext w:val="1"/>
-        <w:spacing w:after="80" w:before="280" w:lineRule="auto"/>
-        <w:rPr>
-          <w:rFonts w:ascii="Calibri" w:cs="Calibri" w:eastAsia="Calibri" w:hAnsi="Calibri"/>
-          <w:b w:val="1"/>
-          <w:bCs w:val="1"/>
-          <w:color w:val="2b6cb0"/>
-          <w:sz w:val="26"/>
-          <w:szCs w:val="26"/>
-        </w:rPr>
-      </w:pPr>
-      <w:r>
-        <w:rPr>
-          <w:rtl w:val="0"/>
-        </w:rPr>
-      </w:r>
-    </w:p>
-    <w:p>
-      <w:pPr>
-        <w:pStyle w:val="Heading3"/>
-        <w:keepNext w:val="1"/>
-        <w:spacing w:after="40" w:before="200" w:lineRule="auto"/>
-        <w:rPr>
-          <w:color w:val="1b365d"/>
-        </w:rPr>
-      </w:pPr>
-      <w:bookmarkStart w:colFirst="0" w:colLast="0" w:name="_heading=h.wc32q3doo5nt" w:id="10"/>
-      <w:bookmarkEnd w:id="10"/>
-      <w:r>
-        <w:rPr>
-          <w:rtl w:val="0"/>
-        </w:rPr>
-        <w:t xml:space="preserve">1.4.1 Paulo Loyola</w:t>
-      </w:r>
-      <w:r>
-        <w:rPr>
-          <w:rtl w:val="0"/>
-        </w:rPr>
-      </w:r>
-    </w:p>
-    <w:p>
-      <w:pPr>
-        <w:spacing w:after="160" w:before="80" w:line="276" w:lineRule="auto"/>
-        <w:ind w:left="576" w:right="576" w:firstLine="0"/>
-        <w:rPr>
-          <w:rFonts w:ascii="Calibri" w:cs="Calibri" w:eastAsia="Calibri" w:hAnsi="Calibri"/>
-          <w:sz w:val="21"/>
-          <w:szCs w:val="21"/>
-        </w:rPr>
-      </w:pPr>
-      <w:r>
-        <w:rPr>
-          <w:rFonts w:ascii="Calibri" w:cs="Calibri" w:eastAsia="Calibri" w:hAnsi="Calibri"/>
-          <w:sz w:val="21"/>
-          <w:szCs w:val="21"/>
-          <w:rtl w:val="0"/>
-        </w:rPr>
-        <w:t xml:space="preserve">Mi interés profesional se concentra en el desarrollo de software front-end y la formalización rigurosa de la documentación técnica en proyectos de ingeniería. En el proyecto ACE, canalizo estos intereses liderando el diseño y construcción de las interfaces de usuario (UI/UX) para la administración centralizada de pantallas y contenidos, y el aseguramiento del repositorio documental para garantizar la trazabilidad, mantenibilidad y escalabilidad del producto a lo largo del tiempo.</w:t>
-      </w:r>
-    </w:p>
-    <w:p>
-      <w:pPr>
-        <w:spacing w:after="160" w:before="80" w:line="276" w:lineRule="auto"/>
-        <w:ind w:left="576" w:right="576" w:firstLine="0"/>
-        <w:rPr>
-          <w:rFonts w:ascii="Calibri" w:cs="Calibri" w:eastAsia="Calibri" w:hAnsi="Calibri"/>
-          <w:i w:val="1"/>
-          <w:iCs w:val="1"/>
-          <w:color w:val="718096"/>
-          <w:sz w:val="21"/>
-          <w:szCs w:val="21"/>
-        </w:rPr>
-      </w:pPr>
-      <w:r>
-        <w:rPr>
-          <w:rtl w:val="0"/>
-        </w:rPr>
-      </w:r>
-    </w:p>
-    <w:p>
-      <w:pPr>
-        <w:pStyle w:val="Heading3"/>
-        <w:keepNext w:val="1"/>
-        <w:spacing w:after="40" w:before="200" w:lineRule="auto"/>
-        <w:rPr>
-          <w:color w:val="1b365d"/>
-        </w:rPr>
-      </w:pPr>
-      <w:bookmarkStart w:colFirst="0" w:colLast="0" w:name="_heading=h.nln85i63hxpn" w:id="11"/>
-      <w:bookmarkEnd w:id="11"/>
-      <w:r>
-        <w:rPr>
-          <w:rtl w:val="0"/>
-        </w:rPr>
-        <w:t xml:space="preserve">1.4.2 Tomás Escalante</w:t>
-      </w:r>
-      <w:r>
-        <w:rPr>
-          <w:rtl w:val="0"/>
-        </w:rPr>
-      </w:r>
-    </w:p>
-    <w:p>
-      <w:pPr>
-        <w:spacing w:after="160" w:before="80" w:line="276" w:lineRule="auto"/>
-        <w:ind w:left="576" w:right="576" w:firstLine="0"/>
-        <w:rPr>
-          <w:rFonts w:ascii="Calibri" w:cs="Calibri" w:eastAsia="Calibri" w:hAnsi="Calibri"/>
-          <w:i w:val="1"/>
-          <w:iCs w:val="1"/>
-          <w:color w:val="718096"/>
-          <w:sz w:val="21"/>
-          <w:szCs w:val="21"/>
-        </w:rPr>
-      </w:pPr>
-      <w:r>
-        <w:rPr>
-          <w:rFonts w:ascii="Calibri" w:cs="Calibri" w:eastAsia="Calibri" w:hAnsi="Calibri"/>
-          <w:i w:val="1"/>
-          <w:iCs w:val="1"/>
-          <w:color w:val="718096"/>
-          <w:sz w:val="21"/>
-          <w:szCs w:val="21"/>
-          <w:rtl w:val="0"/>
-        </w:rPr>
-        <w:t xml:space="preserve">"Mi foco profesional se sitúa en la arquitectura de software distribuida, el desarrollo backend de alto rendimiento y la ingeniería de servicios resilientes ante condiciones de conectividad adversas. En ACE, aplico estas competencias diseñando e implementando la lógica de servidor en Laravel, la arquitectura de microservicios o servicios API, los protocolos de sincronización y control bidireccional vía WebSockets entre la nube y los nodos reproductores locales, garantizando una alta disponibilidad del sistema ante interrupciones de red."</w:t>
-      </w:r>
-    </w:p>
-    <w:p>
-      <w:pPr>
-        <w:spacing w:after="160" w:before="80" w:line="276" w:lineRule="auto"/>
-        <w:ind w:left="576" w:right="576" w:firstLine="0"/>
-        <w:rPr>
-          <w:rFonts w:ascii="Calibri" w:cs="Calibri" w:eastAsia="Calibri" w:hAnsi="Calibri"/>
-          <w:i w:val="1"/>
-          <w:iCs w:val="1"/>
-          <w:color w:val="718096"/>
-          <w:sz w:val="21"/>
-          <w:szCs w:val="21"/>
-        </w:rPr>
-      </w:pPr>
-      <w:r>
-        <w:rPr>
-          <w:rtl w:val="0"/>
-        </w:rPr>
-      </w:r>
-    </w:p>
-    <w:p>
-      <w:pPr>
-        <w:pStyle w:val="Heading3"/>
-        <w:keepNext w:val="1"/>
-        <w:spacing w:after="40" w:before="200" w:lineRule="auto"/>
-        <w:rPr>
-          <w:color w:val="1b365d"/>
-        </w:rPr>
-      </w:pPr>
-      <w:bookmarkStart w:colFirst="0" w:colLast="0" w:name="_heading=h.rqvjlu6rhws6" w:id="12"/>
-      <w:bookmarkEnd w:id="12"/>
-      <w:r>
-        <w:rPr>
-          <w:rtl w:val="0"/>
-        </w:rPr>
-        <w:t xml:space="preserve">1.4.3 Matías Salas</w:t>
-      </w:r>
-      <w:r>
-        <w:rPr>
-          <w:rtl w:val="0"/>
-        </w:rPr>
-      </w:r>
-    </w:p>
-    <w:p>
-      <w:pPr>
-        <w:spacing w:after="160" w:before="80" w:line="276" w:lineRule="auto"/>
-        <w:ind w:left="576" w:right="576" w:firstLine="0"/>
-        <w:rPr>
-          <w:rFonts w:ascii="Calibri" w:cs="Calibri" w:eastAsia="Calibri" w:hAnsi="Calibri"/>
-        </w:rPr>
-      </w:pPr>
-      <w:r>
-        <w:rPr>
-          <w:rFonts w:ascii="Calibri" w:cs="Calibri" w:eastAsia="Calibri" w:hAnsi="Calibri"/>
-          <w:rtl w:val="0"/>
-        </w:rPr>
-        <w:t xml:space="preserve">Mi interés profesional se orienta al desarrollo de software, la gestión del proyecto y la vinculación e interacción directa con el cliente, liderando el levantamiento continuo con Lumina Motion, la planificación operativa, la mitigación de riesgos y la articulación funcional de las entregas del software ante el usuario final.</w:t>
-      </w:r>
-    </w:p>
-    <w:p>
-      <w:pPr>
-        <w:spacing w:after="160" w:before="80" w:line="276" w:lineRule="auto"/>
-        <w:ind w:left="576" w:right="576" w:firstLine="0"/>
-        <w:rPr>
-          <w:rFonts w:ascii="Calibri" w:cs="Calibri" w:eastAsia="Calibri" w:hAnsi="Calibri"/>
-        </w:rPr>
-      </w:pPr>
-      <w:r>
-        <w:rPr>
-          <w:rtl w:val="0"/>
-        </w:rPr>
-      </w:r>
-    </w:p>
-    <w:p>
-      <w:pPr>
-        <w:spacing w:after="160" w:before="80" w:line="276" w:lineRule="auto"/>
-        <w:ind w:left="576" w:right="576" w:firstLine="0"/>
-        <w:rPr>
-          <w:rFonts w:ascii="Calibri" w:cs="Calibri" w:eastAsia="Calibri" w:hAnsi="Calibri"/>
-        </w:rPr>
-      </w:pPr>
-      <w:r>
-        <w:rPr>
-          <w:rtl w:val="0"/>
-        </w:rPr>
-      </w:r>
-    </w:p>
-    <w:p>
-      <w:pPr>
-        <w:spacing w:after="160" w:before="80" w:line="276" w:lineRule="auto"/>
-        <w:ind w:left="576" w:right="576" w:firstLine="0"/>
-        <w:rPr>
-          <w:rFonts w:ascii="Calibri" w:cs="Calibri" w:eastAsia="Calibri" w:hAnsi="Calibri"/>
-        </w:rPr>
-      </w:pPr>
-      <w:r>
-        <w:rPr>
-          <w:rtl w:val="0"/>
-        </w:rPr>
-      </w:r>
-    </w:p>
-    <w:p>
-      <w:pPr>
-        <w:spacing w:after="160" w:before="80" w:line="276" w:lineRule="auto"/>
-        <w:ind w:left="576" w:right="576" w:firstLine="0"/>
-        <w:rPr>
-          <w:rFonts w:ascii="Calibri" w:cs="Calibri" w:eastAsia="Calibri" w:hAnsi="Calibri"/>
-        </w:rPr>
-      </w:pPr>
-      <w:r>
-        <w:rPr>
-          <w:rtl w:val="0"/>
-        </w:rPr>
-      </w:r>
-    </w:p>
-    <w:p>
-      <w:pPr>
-        <w:spacing w:after="160" w:before="80" w:line="276" w:lineRule="auto"/>
-        <w:ind w:left="576" w:right="576" w:firstLine="0"/>
-        <w:rPr>
-          <w:rFonts w:ascii="Calibri" w:cs="Calibri" w:eastAsia="Calibri" w:hAnsi="Calibri"/>
-        </w:rPr>
-      </w:pPr>
-      <w:r>
-        <w:rPr>
-          <w:rtl w:val="0"/>
-        </w:rPr>
-      </w:r>
-    </w:p>
-    <w:p>
-      <w:pPr>
-        <w:spacing w:after="160" w:before="80" w:line="276" w:lineRule="auto"/>
-        <w:ind w:left="0" w:right="576" w:firstLine="0"/>
-        <w:rPr>
-          <w:rFonts w:ascii="Calibri" w:cs="Calibri" w:eastAsia="Calibri" w:hAnsi="Calibri"/>
-        </w:rPr>
-      </w:pPr>
-      <w:r>
-        <w:rPr>
-          <w:rtl w:val="0"/>
-        </w:rPr>
-      </w:r>
-    </w:p>
-    <w:p>
-      <w:pPr>
-        <w:pStyle w:val="Heading2"/>
-        <w:keepNext w:val="1"/>
-        <w:spacing w:after="80" w:before="280" w:lineRule="auto"/>
-        <w:rPr/>
-      </w:pPr>
-      <w:bookmarkStart w:colFirst="0" w:colLast="0" w:name="_heading=h.3fne4z30hwks" w:id="13"/>
-      <w:bookmarkEnd w:id="13"/>
+      <w:bookmarkStart w:colFirst="0" w:colLast="0" w:name="_heading=h.3fne4z30hwks" w:id="14"/>
+      <w:bookmarkEnd w:id="14"/>
       <w:r>
         <w:rPr>
           <w:rtl w:val="0"/>
@@ -4561,8 +4611,8 @@
         <w:spacing w:after="40" w:before="200" w:lineRule="auto"/>
         <w:rPr/>
       </w:pPr>
-      <w:bookmarkStart w:colFirst="0" w:colLast="0" w:name="_heading=h.98vl3q91usm1" w:id="14"/>
-      <w:bookmarkEnd w:id="14"/>
+      <w:bookmarkStart w:colFirst="0" w:colLast="0" w:name="_heading=h.98vl3q91usm1" w:id="15"/>
+      <w:bookmarkEnd w:id="15"/>
       <w:r>
         <w:rPr>
           <w:rtl w:val="0"/>
@@ -4838,6 +4888,11 @@
         </w:rPr>
         <w:t xml:space="preserve"> Defensa presencial del proyecto de título.</w:t>
       </w:r>
+      <w:r>
+        <w:rPr>
+          <w:rtl w:val="0"/>
+        </w:rPr>
+      </w:r>
     </w:p>
     <w:p>
       <w:pPr>
@@ -4876,8 +4931,8 @@
           <w:color w:val="1b365d"/>
         </w:rPr>
       </w:pPr>
-      <w:bookmarkStart w:colFirst="0" w:colLast="0" w:name="_heading=h.8t4x5b9leec9" w:id="15"/>
-      <w:bookmarkEnd w:id="15"/>
+      <w:bookmarkStart w:colFirst="0" w:colLast="0" w:name="_heading=h.8t4x5b9leec9" w:id="16"/>
+      <w:bookmarkEnd w:id="16"/>
       <w:r>
         <w:rPr>
           <w:rtl w:val="0"/>
@@ -5010,6 +5065,11 @@
         </w:rPr>
         <w:t xml:space="preserve"> Disponibilidad de equipos portátiles, microcomputadores (Mini-PCs/NUCs) y pantallas secundarias para simular tanto el servidor central como los nodos reproductores de sitio y la desconexión física de red (fail-safe testing).</w:t>
       </w:r>
+      <w:r>
+        <w:rPr>
+          <w:rtl w:val="0"/>
+        </w:rPr>
+      </w:r>
     </w:p>
     <w:p>
       <w:pPr>
@@ -5048,8 +5108,8 @@
           <w:color w:val="1b365d"/>
         </w:rPr>
       </w:pPr>
-      <w:bookmarkStart w:colFirst="0" w:colLast="0" w:name="_heading=h.de48t4gtiegb" w:id="16"/>
-      <w:bookmarkEnd w:id="16"/>
+      <w:bookmarkStart w:colFirst="0" w:colLast="0" w:name="_heading=h.de48t4gtiegb" w:id="17"/>
+      <w:bookmarkEnd w:id="17"/>
       <w:r>
         <w:rPr>
           <w:rtl w:val="0"/>
@@ -5449,54 +5509,21 @@
     </w:p>
     <w:p>
       <w:pPr>
-        <w:keepNext w:val="0"/>
-        <w:keepLines w:val="0"/>
-        <w:pageBreakBefore w:val="0"/>
-        <w:widowControl w:val="1"/>
-        <w:pBdr>
-          <w:top w:space="0" w:sz="0" w:val="nil"/>
-          <w:left w:space="0" w:sz="0" w:val="nil"/>
-          <w:bottom w:space="0" w:sz="0" w:val="nil"/>
-          <w:right w:space="0" w:sz="0" w:val="nil"/>
-          <w:between w:space="0" w:sz="0" w:val="nil"/>
-        </w:pBdr>
-        <w:shd w:fill="auto" w:val="clear"/>
-        <w:spacing w:after="60" w:before="0" w:line="276" w:lineRule="auto"/>
-        <w:ind w:left="0" w:right="0" w:firstLine="0"/>
-        <w:jc w:val="left"/>
-        <w:rPr>
-          <w:rFonts w:ascii="Calibri" w:cs="Calibri" w:eastAsia="Calibri" w:hAnsi="Calibri"/>
-          <w:color w:val="2d3748"/>
-        </w:rPr>
-      </w:pPr>
-      <w:r>
-        <w:rPr>
-          <w:rtl w:val="0"/>
-        </w:rPr>
-      </w:r>
-    </w:p>
-    <w:p>
-      <w:pPr>
         <w:pStyle w:val="Heading3"/>
         <w:keepNext w:val="1"/>
         <w:spacing w:after="40" w:before="200" w:lineRule="auto"/>
-        <w:rPr/>
+        <w:rPr>
+          <w:rFonts w:ascii="Calibri" w:cs="Calibri" w:eastAsia="Calibri" w:hAnsi="Calibri"/>
+        </w:rPr>
       </w:pPr>
-      <w:bookmarkStart w:colFirst="0" w:colLast="0" w:name="_heading=h.2z3vtuwyd7l0" w:id="17"/>
-      <w:bookmarkEnd w:id="17"/>
+      <w:bookmarkStart w:colFirst="0" w:colLast="0" w:name="_heading=h.2z3vtuwyd7l0" w:id="18"/>
+      <w:bookmarkEnd w:id="18"/>
       <w:r>
         <w:rPr>
           <w:rtl w:val="0"/>
         </w:rPr>
         <w:t xml:space="preserve">1.5.4 Factores Obstaculizadores y Plan de Mitigación</w:t>
       </w:r>
-    </w:p>
-    <w:p>
-      <w:pPr>
-        <w:rPr>
-          <w:rFonts w:ascii="Calibri" w:cs="Calibri" w:eastAsia="Calibri" w:hAnsi="Calibri"/>
-        </w:rPr>
-      </w:pPr>
       <w:r>
         <w:rPr>
           <w:rtl w:val="0"/>
@@ -5976,10 +6003,36 @@
     </w:tbl>
     <w:p>
       <w:pPr>
+        <w:pStyle w:val="Heading3"/>
+        <w:rPr/>
+      </w:pPr>
+      <w:bookmarkStart w:colFirst="0" w:colLast="0" w:name="_heading=h.8zks2l6z8zp1" w:id="19"/>
+      <w:bookmarkEnd w:id="19"/>
+      <w:r>
+        <w:rPr>
+          <w:rtl w:val="0"/>
+        </w:rPr>
+        <w:t xml:space="preserve">1.5.5 Modelo de Negocio e Impacto Operacional para Lumina Motion</w:t>
+      </w:r>
+    </w:p>
+    <w:p>
+      <w:pPr>
         <w:rPr>
           <w:rFonts w:ascii="Calibri" w:cs="Calibri" w:eastAsia="Calibri" w:hAnsi="Calibri"/>
         </w:rPr>
       </w:pPr>
+      <w:r>
+        <w:rPr>
+          <w:rtl w:val="0"/>
+        </w:rPr>
+        <w:t xml:space="preserve">A diferencia de las soluciones genéricas de cartelería digital que operan bajo suscripciones comerciales públicas tipo SaaS, el proyecto ACE adopta un modelo de software a medida para uso operacional interno (Internal Tooling) de Lumina Motion Studio. Este enfoque estratégico genera un triple impacto financiero y competitivo:</w:t>
+        <w:br w:type="textWrapping"/>
+        <w:t xml:space="preserve">1. Eliminación de Licenciamiento Recurrente: Se sustituye el pago mensual por pantalla de licencias comerciales fragmentadas (como MadMapper y Arena.im) por una plataforma propia, escalable y sin costo marginal por dispositivo incorporado.</w:t>
+        <w:br w:type="textWrapping"/>
+        <w:t xml:space="preserve">2. Reducción a Cero de Gastos Logísticos: Se erradica la necesidad de traslados físicos de técnicos in situ para actualizaciones de anuncios vía dispositivos USB en centros comerciales, ahorrando costos directos en horas-hombre, traslados y viáticos.</w:t>
+        <w:br w:type="textWrapping"/>
+        <w:t xml:space="preserve">3. Blindaje Contractual ante Clientes Finales: Al asegurar tolerancia total ante caídas de internet (resiliencia offline), Lumina Motion elimina el riesgo de sanciones comerciales y pérdida de ingresos publicitarios derivados de pantallas en negro durante eventos corporativos o campañas masivas.</w:t>
+      </w:r>
       <w:r>
         <w:br w:type="page"/>
       </w:r>
@@ -5996,8 +6049,8 @@
         <w:spacing w:after="120" w:before="360" w:lineRule="auto"/>
         <w:rPr/>
       </w:pPr>
-      <w:bookmarkStart w:colFirst="0" w:colLast="0" w:name="_heading=h.n4i0344bdmob" w:id="18"/>
-      <w:bookmarkEnd w:id="18"/>
+      <w:bookmarkStart w:colFirst="0" w:colLast="0" w:name="_heading=h.n4i0344bdmob" w:id="20"/>
+      <w:bookmarkEnd w:id="20"/>
       <w:r>
         <w:rPr>
           <w:rtl w:val="0"/>
@@ -6012,8 +6065,8 @@
         <w:spacing w:after="80" w:before="280" w:lineRule="auto"/>
         <w:rPr/>
       </w:pPr>
-      <w:bookmarkStart w:colFirst="0" w:colLast="0" w:name="_heading=h.c6nytzpz9krs" w:id="19"/>
-      <w:bookmarkEnd w:id="19"/>
+      <w:bookmarkStart w:colFirst="0" w:colLast="0" w:name="_heading=h.c6nytzpz9krs" w:id="21"/>
+      <w:bookmarkEnd w:id="21"/>
       <w:r>
         <w:rPr>
           <w:rtl w:val="0"/>
@@ -6040,8 +6093,8 @@
         <w:spacing w:after="40" w:before="200" w:lineRule="auto"/>
         <w:rPr/>
       </w:pPr>
-      <w:bookmarkStart w:colFirst="0" w:colLast="0" w:name="_heading=h.kiovd6eb4qlc" w:id="20"/>
-      <w:bookmarkEnd w:id="20"/>
+      <w:bookmarkStart w:colFirst="0" w:colLast="0" w:name="_heading=h.kiovd6eb4qlc" w:id="22"/>
+      <w:bookmarkEnd w:id="22"/>
       <w:r>
         <w:rPr>
           <w:rtl w:val="0"/>
@@ -6086,8 +6139,8 @@
         <w:spacing w:after="40" w:before="200" w:lineRule="auto"/>
         <w:rPr/>
       </w:pPr>
-      <w:bookmarkStart w:colFirst="0" w:colLast="0" w:name="_heading=h.4i6uqzlecoiy" w:id="21"/>
-      <w:bookmarkEnd w:id="21"/>
+      <w:bookmarkStart w:colFirst="0" w:colLast="0" w:name="_heading=h.4i6uqzlecoiy" w:id="23"/>
+      <w:bookmarkEnd w:id="23"/>
       <w:r>
         <w:rPr>
           <w:rtl w:val="0"/>
@@ -6116,9 +6169,7 @@
         <w:spacing w:after="0" w:before="0" w:line="276" w:lineRule="auto"/>
         <w:ind w:left="360" w:right="0" w:hanging="360"/>
         <w:jc w:val="left"/>
-        <w:rPr>
-          <w:rFonts w:ascii="Calibri" w:cs="Calibri" w:eastAsia="Calibri" w:hAnsi="Calibri"/>
-        </w:rPr>
+        <w:rPr/>
       </w:pPr>
       <w:r>
         <w:rPr>
@@ -6176,9 +6227,7 @@
         <w:spacing w:after="0" w:before="0" w:line="276" w:lineRule="auto"/>
         <w:ind w:left="360" w:right="0" w:hanging="360"/>
         <w:jc w:val="left"/>
-        <w:rPr>
-          <w:rFonts w:ascii="Calibri" w:cs="Calibri" w:eastAsia="Calibri" w:hAnsi="Calibri"/>
-        </w:rPr>
+        <w:rPr/>
       </w:pPr>
       <w:r>
         <w:rPr>
@@ -6236,9 +6285,7 @@
         <w:spacing w:after="0" w:before="0" w:line="276" w:lineRule="auto"/>
         <w:ind w:left="360" w:right="0" w:hanging="360"/>
         <w:jc w:val="left"/>
-        <w:rPr>
-          <w:rFonts w:ascii="Calibri" w:cs="Calibri" w:eastAsia="Calibri" w:hAnsi="Calibri"/>
-        </w:rPr>
+        <w:rPr/>
       </w:pPr>
       <w:r>
         <w:rPr>
@@ -6296,9 +6343,7 @@
         <w:spacing w:after="0" w:before="0" w:line="276" w:lineRule="auto"/>
         <w:ind w:left="360" w:right="0" w:hanging="360"/>
         <w:jc w:val="left"/>
-        <w:rPr>
-          <w:rFonts w:ascii="Calibri" w:cs="Calibri" w:eastAsia="Calibri" w:hAnsi="Calibri"/>
-        </w:rPr>
+        <w:rPr/>
       </w:pPr>
       <w:r>
         <w:rPr>
@@ -6356,9 +6401,7 @@
         <w:spacing w:after="60" w:before="0" w:line="276" w:lineRule="auto"/>
         <w:ind w:left="360" w:right="0" w:hanging="360"/>
         <w:jc w:val="left"/>
-        <w:rPr>
-          <w:rFonts w:ascii="Calibri" w:cs="Calibri" w:eastAsia="Calibri" w:hAnsi="Calibri"/>
-        </w:rPr>
+        <w:rPr/>
       </w:pPr>
       <w:r>
         <w:rPr>
@@ -6401,10 +6444,8 @@
           <w:ilvl w:val="0"/>
           <w:numId w:val="1"/>
         </w:numPr>
-        <w:ind w:left="360"/>
-        <w:rPr>
-          <w:rFonts w:ascii="Calibri" w:cs="Calibri" w:eastAsia="Calibri" w:hAnsi="Calibri"/>
-        </w:rPr>
+        <w:ind w:left="360" w:hanging="360"/>
+        <w:rPr/>
       </w:pPr>
       <w:r>
         <w:rPr>
@@ -6445,8 +6486,8 @@
         <w:spacing w:after="80" w:before="280" w:lineRule="auto"/>
         <w:rPr/>
       </w:pPr>
-      <w:bookmarkStart w:colFirst="0" w:colLast="0" w:name="_heading=h.1jgg0ppegonj" w:id="22"/>
-      <w:bookmarkEnd w:id="22"/>
+      <w:bookmarkStart w:colFirst="0" w:colLast="0" w:name="_heading=h.1jgg0ppegonj" w:id="24"/>
+      <w:bookmarkEnd w:id="24"/>
       <w:r>
         <w:rPr>
           <w:rtl w:val="0"/>
@@ -6461,8 +6502,8 @@
         <w:spacing w:after="40" w:before="200" w:lineRule="auto"/>
         <w:rPr/>
       </w:pPr>
-      <w:bookmarkStart w:colFirst="0" w:colLast="0" w:name="_heading=h.2qahxkqijv16" w:id="23"/>
-      <w:bookmarkEnd w:id="23"/>
+      <w:bookmarkStart w:colFirst="0" w:colLast="0" w:name="_heading=h.2qahxkqijv16" w:id="25"/>
+      <w:bookmarkEnd w:id="25"/>
       <w:r>
         <w:rPr>
           <w:rtl w:val="0"/>
@@ -6547,6 +6588,11 @@
         </w:rPr>
         <w:t xml:space="preserve"> Ciclos bisemanales orientados a incrementos de software potencialmente desplegables.</w:t>
       </w:r>
+      <w:r>
+        <w:rPr>
+          <w:rtl w:val="0"/>
+        </w:rPr>
+      </w:r>
     </w:p>
     <w:p>
       <w:pPr>
@@ -6630,6 +6676,11 @@
         </w:rPr>
         <w:t xml:space="preserve"> Sesiones de coordinación virtuales semanales para verificar impedimentos y dependencias entre capas de software.</w:t>
       </w:r>
+      <w:r>
+        <w:rPr>
+          <w:rtl w:val="0"/>
+        </w:rPr>
+      </w:r>
     </w:p>
     <w:p>
       <w:pPr>
@@ -6713,6 +6764,11 @@
         </w:rPr>
         <w:t xml:space="preserve"> Uso estricto de ramas (feature branches) en GitHub, donde ningún cambio se integra a la rama principal (main) sin previa revisión cruzada de código (peer review).</w:t>
       </w:r>
+      <w:r>
+        <w:rPr>
+          <w:rtl w:val="0"/>
+        </w:rPr>
+      </w:r>
     </w:p>
     <w:p>
       <w:pPr>
@@ -6749,8 +6805,8 @@
         <w:spacing w:after="40" w:before="200" w:lineRule="auto"/>
         <w:rPr/>
       </w:pPr>
-      <w:bookmarkStart w:colFirst="0" w:colLast="0" w:name="_heading=h.6odqy81ojh9k" w:id="24"/>
-      <w:bookmarkEnd w:id="24"/>
+      <w:bookmarkStart w:colFirst="0" w:colLast="0" w:name="_heading=h.6odqy81ojh9k" w:id="26"/>
+      <w:bookmarkEnd w:id="26"/>
       <w:r>
         <w:rPr>
           <w:rtl w:val="0"/>
@@ -6865,6 +6921,11 @@
         </w:rPr>
         <w:t xml:space="preserve">esarrollo del mecanismo de almacenamiento en caché y tolerancia a desconexión del player.</w:t>
       </w:r>
+      <w:r>
+        <w:rPr>
+          <w:rtl w:val="0"/>
+        </w:rPr>
+      </w:r>
     </w:p>
     <w:p>
       <w:pPr>
@@ -7000,6 +7061,11 @@
         </w:rPr>
         <w:t xml:space="preserve">Coordinación de reuniones de levantamiento y validación con Cristóbal Manzo (Lumina Motion). Preparación de actas de aceptación y diseño de casos de prueba de aceptación de usuario (UAT).</w:t>
       </w:r>
+      <w:r>
+        <w:rPr>
+          <w:rtl w:val="0"/>
+        </w:rPr>
+      </w:r>
     </w:p>
     <w:p>
       <w:pPr>
@@ -7108,6 +7174,11 @@
         </w:rPr>
         <w:t xml:space="preserve">onstrucción de migraciones y optimización de consultas en MariaDB. Desarrollo de las vistas, componentes de interfaz de usuario y paneles de calendarización horaria. Custodia del estándar documental, elaboración de informes académicos y manuales técnicos.</w:t>
       </w:r>
+      <w:r>
+        <w:rPr>
+          <w:rtl w:val="0"/>
+        </w:rPr>
+      </w:r>
     </w:p>
     <w:p>
       <w:pPr>
@@ -7340,8 +7411,8 @@
         <w:spacing w:after="80" w:before="280" w:lineRule="auto"/>
         <w:rPr/>
       </w:pPr>
-      <w:bookmarkStart w:colFirst="0" w:colLast="0" w:name="_heading=h.6bunf7rcq2lf" w:id="25"/>
-      <w:bookmarkEnd w:id="25"/>
+      <w:bookmarkStart w:colFirst="0" w:colLast="0" w:name="_heading=h.6bunf7rcq2lf" w:id="27"/>
+      <w:bookmarkEnd w:id="27"/>
       <w:r>
         <w:rPr>
           <w:rtl w:val="0"/>
@@ -10949,32 +11020,6 @@
     </w:p>
     <w:p>
       <w:pPr>
-        <w:rPr>
-          <w:rFonts w:ascii="Calibri" w:cs="Calibri" w:eastAsia="Calibri" w:hAnsi="Calibri"/>
-        </w:rPr>
-      </w:pPr>
-      <w:r>
-        <w:rPr>
-          <w:rtl w:val="0"/>
-        </w:rPr>
-      </w:r>
-    </w:p>
-    <w:p>
-      <w:pPr>
-        <w:keepNext w:val="1"/>
-        <w:spacing w:after="80" w:before="280" w:lineRule="auto"/>
-        <w:rPr>
-          <w:rFonts w:ascii="Calibri" w:cs="Calibri" w:eastAsia="Calibri" w:hAnsi="Calibri"/>
-        </w:rPr>
-      </w:pPr>
-      <w:r>
-        <w:rPr>
-          <w:rtl w:val="0"/>
-        </w:rPr>
-      </w:r>
-    </w:p>
-    <w:p>
-      <w:pPr>
         <w:keepNext w:val="1"/>
         <w:spacing w:after="80" w:before="280" w:lineRule="auto"/>
         <w:rPr>
@@ -10994,8 +11039,8 @@
         <w:spacing w:after="80" w:before="280" w:lineRule="auto"/>
         <w:rPr/>
       </w:pPr>
-      <w:bookmarkStart w:colFirst="0" w:colLast="0" w:name="_heading=h.w2hixefaoh6o" w:id="26"/>
-      <w:bookmarkEnd w:id="26"/>
+      <w:bookmarkStart w:colFirst="0" w:colLast="0" w:name="_heading=h.w2hixefaoh6o" w:id="28"/>
+      <w:bookmarkEnd w:id="28"/>
       <w:r>
         <w:rPr>
           <w:rtl w:val="0"/>
@@ -12071,8 +12116,8 @@
         <w:spacing w:after="80" w:before="280" w:lineRule="auto"/>
         <w:rPr/>
       </w:pPr>
-      <w:bookmarkStart w:colFirst="0" w:colLast="0" w:name="_heading=h.ddmcy04ctvzk" w:id="27"/>
-      <w:bookmarkEnd w:id="27"/>
+      <w:bookmarkStart w:colFirst="0" w:colLast="0" w:name="_heading=h.ddmcy04ctvzk" w:id="29"/>
+      <w:bookmarkEnd w:id="29"/>
       <w:r>
         <w:rPr>
           <w:rtl w:val="0"/>
@@ -12942,9 +12987,7 @@
         <w:spacing w:after="0" w:before="0" w:line="276" w:lineRule="auto"/>
         <w:ind w:left="360" w:right="0" w:hanging="360"/>
         <w:jc w:val="left"/>
-        <w:rPr>
-          <w:rFonts w:ascii="Calibri" w:cs="Calibri" w:eastAsia="Calibri" w:hAnsi="Calibri"/>
-        </w:rPr>
+        <w:rPr/>
       </w:pPr>
       <w:r>
         <w:rPr>
@@ -13208,24 +13251,328 @@
     </w:p>
     <w:p>
       <w:pPr>
-        <w:pStyle w:val="Heading1"/>
-        <w:keepNext w:val="1"/>
-        <w:spacing w:after="120" w:before="360" w:lineRule="auto"/>
+        <w:pStyle w:val="Heading2"/>
         <w:rPr/>
       </w:pPr>
-      <w:bookmarkStart w:colFirst="0" w:colLast="0" w:name="_heading=h.n6am33p5jfpu" w:id="28"/>
-      <w:bookmarkEnd w:id="28"/>
-      <w:r>
-        <w:rPr>
-          <w:rtl w:val="0"/>
-        </w:rPr>
-        <w:t xml:space="preserve">III</w:t>
-      </w:r>
-      <w:r>
-        <w:rPr>
-          <w:rtl w:val="0"/>
-        </w:rPr>
-        <w:t xml:space="preserve">. REFERENCIAS BIBLIOGRÁFICAS</w:t>
+      <w:bookmarkStart w:colFirst="0" w:colLast="0" w:name="_heading=h.ul9lkf47iicy" w:id="30"/>
+      <w:bookmarkEnd w:id="30"/>
+      <w:r>
+        <w:rPr>
+          <w:rtl w:val="0"/>
+        </w:rPr>
+        <w:t xml:space="preserve">2.6 Políticas de Seguridad y Protección de la Información</w:t>
+      </w:r>
+    </w:p>
+    <w:p>
+      <w:pPr>
+        <w:rPr/>
+      </w:pPr>
+      <w:r>
+        <w:rPr>
+          <w:rtl w:val="0"/>
+        </w:rPr>
+      </w:r>
+    </w:p>
+    <w:tbl>
+      <w:tblPr>
+        <w:tblStyle w:val="Table7"/>
+        <w:tblpPr w:leftFromText="180" w:rightFromText="180" w:topFromText="180" w:bottomFromText="180" w:vertAnchor="text" w:horzAnchor="text" w:tblpX="-135" w:tblpY="3990.8886718750455"/>
+        <w:tblW w:w="9360.0" w:type="dxa"/>
+        <w:jc w:val="left"/>
+        <w:tblLayout w:type="fixed"/>
+        <w:tblLook w:val="0400"/>
+      </w:tblPr>
+      <w:tblGrid>
+        <w:gridCol w:w="9360"/>
+        <w:tblGridChange w:id="0">
+          <w:tblGrid>
+            <w:gridCol w:w="9360"/>
+          </w:tblGrid>
+        </w:tblGridChange>
+      </w:tblGrid>
+      <w:tr>
+        <w:trPr>
+          <w:cantSplit w:val="0"/>
+          <w:tblHeader w:val="0"/>
+        </w:trPr>
+        <w:tc>
+          <w:tcPr>
+            <w:tcBorders>
+              <w:top w:color="003366" w:space="0" w:sz="12" w:val="dashed"/>
+              <w:left w:color="003366" w:space="0" w:sz="12" w:val="dashed"/>
+              <w:bottom w:color="003366" w:space="0" w:sz="12" w:val="dashed"/>
+              <w:right w:color="003366" w:space="0" w:sz="12" w:val="dashed"/>
+            </w:tcBorders>
+            <w:shd w:fill="f4f6f9" w:val="clear"/>
+          </w:tcPr>
+          <w:p>
+            <w:pPr>
+              <w:jc w:val="center"/>
+              <w:rPr>
+                <w:i w:val="1"/>
+                <w:iCs w:val="1"/>
+                <w:color w:val="646464"/>
+                <w:sz w:val="20"/>
+                <w:szCs w:val="20"/>
+              </w:rPr>
+            </w:pPr>
+            <w:r>
+              <w:rPr>
+                <w:b w:val="1"/>
+                <w:bCs w:val="1"/>
+                <w:color w:val="003366"/>
+                <w:sz w:val="24"/>
+                <w:szCs w:val="24"/>
+                <w:rtl w:val="0"/>
+              </w:rPr>
+              <w:br w:type="textWrapping"/>
+              <w:br w:type="textWrapping"/>
+              <w:t xml:space="preserve">🖼️ [ESPACIO RESERVADO PARA INSERCIÓN DE CAPTURAS / WIREFRAMES DE FIGMA]</w:t>
+              <w:br w:type="textWrapping"/>
+              <w:br w:type="textWrapping"/>
+            </w:r>
+            <w:r>
+              <w:rPr>
+                <w:i w:val="1"/>
+                <w:iCs w:val="1"/>
+                <w:color w:val="646464"/>
+                <w:sz w:val="20"/>
+                <w:szCs w:val="20"/>
+                <w:rtl w:val="0"/>
+              </w:rPr>
+              <w:t xml:space="preserve">Panel Administrativo Centralizado • Parrilla Horaria de Pautas • Monitoreo de Pantallas NUC en Tiempo Real</w:t>
+              <w:br w:type="textWrapping"/>
+              <w:t xml:space="preserve">(Pegue o inserte aquí las imágenes de los prototipos diseñados en Figma antes de la exportación final a PDF)</w:t>
+              <w:br w:type="textWrapping"/>
+              <w:br w:type="textWrapping"/>
+            </w:r>
+          </w:p>
+          <w:p>
+            <w:pPr>
+              <w:jc w:val="center"/>
+              <w:rPr>
+                <w:i w:val="1"/>
+                <w:iCs w:val="1"/>
+                <w:color w:val="646464"/>
+                <w:sz w:val="20"/>
+                <w:szCs w:val="20"/>
+              </w:rPr>
+            </w:pPr>
+            <w:r>
+              <w:rPr>
+                <w:rtl w:val="0"/>
+              </w:rPr>
+            </w:r>
+          </w:p>
+          <w:p>
+            <w:pPr>
+              <w:jc w:val="center"/>
+              <w:rPr>
+                <w:i w:val="1"/>
+                <w:iCs w:val="1"/>
+                <w:color w:val="646464"/>
+                <w:sz w:val="20"/>
+                <w:szCs w:val="20"/>
+              </w:rPr>
+            </w:pPr>
+            <w:r>
+              <w:rPr>
+                <w:rtl w:val="0"/>
+              </w:rPr>
+            </w:r>
+          </w:p>
+          <w:p>
+            <w:pPr>
+              <w:rPr>
+                <w:i w:val="1"/>
+                <w:iCs w:val="1"/>
+                <w:color w:val="646464"/>
+                <w:sz w:val="20"/>
+                <w:szCs w:val="20"/>
+              </w:rPr>
+            </w:pPr>
+            <w:r>
+              <w:rPr>
+                <w:rtl w:val="0"/>
+              </w:rPr>
+            </w:r>
+          </w:p>
+        </w:tc>
+      </w:tr>
+    </w:tbl>
+    <w:p>
+      <w:pPr>
+        <w:rPr/>
+      </w:pPr>
+      <w:r>
+        <w:rPr>
+          <w:rtl w:val="0"/>
+        </w:rPr>
+        <w:t xml:space="preserve">La plataforma ACE implementa medidas de seguridad y privacidad en tres capas fundamentales:</w:t>
+        <w:br w:type="textWrapping"/>
+        <w:t xml:space="preserve">• Autenticación y Control de Accesos por Locación: El acceso a la interfaz web administrativa se gestiona mediante tokens JWT y Laravel Sanctum. Se aplican dos roles diferenciados: Administrador (acceso global irrestricto, utilizado por Cristóbal Manzo) y Operador (acceso estrictamente restringido a las locaciones autorizadas mediante la tabla relacional usuarios_locaciones), impidiendo la visualización o manipulación de contenidos no asignados.</w:t>
+        <w:br w:type="textWrapping"/>
+        <w:t xml:space="preserve">• Verificación de Integridad Criptográfica (SHA-256): Para mitigar el riesgo de inyección o corrupción de archivos multimedia durante transferencias de red, el reproductor local (NUC) calcula mandatoriamente el hash SHA-256 de cada archivo descargado y lo valida contra el catálogo central antes de autorizar su exhibición.</w:t>
+        <w:br w:type="textWrapping"/>
+        <w:t xml:space="preserve">• Seguridad en Comunicaciones y Aislamiento Offline: El canal de sincronización combina endpoints HTTPS REST con WebSockets autenticados (wss://). Ante la caída de conexión exterior, el reproductor no expone puertos vulnerables a internet y restringe la gestión manual de contingencia exclusivamente a la red de área local autorizada.</w:t>
+        <w:br w:type="textWrapping"/>
+        <w:t xml:space="preserve">• Privacidad y Protección de Datos Personales: En estricto cumplimiento de directrices éticas y de protección de identidad, ningún dato personal sensible de los integrantes (tales como números de RUT) se registra en repositorios Git públicos o archivos Markdown, reservándose exclusivamente para el canal privado de titulación.</w:t>
+      </w:r>
+    </w:p>
+    <w:p>
+      <w:pPr>
+        <w:rPr/>
+      </w:pPr>
+      <w:r>
+        <w:rPr>
+          <w:rtl w:val="0"/>
+        </w:rPr>
+      </w:r>
+    </w:p>
+    <w:p>
+      <w:pPr>
+        <w:pStyle w:val="Heading2"/>
+        <w:rPr/>
+      </w:pPr>
+      <w:bookmarkStart w:colFirst="0" w:colLast="0" w:name="_heading=h.5o25aydkdzbb" w:id="31"/>
+      <w:bookmarkEnd w:id="31"/>
+      <w:r>
+        <w:rPr>
+          <w:rtl w:val="0"/>
+        </w:rPr>
+        <w:t xml:space="preserve">2.7 Prototipos Visuales y Wireframes de Interfaz (Mockups UI/UX)</w:t>
+      </w:r>
+    </w:p>
+    <w:p>
+      <w:pPr>
+        <w:rPr/>
+      </w:pPr>
+      <w:r>
+        <w:rPr>
+          <w:rtl w:val="0"/>
+        </w:rPr>
+        <w:t xml:space="preserve">En concordancia con el plan de trabajo de ingeniería (Actividad 2.3: Diseño UI/UX), la plataforma web administrativa contempla interfaces optimizadas para la usabilidad y rapidez operativa de Lumina Motion. Los componentes esenciales incluyen: (a) Panel de control de pantallas con semáforo de telemetría en vivo, (b) Gestor de catálogos multimedia con verificación de códecs y pesos, y (c) Parrilla interactiva para la asignación de horarios sin solapamientos entre locaciones y sectores.</w:t>
+      </w:r>
+    </w:p>
+    <w:p>
+      <w:pPr>
+        <w:pStyle w:val="Heading1"/>
+        <w:rPr/>
+      </w:pPr>
+      <w:bookmarkStart w:colFirst="0" w:colLast="0" w:name="_heading=h.bxchr6a8t4q5" w:id="32"/>
+      <w:bookmarkEnd w:id="32"/>
+      <w:r>
+        <w:rPr>
+          <w:rtl w:val="0"/>
+        </w:rPr>
+        <w:t xml:space="preserve">III: CONCLUSIONES Y VALOR AGREGADO</w:t>
+      </w:r>
+    </w:p>
+    <w:p>
+      <w:pPr>
+        <w:rPr/>
+      </w:pPr>
+      <w:r>
+        <w:rPr>
+          <w:rtl w:val="0"/>
+        </w:rPr>
+      </w:r>
+    </w:p>
+    <w:p>
+      <w:pPr>
+        <w:rPr/>
+      </w:pPr>
+      <w:r>
+        <w:rPr>
+          <w:rtl w:val="0"/>
+        </w:rPr>
+        <w:t xml:space="preserve">La culminación de esta primera fase evaluativa (Fase 1: Definición del Proyecto APT) permite extraer las siguientes conclusiones fundamentales:</w:t>
+        <w:br w:type="textWrapping"/>
+        <w:br w:type="textWrapping"/>
+        <w:t xml:space="preserve">1. Solución de Ingeniería de Alto Valor Industrial: El proyecto ACE trasciende un ejercicio teórico al resolver una problemática operativa auténtica de Lumina Motion Studio. La arquitectura desacoplada propuesta mitiga efectivamente los puntos de falla críticos (actualización manual por USB y vulnerabilidad a pantallas en negro por caídas de internet), asegurando continuidad de negocio y retención publicitaria.</w:t>
+        <w:br w:type="textWrapping"/>
+        <w:br w:type="textWrapping"/>
+        <w:t xml:space="preserve">2. Viabilidad y Factibilidad Acreditadas: El análisis multidimensional confirma la plena viabilidad de ejecutar la plataforma en las 18 semanas lectivas. La delimitación rigurosa del alcance —enfocado estrictamente en la distribución, programación y resiliencia offline de contenidos— resguarda al equipo de desviaciones temporales, mientras que la planificación en 22 actividades articuladas por sprints y la disponibilidad de hardware de pruebas garantizan el cumplimiento de los hitos evaluativos de Duoc UC.</w:t>
+        <w:br w:type="textWrapping"/>
+        <w:br w:type="textWrapping"/>
+        <w:t xml:space="preserve">3. Articulación Transversal del Perfil de Egreso: El diseño de ACE demuestra la aplicación armónica e integrada de las competencias troncales de la carrera de Ingeniería en Informática (Malla Curricular 1446114): desarrollo distribuido fullstack (C1), persistencia relacional íntegra en MariaDB (C2), y metodologías ágiles de ingeniería de software con aseguramiento de calidad (C3). Asimismo, la corresponsabilidad disciplinar establecida entre Tomás Escalante, Matías Salas y Paulo Loyola asegura un trabajo en equipo sinérgico, auditable y con aportes equitativos comprobables a través de GitHub.</w:t>
+        <w:br w:type="textWrapping"/>
+        <w:br w:type="textWrapping"/>
+        <w:t xml:space="preserve">En síntesis, ACE establece las bases técnicas, operativas y metodológicas indispensables para afrontar con éxito la Fase 2 (Construcción del Core y Demostración Funcional), consolidando una solución tecnológica robusta, profesional y de impacto directo en el mercado de la cartelería digital.</w:t>
+      </w:r>
+    </w:p>
+    <w:p>
+      <w:pPr>
+        <w:rPr/>
+      </w:pPr>
+      <w:r>
+        <w:rPr>
+          <w:rtl w:val="0"/>
+        </w:rPr>
+      </w:r>
+    </w:p>
+    <w:p>
+      <w:pPr>
+        <w:rPr/>
+      </w:pPr>
+      <w:r>
+        <w:rPr>
+          <w:rtl w:val="0"/>
+        </w:rPr>
+      </w:r>
+    </w:p>
+    <w:p>
+      <w:pPr>
+        <w:rPr/>
+      </w:pPr>
+      <w:r>
+        <w:rPr>
+          <w:rtl w:val="0"/>
+        </w:rPr>
+      </w:r>
+    </w:p>
+    <w:p>
+      <w:pPr>
+        <w:rPr/>
+      </w:pPr>
+      <w:r>
+        <w:rPr>
+          <w:rtl w:val="0"/>
+        </w:rPr>
+      </w:r>
+    </w:p>
+    <w:p>
+      <w:pPr>
+        <w:rPr/>
+      </w:pPr>
+      <w:r>
+        <w:rPr>
+          <w:rtl w:val="0"/>
+        </w:rPr>
+      </w:r>
+    </w:p>
+    <w:p>
+      <w:pPr>
+        <w:pStyle w:val="Heading1"/>
+        <w:rPr/>
+      </w:pPr>
+      <w:bookmarkStart w:colFirst="0" w:colLast="0" w:name="_heading=h.g76ws4uo1mqi" w:id="33"/>
+      <w:bookmarkEnd w:id="33"/>
+      <w:r>
+        <w:rPr>
+          <w:rtl w:val="0"/>
+        </w:rPr>
+        <w:t xml:space="preserve">IV: REFERENCIAS BIBLIOGRÁFICAS</w:t>
+      </w:r>
+    </w:p>
+    <w:p>
+      <w:pPr>
+        <w:rPr/>
+      </w:pPr>
+      <w:r>
+        <w:rPr>
+          <w:rtl w:val="0"/>
+        </w:rPr>
       </w:r>
     </w:p>
     <w:p>
@@ -13249,9 +13596,7 @@
         <w:spacing w:after="0" w:before="0" w:line="276" w:lineRule="auto"/>
         <w:ind w:left="360" w:right="0" w:hanging="360"/>
         <w:jc w:val="left"/>
-        <w:rPr>
-          <w:rFonts w:ascii="Calibri" w:cs="Calibri" w:eastAsia="Calibri" w:hAnsi="Calibri"/>
-        </w:rPr>
+        <w:rPr/>
       </w:pPr>
       <w:r>
         <w:rPr>
@@ -13296,9 +13641,7 @@
         <w:spacing w:after="0" w:before="0" w:line="276" w:lineRule="auto"/>
         <w:ind w:left="360" w:right="0" w:hanging="360"/>
         <w:jc w:val="left"/>
-        <w:rPr>
-          <w:rFonts w:ascii="Calibri" w:cs="Calibri" w:eastAsia="Calibri" w:hAnsi="Calibri"/>
-        </w:rPr>
+        <w:rPr/>
       </w:pPr>
       <w:r>
         <w:rPr>
@@ -13343,9 +13686,7 @@
         <w:spacing w:after="0" w:before="0" w:line="276" w:lineRule="auto"/>
         <w:ind w:left="360" w:right="0" w:hanging="360"/>
         <w:jc w:val="left"/>
-        <w:rPr>
-          <w:rFonts w:ascii="Calibri" w:cs="Calibri" w:eastAsia="Calibri" w:hAnsi="Calibri"/>
-        </w:rPr>
+        <w:rPr/>
       </w:pPr>
       <w:r>
         <w:rPr>
@@ -13390,9 +13731,7 @@
         <w:spacing w:after="0" w:before="0" w:line="276" w:lineRule="auto"/>
         <w:ind w:left="360" w:right="0" w:hanging="360"/>
         <w:jc w:val="left"/>
-        <w:rPr>
-          <w:rFonts w:ascii="Calibri" w:cs="Calibri" w:eastAsia="Calibri" w:hAnsi="Calibri"/>
-        </w:rPr>
+        <w:rPr/>
       </w:pPr>
       <w:r>
         <w:rPr>
@@ -13437,9 +13776,7 @@
         <w:spacing w:after="0" w:before="0" w:line="276" w:lineRule="auto"/>
         <w:ind w:left="360" w:right="0" w:hanging="360"/>
         <w:jc w:val="left"/>
-        <w:rPr>
-          <w:rFonts w:ascii="Calibri" w:cs="Calibri" w:eastAsia="Calibri" w:hAnsi="Calibri"/>
-        </w:rPr>
+        <w:rPr/>
       </w:pPr>
       <w:r>
         <w:rPr>
@@ -13484,9 +13821,7 @@
         <w:spacing w:after="0" w:before="0" w:line="276" w:lineRule="auto"/>
         <w:ind w:left="360" w:right="0" w:hanging="360"/>
         <w:jc w:val="left"/>
-        <w:rPr>
-          <w:rFonts w:ascii="Calibri" w:cs="Calibri" w:eastAsia="Calibri" w:hAnsi="Calibri"/>
-        </w:rPr>
+        <w:rPr/>
       </w:pPr>
       <w:r>
         <w:rPr>
@@ -13531,9 +13866,7 @@
         <w:spacing w:after="0" w:before="0" w:line="276" w:lineRule="auto"/>
         <w:ind w:left="360" w:right="0" w:hanging="360"/>
         <w:jc w:val="left"/>
-        <w:rPr>
-          <w:rFonts w:ascii="Calibri" w:cs="Calibri" w:eastAsia="Calibri" w:hAnsi="Calibri"/>
-        </w:rPr>
+        <w:rPr/>
       </w:pPr>
       <w:r>
         <w:rPr>
@@ -13578,9 +13911,7 @@
         <w:spacing w:after="60" w:before="0" w:line="276" w:lineRule="auto"/>
         <w:ind w:left="360" w:right="0" w:hanging="360"/>
         <w:jc w:val="left"/>
-        <w:rPr>
-          <w:rFonts w:ascii="Calibri" w:cs="Calibri" w:eastAsia="Calibri" w:hAnsi="Calibri"/>
-        </w:rPr>
+        <w:rPr/>
       </w:pPr>
       <w:r>
         <w:rPr>
@@ -13605,12 +13936,65 @@
       </w:r>
     </w:p>
     <w:sectPr>
+      <w:headerReference r:id="rId7" w:type="default"/>
       <w:pgSz w:h="15840" w:w="12240" w:orient="portrait"/>
       <w:pgMar w:bottom="1440" w:top="1440" w:left="1440" w:right="1440" w:header="720" w:footer="720"/>
       <w:pgNumType w:start="1"/>
     </w:sectPr>
   </w:body>
 </w:document>
+</file>
+
+<file path=word/header1.xml><?xml version="1.0" encoding="utf-8"?>
+<w:hdr xmlns:mc="http://schemas.openxmlformats.org/markup-compatibility/2006" xmlns:o="urn:schemas-microsoft-com:office:office" xmlns:r="http://schemas.openxmlformats.org/officeDocument/2006/relationships" xmlns:m="http://schemas.openxmlformats.org/officeDocument/2006/math" xmlns:v="urn:schemas-microsoft-com:vml" xmlns:wp="http://schemas.openxmlformats.org/drawingml/2006/wordprocessingDrawing" xmlns:w10="urn:schemas-microsoft-com:office:word" xmlns:w="http://schemas.openxmlformats.org/wordprocessingml/2006/main" xmlns:wne="http://schemas.microsoft.com/office/word/2006/wordml" xmlns:sl="http://schemas.openxmlformats.org/schemaLibrary/2006/main" xmlns:a="http://schemas.openxmlformats.org/drawingml/2006/main" xmlns:pic="http://schemas.openxmlformats.org/drawingml/2006/picture" xmlns:c="http://schemas.openxmlformats.org/drawingml/2006/chart" xmlns:lc="http://schemas.openxmlformats.org/drawingml/2006/lockedCanvas" xmlns:dgm="http://schemas.openxmlformats.org/drawingml/2006/diagram" xmlns:wps="http://schemas.microsoft.com/office/word/2010/wordprocessingShape" xmlns:wpg="http://schemas.microsoft.com/office/word/2010/wordprocessingGroup" xmlns:w14="http://schemas.microsoft.com/office/word/2010/wordml" xmlns:w15="http://schemas.microsoft.com/office/word/2012/wordml" xmlns:w16="http://schemas.microsoft.com/office/word/2018/wordml" xmlns:w16cex="http://schemas.microsoft.com/office/word/2018/wordml/cex" xmlns:w16cid="http://schemas.microsoft.com/office/word/2016/wordml/cid" xmlns="http://schemas.microsoft.com/office/tasks/2019/documenttasks" xmlns:cr="http://schemas.microsoft.com/office/comments/2020/reactions">
+  <w:p>
+    <w:pPr>
+      <w:ind w:right="-844.7244094488178"/>
+      <w:jc w:val="right"/>
+      <w:rPr/>
+    </w:pPr>
+    <w:r>
+      <w:rPr/>
+      <w:drawing>
+        <wp:inline distB="114300" distT="114300" distL="114300" distR="114300">
+          <wp:extent cx="2262188" cy="563380"/>
+          <wp:effectExtent b="0" l="0" r="0" t="0"/>
+          <wp:docPr id="1" name="image1.png"/>
+          <a:graphic>
+            <a:graphicData uri="http://schemas.openxmlformats.org/drawingml/2006/picture">
+              <pic:pic>
+                <pic:nvPicPr>
+                  <pic:cNvPr id="0" name="image1.png"/>
+                  <pic:cNvPicPr preferRelativeResize="0"/>
+                </pic:nvPicPr>
+                <pic:blipFill>
+                  <a:blip r:embed="rId1"/>
+                  <a:srcRect b="0" l="0" r="0" t="0"/>
+                  <a:stretch>
+                    <a:fillRect/>
+                  </a:stretch>
+                </pic:blipFill>
+                <pic:spPr>
+                  <a:xfrm>
+                    <a:off x="0" y="0"/>
+                    <a:ext cx="2262188" cy="563380"/>
+                  </a:xfrm>
+                  <a:prstGeom prst="rect"/>
+                  <a:ln/>
+                </pic:spPr>
+              </pic:pic>
+            </a:graphicData>
+          </a:graphic>
+        </wp:inline>
+      </w:drawing>
+    </w:r>
+    <w:r>
+      <w:rPr>
+        <w:rtl w:val="0"/>
+      </w:rPr>
+    </w:r>
+  </w:p>
+</w:hdr>
 </file>
 
 <file path=word/numbering.xml><?xml version="1.0" encoding="utf-8"?>
@@ -13720,7 +14104,7 @@
   <w:docDefaults>
     <w:rPrDefault>
       <w:rPr>
-        <w:rFonts w:ascii="Cambria" w:cs="Cambria" w:eastAsia="Cambria" w:hAnsi="Cambria"/>
+        <w:rFonts w:ascii="Calibri" w:cs="Calibri" w:eastAsia="Calibri" w:hAnsi="Calibri"/>
         <w:sz w:val="22"/>
         <w:szCs w:val="22"/>
         <w:lang w:val="en"/>
@@ -13862,6 +14246,20 @@
       <w:sz w:val="52"/>
       <w:szCs w:val="52"/>
     </w:rPr>
+  </w:style>
+  <w:style w:type="table" w:styleId="TableNormal" w:default="1">
+    <w:name w:val="TableNormal"/>
+    <w:tblPr>
+      <w:tblCellMar>
+        <w:top w:w="100.0" w:type="dxa"/>
+        <w:left w:w="100.0" w:type="dxa"/>
+        <w:bottom w:w="100.0" w:type="dxa"/>
+        <w:right w:w="100.0" w:type="dxa"/>
+      </w:tblCellMar>
+    </w:tblPr>
+  </w:style>
+  <w:style w:type="paragraph" w:styleId="Normal" w:default="1">
+    <w:name w:val="normal"/>
   </w:style>
   <w:style w:type="table" w:styleId="TableNormal" w:default="1">
     <w:name w:val="TableNormal"/>
@@ -25452,6 +25850,84 @@
       </w:tblCellMar>
     </w:tblPr>
   </w:style>
+  <w:style w:type="table" w:styleId="Table1">
+    <w:basedOn w:val="TableNormal"/>
+    <w:tblPr>
+      <w:tblStyleRowBandSize w:val="1"/>
+      <w:tblStyleColBandSize w:val="1"/>
+      <w:tblCellMar>
+        <w:top w:w="0.0" w:type="dxa"/>
+        <w:left w:w="115.0" w:type="dxa"/>
+        <w:bottom w:w="0.0" w:type="dxa"/>
+        <w:right w:w="115.0" w:type="dxa"/>
+      </w:tblCellMar>
+    </w:tblPr>
+  </w:style>
+  <w:style w:type="table" w:styleId="Table2">
+    <w:basedOn w:val="TableNormal"/>
+    <w:tblPr>
+      <w:tblStyleRowBandSize w:val="1"/>
+      <w:tblStyleColBandSize w:val="1"/>
+      <w:tblCellMar>
+        <w:top w:w="0.0" w:type="dxa"/>
+        <w:left w:w="115.0" w:type="dxa"/>
+        <w:bottom w:w="0.0" w:type="dxa"/>
+        <w:right w:w="115.0" w:type="dxa"/>
+      </w:tblCellMar>
+    </w:tblPr>
+  </w:style>
+  <w:style w:type="table" w:styleId="Table3">
+    <w:basedOn w:val="TableNormal"/>
+    <w:tblPr>
+      <w:tblStyleRowBandSize w:val="1"/>
+      <w:tblStyleColBandSize w:val="1"/>
+      <w:tblCellMar>
+        <w:top w:w="0.0" w:type="dxa"/>
+        <w:left w:w="115.0" w:type="dxa"/>
+        <w:bottom w:w="0.0" w:type="dxa"/>
+        <w:right w:w="115.0" w:type="dxa"/>
+      </w:tblCellMar>
+    </w:tblPr>
+  </w:style>
+  <w:style w:type="table" w:styleId="Table4">
+    <w:basedOn w:val="TableNormal"/>
+    <w:tblPr>
+      <w:tblStyleRowBandSize w:val="1"/>
+      <w:tblStyleColBandSize w:val="1"/>
+      <w:tblCellMar>
+        <w:top w:w="0.0" w:type="dxa"/>
+        <w:left w:w="115.0" w:type="dxa"/>
+        <w:bottom w:w="0.0" w:type="dxa"/>
+        <w:right w:w="115.0" w:type="dxa"/>
+      </w:tblCellMar>
+    </w:tblPr>
+  </w:style>
+  <w:style w:type="table" w:styleId="Table5">
+    <w:basedOn w:val="TableNormal"/>
+    <w:tblPr>
+      <w:tblStyleRowBandSize w:val="1"/>
+      <w:tblStyleColBandSize w:val="1"/>
+      <w:tblCellMar>
+        <w:top w:w="0.0" w:type="dxa"/>
+        <w:left w:w="115.0" w:type="dxa"/>
+        <w:bottom w:w="0.0" w:type="dxa"/>
+        <w:right w:w="115.0" w:type="dxa"/>
+      </w:tblCellMar>
+    </w:tblPr>
+  </w:style>
+  <w:style w:type="table" w:styleId="Table6">
+    <w:basedOn w:val="TableNormal"/>
+    <w:tblPr>
+      <w:tblStyleRowBandSize w:val="1"/>
+      <w:tblStyleColBandSize w:val="1"/>
+      <w:tblCellMar>
+        <w:top w:w="0.0" w:type="dxa"/>
+        <w:left w:w="115.0" w:type="dxa"/>
+        <w:bottom w:w="0.0" w:type="dxa"/>
+        <w:right w:w="115.0" w:type="dxa"/>
+      </w:tblCellMar>
+    </w:tblPr>
+  </w:style>
   <w:style w:type="paragraph" w:styleId="Subtitle">
     <w:name w:val="Subtitle"/>
     <w:basedOn w:val="Normal"/>
@@ -25532,6 +26008,19 @@
     </w:tblPr>
   </w:style>
   <w:style w:type="table" w:styleId="Table6">
+    <w:basedOn w:val="TableNormal"/>
+    <w:tblPr>
+      <w:tblStyleRowBandSize w:val="1"/>
+      <w:tblStyleColBandSize w:val="1"/>
+      <w:tblCellMar>
+        <w:top w:w="0.0" w:type="dxa"/>
+        <w:left w:w="115.0" w:type="dxa"/>
+        <w:bottom w:w="0.0" w:type="dxa"/>
+        <w:right w:w="115.0" w:type="dxa"/>
+      </w:tblCellMar>
+    </w:tblPr>
+  </w:style>
+  <w:style w:type="table" w:styleId="Table7">
     <w:basedOn w:val="TableNormal"/>
     <w:tblPr>
       <w:tblStyleRowBandSize w:val="1"/>
@@ -25869,7 +26358,7 @@
 
 <file path=customXML/item1.xml><?xml version="1.0" encoding="utf-8"?>
 <go:gDocsCustomXmlDataStorage xmlns:go="http://customooxmlschemas.google.com/" xmlns:r="http://schemas.openxmlformats.org/officeDocument/2006/relationships" uri="GoogleDocsCustomDataVersion2">
-  <go:docsCustomData xmlns:go="http://customooxmlschemas.google.com/" roundtripDataSignature="AMtx7miCtVJ7cLk1lTfahnGKuKk0rQ/Khw==">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</go:docsCustomData>
+  <go:docsCustomData xmlns:go="http://customooxmlschemas.google.com/" roundtripDataSignature="AMtx7mjb+cLvmjUdaCxGpgditIHy7+HhCw==">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</go:docsCustomData>
 </go:gDocsCustomXmlDataStorage>
 </file>
 

</xml_diff>

<commit_message>
docs(fase1): sincronizar presentacion PPTX con informe Word y modelo operacional
</commit_message>
<xml_diff>
--- a/Borradores/Entrega 1/INFORME_FASE_1_DEFINICION_PROYECTO_ACE.docx
+++ b/Borradores/Entrega 1/INFORME_FASE_1_DEFINICION_PROYECTO_ACE.docx
@@ -820,7 +820,7 @@
     </w:p>
     <w:sdt>
       <w:sdtPr>
-        <w:id w:val="1205793304"/>
+        <w:id w:val="-1008367259"/>
         <w:docPartObj>
           <w:docPartGallery w:val="Table of Contents"/>
           <w:docPartUnique w:val="1"/>
@@ -13271,14 +13271,57 @@
         <w:rPr>
           <w:rtl w:val="0"/>
         </w:rPr>
+        <w:t xml:space="preserve">La plataforma ACE implementa medidas de seguridad y privacidad en tres capas fundamentales:</w:t>
+        <w:br w:type="textWrapping"/>
+        <w:t xml:space="preserve">• Autenticación y Control de Accesos por Locación: El acceso a la interfaz web administrativa se gestiona mediante tokens JWT y Laravel Sanctum. Se aplican dos roles diferenciados: Administrador (acceso global irrestricto, utilizado por Cristóbal Manzo) y Operador (acceso estrictamente restringido a las locaciones autorizadas mediante la tabla relacional usuarios_locaciones), impidiendo la visualización o manipulación de contenidos no asignados.</w:t>
+        <w:br w:type="textWrapping"/>
+        <w:t xml:space="preserve">• Verificación de Integridad Criptográfica (SHA-256): Para mitigar el riesgo de inyección o corrupción de archivos multimedia durante transferencias de red, el reproductor local (NUC) calcula mandatoriamente el hash SHA-256 de cada archivo descargado y lo valida contra el catálogo central antes de autorizar su exhibición.</w:t>
+        <w:br w:type="textWrapping"/>
+        <w:t xml:space="preserve">• Seguridad en Comunicaciones y Aislamiento Offline: El canal de sincronización combina endpoints HTTPS REST con WebSockets autenticados (wss://). Ante la caída de conexión exterior, el reproductor no expone puertos vulnerables a internet y restringe la gestión manual de contingencia exclusivamente a la red de área local autorizada.</w:t>
+        <w:br w:type="textWrapping"/>
+        <w:t xml:space="preserve">• Privacidad y Protección de Datos Personales: En estricto cumplimiento de directrices éticas y de protección de identidad, ningún dato personal sensible de los integrantes (tales como números de RUT) se registra en repositorios Git públicos o archivos Markdown, reservándose exclusivamente para el canal privado de titulación.</w:t>
+      </w:r>
+    </w:p>
+    <w:p>
+      <w:pPr>
+        <w:rPr/>
+      </w:pPr>
+      <w:r>
+        <w:rPr>
+          <w:rtl w:val="0"/>
+        </w:rPr>
+      </w:r>
+    </w:p>
+    <w:p>
+      <w:pPr>
+        <w:pStyle w:val="Heading2"/>
+        <w:rPr/>
+      </w:pPr>
+      <w:bookmarkStart w:colFirst="0" w:colLast="0" w:name="_heading=h.5o25aydkdzbb" w:id="31"/>
+      <w:bookmarkEnd w:id="31"/>
+      <w:r>
+        <w:rPr>
+          <w:rtl w:val="0"/>
+        </w:rPr>
+        <w:t xml:space="preserve">2.7 Prototipos Visuales y Wireframes de Interfaz (Mockups UI/UX)</w:t>
+      </w:r>
+    </w:p>
+    <w:p>
+      <w:pPr>
+        <w:rPr/>
+      </w:pPr>
+      <w:r>
+        <w:rPr>
+          <w:rtl w:val="0"/>
+        </w:rPr>
+        <w:t xml:space="preserve">En concordancia con el plan de trabajo de ingeniería (Actividad 2.3: Diseño UI/UX), la plataforma web administrativa contempla interfaces optimizadas para la usabilidad y rapidez operativa de Lumina Motion. Los componentes esenciales incluyen: (a) Panel de control de pantallas con semáforo de telemetría en vivo, (b) Gestor de catálogos multimedia con verificación de códecs y pesos, y (c) Parrilla interactiva para la asignación de horarios sin solapamientos entre locaciones y sectores.</w:t>
       </w:r>
     </w:p>
     <w:tbl>
       <w:tblPr>
         <w:tblStyle w:val="Table7"/>
-        <w:tblpPr w:leftFromText="180" w:rightFromText="180" w:topFromText="180" w:bottomFromText="180" w:vertAnchor="text" w:horzAnchor="text" w:tblpX="-135" w:tblpY="3990.8886718750455"/>
         <w:tblW w:w="9360.0" w:type="dxa"/>
-        <w:jc w:val="left"/>
+        <w:jc w:val="center"/>
         <w:tblLayout w:type="fixed"/>
         <w:tblLook w:val="0400"/>
       </w:tblPr>
@@ -13349,7 +13392,7 @@
           </w:p>
           <w:p>
             <w:pPr>
-              <w:jc w:val="center"/>
+              <w:jc w:val="left"/>
               <w:rPr>
                 <w:i w:val="1"/>
                 <w:iCs w:val="1"/>
@@ -13366,23 +13409,7 @@
           </w:p>
           <w:p>
             <w:pPr>
-              <w:jc w:val="center"/>
-              <w:rPr>
-                <w:i w:val="1"/>
-                <w:iCs w:val="1"/>
-                <w:color w:val="646464"/>
-                <w:sz w:val="20"/>
-                <w:szCs w:val="20"/>
-              </w:rPr>
-            </w:pPr>
-            <w:r>
-              <w:rPr>
-                <w:rtl w:val="0"/>
-              </w:rPr>
-            </w:r>
-          </w:p>
-          <w:p>
-            <w:pPr>
+              <w:jc w:val="left"/>
               <w:rPr>
                 <w:i w:val="1"/>
                 <w:iCs w:val="1"/>
@@ -13408,50 +13435,6 @@
         <w:rPr>
           <w:rtl w:val="0"/>
         </w:rPr>
-        <w:t xml:space="preserve">La plataforma ACE implementa medidas de seguridad y privacidad en tres capas fundamentales:</w:t>
-        <w:br w:type="textWrapping"/>
-        <w:t xml:space="preserve">• Autenticación y Control de Accesos por Locación: El acceso a la interfaz web administrativa se gestiona mediante tokens JWT y Laravel Sanctum. Se aplican dos roles diferenciados: Administrador (acceso global irrestricto, utilizado por Cristóbal Manzo) y Operador (acceso estrictamente restringido a las locaciones autorizadas mediante la tabla relacional usuarios_locaciones), impidiendo la visualización o manipulación de contenidos no asignados.</w:t>
-        <w:br w:type="textWrapping"/>
-        <w:t xml:space="preserve">• Verificación de Integridad Criptográfica (SHA-256): Para mitigar el riesgo de inyección o corrupción de archivos multimedia durante transferencias de red, el reproductor local (NUC) calcula mandatoriamente el hash SHA-256 de cada archivo descargado y lo valida contra el catálogo central antes de autorizar su exhibición.</w:t>
-        <w:br w:type="textWrapping"/>
-        <w:t xml:space="preserve">• Seguridad en Comunicaciones y Aislamiento Offline: El canal de sincronización combina endpoints HTTPS REST con WebSockets autenticados (wss://). Ante la caída de conexión exterior, el reproductor no expone puertos vulnerables a internet y restringe la gestión manual de contingencia exclusivamente a la red de área local autorizada.</w:t>
-        <w:br w:type="textWrapping"/>
-        <w:t xml:space="preserve">• Privacidad y Protección de Datos Personales: En estricto cumplimiento de directrices éticas y de protección de identidad, ningún dato personal sensible de los integrantes (tales como números de RUT) se registra en repositorios Git públicos o archivos Markdown, reservándose exclusivamente para el canal privado de titulación.</w:t>
-      </w:r>
-    </w:p>
-    <w:p>
-      <w:pPr>
-        <w:rPr/>
-      </w:pPr>
-      <w:r>
-        <w:rPr>
-          <w:rtl w:val="0"/>
-        </w:rPr>
-      </w:r>
-    </w:p>
-    <w:p>
-      <w:pPr>
-        <w:pStyle w:val="Heading2"/>
-        <w:rPr/>
-      </w:pPr>
-      <w:bookmarkStart w:colFirst="0" w:colLast="0" w:name="_heading=h.5o25aydkdzbb" w:id="31"/>
-      <w:bookmarkEnd w:id="31"/>
-      <w:r>
-        <w:rPr>
-          <w:rtl w:val="0"/>
-        </w:rPr>
-        <w:t xml:space="preserve">2.7 Prototipos Visuales y Wireframes de Interfaz (Mockups UI/UX)</w:t>
-      </w:r>
-    </w:p>
-    <w:p>
-      <w:pPr>
-        <w:rPr/>
-      </w:pPr>
-      <w:r>
-        <w:rPr>
-          <w:rtl w:val="0"/>
-        </w:rPr>
-        <w:t xml:space="preserve">En concordancia con el plan de trabajo de ingeniería (Actividad 2.3: Diseño UI/UX), la plataforma web administrativa contempla interfaces optimizadas para la usabilidad y rapidez operativa de Lumina Motion. Los componentes esenciales incluyen: (a) Panel de control de pantallas con semáforo de telemetría en vivo, (b) Gestor de catálogos multimedia con verificación de códecs y pesos, y (c) Parrilla interactiva para la asignación de horarios sin solapamientos entre locaciones y sectores.</w:t>
       </w:r>
     </w:p>
     <w:p>

</xml_diff>

<commit_message>
docs(fase1): actualizar informe con nuevas correcciones de Paulo
</commit_message>
<xml_diff>
--- a/Borradores/Entrega 1/INFORME_FASE_1_DEFINICION_PROYECTO_ACE.docx
+++ b/Borradores/Entrega 1/INFORME_FASE_1_DEFINICION_PROYECTO_ACE.docx
@@ -820,7 +820,7 @@
     </w:p>
     <w:sdt>
       <w:sdtPr>
-        <w:id w:val="-1008367259"/>
+        <w:id w:val="-1394180750"/>
         <w:docPartObj>
           <w:docPartGallery w:val="Table of Contents"/>
           <w:docPartUnique w:val="1"/>
@@ -2528,10 +2528,41 @@
         <w:t xml:space="preserve">El presente informe formaliza la definición de ingeniería, arquitectura, alcance y planificación del proyecto de titulación ACE (Autonomous Content Engine), desarrollado en el marco de la asignatura Proyecto de Aplicación Práctica (Capstone, PTY4614) de la carrera de Ingeniería en Informática de Duoc UC, Sede Antonio Varas.</w:t>
         <w:br w:type="textWrapping"/>
         <w:br w:type="textWrapping"/>
-        <w:t xml:space="preserve">El proyecto aborda una problemática crítica en el ámbito de la cartelería digital (Digital Signage) para el estudio multimedia Lumina Motion Studio: la descentralización operativa de sus pantallas, los altos costos recurrentes de licenciamiento propietario y la vulnerabilidad frente a pérdidas de conectividad en recintos comerciales masivos. A través de una arquitectura cliente-servidor híbrida desacoplada, ACE centraliza la administración remota de medios, locaciones y parrillas de programación, asegurando simultáneamente la continuidad ininterrumpida de reproducción y la capacidad de modificación local ante contingencias sin conexión a internet.</w:t>
+        <w:t xml:space="preserve">El proyecto aborda una problemática crítica en el ámbito de la cartelería digital (Digital Signage) para el estudio multimedia Lumina Motion Studio: </w:t>
+      </w:r>
+      <w:r>
+        <w:rPr>
+          <w:rtl w:val="0"/>
+        </w:rPr>
+        <w:t xml:space="preserve">La gestión de las pantallas de Lumina está descentralizada, utiliza herramientas y procedimientos separados, incluye cargas manuales de contenido y requiere intervención presencial. Esto dificulta el control conjunto de las pantallas y la coordinación de cambios, aumentando el tiempo operativo y el riesgo de errores.</w:t>
+      </w:r>
+    </w:p>
+    <w:p>
+      <w:pPr>
+        <w:rPr/>
+      </w:pPr>
+      <w:r>
+        <w:rPr>
+          <w:sz w:val="22"/>
+          <w:szCs w:val="22"/>
+          <w:rtl w:val="0"/>
+        </w:rPr>
         <w:br w:type="textWrapping"/>
-        <w:br w:type="textWrapping"/>
-        <w:t xml:space="preserve">A lo largo de este documento se detallan los antecedentes del equipo, la articulación directa con las competencias del perfil de egreso, el análisis de factibilidad y modelo operacional, la formulación de los 6 objetivos específicos acordados, el marco ágil de desarrollo (Scrum adaptado), la Carta Gantt de 18 semanas, las directrices de seguridad de la información, el espacio para prototipos de interfaz (mockups) y las conclusiones que sustentan la rigurosidad técnica de esta primera fase evaluativa.</w:t>
+        <w:t xml:space="preserve">A lo largo de este documento se detallan los antecedentes del equipo, la articulación directa con las competencias del perfil de egreso, el análisis de factibilidad y modelo operacional, la formulación de los  objetivos acordados, el marco de desarrollo, la Carta Gantt, la seguridad de la información, mockup</w:t>
+      </w:r>
+      <w:r>
+        <w:rPr>
+          <w:rtl w:val="0"/>
+        </w:rPr>
+        <w:t xml:space="preserve">s</w:t>
+      </w:r>
+      <w:r>
+        <w:rPr>
+          <w:sz w:val="22"/>
+          <w:szCs w:val="22"/>
+          <w:rtl w:val="0"/>
+        </w:rPr>
+        <w:t xml:space="preserve"> y las conclusiones de esta primera fase evaluativa.</w:t>
       </w:r>
       <w:r>
         <w:rPr>
@@ -3144,7 +3175,7 @@
           <w:szCs w:val="22"/>
           <w:rtl w:val="0"/>
         </w:rPr>
-        <w:t xml:space="preserve">ACE (Autonomous Content Engine) es una solución integral de software diseñada para resolver la problemática crítica de operación, gestión y distribución multimedia en redes de cartelería digital (Digital Signage) para el estudio multimedia </w:t>
+        <w:t xml:space="preserve">ACE es una solución integral de software diseñada para resolver la problemática crítica de operación, gestión y distribución multimedia en redes de cartelería digital para el estudio multimedia </w:t>
       </w:r>
       <w:r>
         <w:rPr>
@@ -3280,7 +3311,29 @@
           <w:vertAlign w:val="baseline"/>
           <w:rtl w:val="0"/>
         </w:rPr>
-        <w:t xml:space="preserve"> Parte del parque de pantallas se actualiza de manera manual mediante dispositivos de almacenamiento externo (pendrives USB) in situ.</w:t>
+        <w:t xml:space="preserve"> Parte del parque de pantallas se actualiza de manera manual mediante dispositivos de almacenamiento externo (pendrives USB) </w:t>
+      </w:r>
+      <w:r>
+        <w:rPr>
+          <w:rtl w:val="0"/>
+        </w:rPr>
+        <w:t xml:space="preserve">de forma local</w:t>
+      </w:r>
+      <w:r>
+        <w:rPr>
+          <w:rFonts w:ascii="Calibri" w:cs="Calibri" w:eastAsia="Calibri" w:hAnsi="Calibri"/>
+          <w:i w:val="0"/>
+          <w:iCs w:val="0"/>
+          <w:smallCaps w:val="0"/>
+          <w:strike w:val="0"/>
+          <w:sz w:val="22"/>
+          <w:szCs w:val="22"/>
+          <w:u w:val="none"/>
+          <w:shd w:fill="auto" w:val="clear"/>
+          <w:vertAlign w:val="baseline"/>
+          <w:rtl w:val="0"/>
+        </w:rPr>
+        <w:t xml:space="preserve">.</w:t>
       </w:r>
       <w:r>
         <w:rPr>
@@ -3325,7 +3378,33 @@
           <w:rFonts w:ascii="Calibri" w:cs="Calibri" w:eastAsia="Calibri" w:hAnsi="Calibri"/>
           <w:rtl w:val="0"/>
         </w:rPr>
-        <w:t xml:space="preserve"> Otra porción de las pantallas es administrada mediante herramientas comerciales propietarias y de pago recurrente (tales como MadMapper y Arena.im), las cuales no cuentan con integración entre sí, no ofrecen un panel centralizado de control ni permiten automatizar programaciones horarias segmentadas por locación.</w:t>
+        <w:t xml:space="preserve"> </w:t>
+      </w:r>
+      <w:r>
+        <w:rPr>
+          <w:rtl w:val="0"/>
+        </w:rPr>
+        <w:t xml:space="preserve">Las </w:t>
+      </w:r>
+      <w:r>
+        <w:rPr>
+          <w:rFonts w:ascii="Calibri" w:cs="Calibri" w:eastAsia="Calibri" w:hAnsi="Calibri"/>
+          <w:rtl w:val="0"/>
+        </w:rPr>
+        <w:t xml:space="preserve">pantallas </w:t>
+      </w:r>
+      <w:r>
+        <w:rPr>
+          <w:rtl w:val="0"/>
+        </w:rPr>
+        <w:t xml:space="preserve">son administradas</w:t>
+      </w:r>
+      <w:r>
+        <w:rPr>
+          <w:rFonts w:ascii="Calibri" w:cs="Calibri" w:eastAsia="Calibri" w:hAnsi="Calibri"/>
+          <w:rtl w:val="0"/>
+        </w:rPr>
+        <w:t xml:space="preserve"> mediante herramientas de pago las cuales no cuentan con integración entre sí, no ofrecen un panel centralizado de control ni permiten automatizar programaciones horarias segmentadas por locación.</w:t>
       </w:r>
     </w:p>
     <w:p>
@@ -3383,36 +3462,58 @@
           <w:vertAlign w:val="baseline"/>
           <w:rtl w:val="0"/>
         </w:rPr>
-        <w:t xml:space="preserve"> La dependencia de la conectividad a internet en recintos masivos genera puntos críticos de falla: caídas en el enlace de red provocan pantallas en negro, congelamiento de visuales o interrupción de pautas comerciales ante el público general.</w:t>
-      </w:r>
-      <w:r>
-        <w:rPr>
-          <w:rtl w:val="0"/>
-        </w:rPr>
-      </w:r>
-    </w:p>
-    <w:p>
-      <w:pPr>
-        <w:keepNext w:val="0"/>
-        <w:keepLines w:val="0"/>
-        <w:pageBreakBefore w:val="0"/>
-        <w:widowControl w:val="1"/>
-        <w:pBdr>
-          <w:top w:space="0" w:sz="0" w:val="nil"/>
-          <w:left w:space="0" w:sz="0" w:val="nil"/>
-          <w:bottom w:space="0" w:sz="0" w:val="nil"/>
-          <w:right w:space="0" w:sz="0" w:val="nil"/>
-          <w:between w:space="0" w:sz="0" w:val="nil"/>
-        </w:pBdr>
-        <w:shd w:fill="auto" w:val="clear"/>
-        <w:spacing w:after="60" w:before="0" w:line="276" w:lineRule="auto"/>
-        <w:ind w:left="360" w:right="0" w:firstLine="0"/>
-        <w:jc w:val="left"/>
+        <w:t xml:space="preserve"> La dependencia de la conectividad a internet genera puntos críticos de falla: caídas en el enlace de red</w:t>
+      </w:r>
+      <w:r>
+        <w:rPr>
+          <w:rtl w:val="0"/>
+        </w:rPr>
+        <w:t xml:space="preserve"> pueden</w:t>
+      </w:r>
+      <w:r>
         <w:rPr>
           <w:rFonts w:ascii="Calibri" w:cs="Calibri" w:eastAsia="Calibri" w:hAnsi="Calibri"/>
-          <w:color w:val="2d3748"/>
-        </w:rPr>
-      </w:pPr>
+          <w:i w:val="0"/>
+          <w:iCs w:val="0"/>
+          <w:smallCaps w:val="0"/>
+          <w:strike w:val="0"/>
+          <w:sz w:val="22"/>
+          <w:szCs w:val="22"/>
+          <w:u w:val="none"/>
+          <w:shd w:fill="auto" w:val="clear"/>
+          <w:vertAlign w:val="baseline"/>
+          <w:rtl w:val="0"/>
+        </w:rPr>
+        <w:t xml:space="preserve"> provoca</w:t>
+      </w:r>
+      <w:r>
+        <w:rPr>
+          <w:rtl w:val="0"/>
+        </w:rPr>
+        <w:t xml:space="preserve">r</w:t>
+      </w:r>
+      <w:r>
+        <w:rPr>
+          <w:rFonts w:ascii="Calibri" w:cs="Calibri" w:eastAsia="Calibri" w:hAnsi="Calibri"/>
+          <w:i w:val="0"/>
+          <w:iCs w:val="0"/>
+          <w:smallCaps w:val="0"/>
+          <w:strike w:val="0"/>
+          <w:sz w:val="22"/>
+          <w:szCs w:val="22"/>
+          <w:u w:val="none"/>
+          <w:shd w:fill="auto" w:val="clear"/>
+          <w:vertAlign w:val="baseline"/>
+          <w:rtl w:val="0"/>
+        </w:rPr>
+        <w:t xml:space="preserve"> </w:t>
+      </w:r>
+      <w:r>
+        <w:rPr>
+          <w:rtl w:val="0"/>
+        </w:rPr>
+        <w:t xml:space="preserve">fallos en la programación/muestra del contenido e imposibilita los cambios en el momento</w:t>
+      </w:r>
       <w:r>
         <w:rPr>
           <w:rtl w:val="0"/>
@@ -4477,14 +4578,28 @@
         <w:ind w:left="576" w:right="576" w:firstLine="0"/>
         <w:rPr>
           <w:rFonts w:ascii="Calibri" w:cs="Calibri" w:eastAsia="Calibri" w:hAnsi="Calibri"/>
-          <w:i w:val="1"/>
-          <w:iCs w:val="1"/>
-          <w:color w:val="718096"/>
           <w:sz w:val="21"/>
           <w:szCs w:val="21"/>
         </w:rPr>
       </w:pPr>
       <w:r>
+        <w:rPr>
+          <w:sz w:val="21"/>
+          <w:szCs w:val="21"/>
+          <w:rtl w:val="0"/>
+        </w:rPr>
+        <w:t xml:space="preserve">Mi interés profesional se enfoca en la arquitectura de software, el desarrollo backend y el diseño de sistemas que puedan responder bien ante problemas de conectividad. En ACE aportaré al diseño de los servicios y APIs que conectan la plataforma central con los reproductores locales, además de la lógica de sincronización necesaria para mantener la operación cuando la red no esté disponible. </w:t>
+      </w:r>
+      <w:r>
+        <w:rPr>
+          <w:rtl w:val="0"/>
+        </w:rPr>
+      </w:r>
+    </w:p>
+    <w:p>
+      <w:pPr>
+        <w:spacing w:after="160" w:before="80" w:line="276" w:lineRule="auto"/>
+        <w:ind w:left="576" w:right="576" w:firstLine="0"/>
         <w:rPr>
           <w:rFonts w:ascii="Calibri" w:cs="Calibri" w:eastAsia="Calibri" w:hAnsi="Calibri"/>
           <w:i w:val="1"/>
@@ -4492,22 +4607,6 @@
           <w:color w:val="718096"/>
           <w:sz w:val="21"/>
           <w:szCs w:val="21"/>
-          <w:rtl w:val="0"/>
-        </w:rPr>
-        <w:t xml:space="preserve">"Mi foco profesional se sitúa en la arquitectura de software distribuida, el desarrollo backend de alto rendimiento y la ingeniería de servicios resilientes ante condiciones de conectividad adversas. En ACE, aplico estas competencias diseñando e implementando la lógica de servidor en Laravel, la arquitectura de microservicios o servicios API, los protocolos de sincronización y control bidireccional vía WebSockets entre la nube y los nodos reproductores locales, garantizando una alta disponibilidad del sistema ante interrupciones de red."</w:t>
-      </w:r>
-    </w:p>
-    <w:p>
-      <w:pPr>
-        <w:spacing w:after="160" w:before="80" w:line="276" w:lineRule="auto"/>
-        <w:ind w:left="576" w:right="576" w:firstLine="0"/>
-        <w:rPr>
-          <w:rFonts w:ascii="Calibri" w:cs="Calibri" w:eastAsia="Calibri" w:hAnsi="Calibri"/>
-          <w:i w:val="1"/>
-          <w:iCs w:val="1"/>
-          <w:color w:val="718096"/>
-          <w:sz w:val="21"/>
-          <w:szCs w:val="21"/>
         </w:rPr>
       </w:pPr>
       <w:r>
@@ -4587,7 +4686,7 @@
           <w:szCs w:val="22"/>
           <w:rtl w:val="0"/>
         </w:rPr>
-        <w:t xml:space="preserve">El análisis de factibilidad confirma que el proyecto ACE es 100% viable de completarse satisfactoriamente dentro de las 18 semanas académicas estipuladas por Duoc UC.</w:t>
+        <w:t xml:space="preserve">El análisis de factibilidad confirma que el proyecto ACE es 100% viable de completarse dentro de las 18 semanas estipuladas por Duoc UC.</w:t>
       </w:r>
     </w:p>
     <w:p>
@@ -4634,7 +4733,22 @@
           <w:szCs w:val="22"/>
           <w:rtl w:val="0"/>
         </w:rPr>
-        <w:t xml:space="preserve">El cronograma de 18 semanas (10 de agosto al 12 de diciembre de 2026) se encuentra estructurado en sprints de 2 semanas, permitiendo entregar avances tangibles e incrementales coincidentes con los hitos evaluativos de la carrera:</w:t>
+        <w:t xml:space="preserve">El cronograma de 18 semanas</w:t>
+      </w:r>
+      <w:r>
+        <w:rPr>
+          <w:rtl w:val="0"/>
+        </w:rPr>
+        <w:t xml:space="preserve"> </w:t>
+      </w:r>
+      <w:r>
+        <w:rPr>
+          <w:rFonts w:ascii="Calibri" w:cs="Calibri" w:eastAsia="Calibri" w:hAnsi="Calibri"/>
+          <w:sz w:val="22"/>
+          <w:szCs w:val="22"/>
+          <w:rtl w:val="0"/>
+        </w:rPr>
+        <w:t xml:space="preserve"> se encuentra estructurado en sprints de 2 semanas, permitiendo entregar avances coincidentes con los hitos evaluativos de la carrera:</w:t>
       </w:r>
       <w:r>
         <w:rPr>
@@ -5063,7 +5177,7 @@
           <w:vertAlign w:val="baseline"/>
           <w:rtl w:val="0"/>
         </w:rPr>
-        <w:t xml:space="preserve"> Disponibilidad de equipos portátiles, microcomputadores (Mini-PCs/NUCs) y pantallas secundarias para simular tanto el servidor central como los nodos reproductores de sitio y la desconexión física de red (fail-safe testing).</w:t>
+        <w:t xml:space="preserve"> Disponibilidad de equipos portátiles y pantallas secundarias para simular tanto el servidor central como los nodos reproductores de sitio y la desconexión física de red (fail-safe testing).</w:t>
       </w:r>
       <w:r>
         <w:rPr>
@@ -5203,11 +5317,19 @@
           <w:between w:space="0" w:sz="0" w:val="nil"/>
         </w:pBdr>
         <w:shd w:fill="auto" w:val="clear"/>
-        <w:spacing w:after="0" w:before="0" w:line="276" w:lineRule="auto"/>
+        <w:spacing w:after="60" w:before="0" w:line="276" w:lineRule="auto"/>
         <w:ind w:left="360" w:right="0" w:hanging="360"/>
         <w:jc w:val="left"/>
         <w:rPr/>
       </w:pPr>
+      <w:r>
+        <w:rPr>
+          <w:b w:val="1"/>
+          <w:bCs w:val="1"/>
+          <w:rtl w:val="0"/>
+        </w:rPr>
+        <w:t xml:space="preserve">2</w:t>
+      </w:r>
       <w:r>
         <w:rPr>
           <w:rFonts w:ascii="Calibri" w:cs="Calibri" w:eastAsia="Calibri" w:hAnsi="Calibri"/>
@@ -5224,70 +5346,7 @@
           <w:vertAlign w:val="baseline"/>
           <w:rtl w:val="0"/>
         </w:rPr>
-        <w:t xml:space="preserve">2. Claridad del problema:</w:t>
-      </w:r>
-      <w:r>
-        <w:rPr>
-          <w:rFonts w:ascii="Calibri" w:cs="Calibri" w:eastAsia="Calibri" w:hAnsi="Calibri"/>
-          <w:i w:val="0"/>
-          <w:iCs w:val="0"/>
-          <w:smallCaps w:val="0"/>
-          <w:strike w:val="0"/>
-          <w:sz w:val="22"/>
-          <w:szCs w:val="22"/>
-          <w:u w:val="none"/>
-          <w:shd w:fill="auto" w:val="clear"/>
-          <w:vertAlign w:val="baseline"/>
-          <w:rtl w:val="0"/>
-        </w:rPr>
-        <w:t xml:space="preserve"> Existencia de infraestructura visual instalada actualmente en producción, lo que permite evaluar el impacto de la solución sobre pantallas reales.</w:t>
-      </w:r>
-      <w:r>
-        <w:rPr>
-          <w:rtl w:val="0"/>
-        </w:rPr>
-      </w:r>
-    </w:p>
-    <w:p>
-      <w:pPr>
-        <w:keepNext w:val="0"/>
-        <w:keepLines w:val="0"/>
-        <w:pageBreakBefore w:val="0"/>
-        <w:widowControl w:val="1"/>
-        <w:numPr>
-          <w:ilvl w:val="0"/>
-          <w:numId w:val="1"/>
-        </w:numPr>
-        <w:pBdr>
-          <w:top w:space="0" w:sz="0" w:val="nil"/>
-          <w:left w:space="0" w:sz="0" w:val="nil"/>
-          <w:bottom w:space="0" w:sz="0" w:val="nil"/>
-          <w:right w:space="0" w:sz="0" w:val="nil"/>
-          <w:between w:space="0" w:sz="0" w:val="nil"/>
-        </w:pBdr>
-        <w:shd w:fill="auto" w:val="clear"/>
-        <w:spacing w:after="60" w:before="0" w:line="276" w:lineRule="auto"/>
-        <w:ind w:left="360" w:right="0" w:hanging="360"/>
-        <w:jc w:val="left"/>
-        <w:rPr/>
-      </w:pPr>
-      <w:r>
-        <w:rPr>
-          <w:rFonts w:ascii="Calibri" w:cs="Calibri" w:eastAsia="Calibri" w:hAnsi="Calibri"/>
-          <w:b w:val="1"/>
-          <w:bCs w:val="1"/>
-          <w:i w:val="0"/>
-          <w:iCs w:val="0"/>
-          <w:smallCaps w:val="0"/>
-          <w:strike w:val="0"/>
-          <w:sz w:val="22"/>
-          <w:szCs w:val="22"/>
-          <w:u w:val="none"/>
-          <w:shd w:fill="auto" w:val="clear"/>
-          <w:vertAlign w:val="baseline"/>
-          <w:rtl w:val="0"/>
-        </w:rPr>
-        <w:t xml:space="preserve">3. Complementariedad del equipo:</w:t>
+        <w:t xml:space="preserve">. Complementariedad del equipo:</w:t>
       </w:r>
       <w:r>
         <w:rPr>
@@ -6012,7 +6071,31 @@
         <w:rPr>
           <w:rtl w:val="0"/>
         </w:rPr>
-        <w:t xml:space="preserve">1.5.5 Modelo de Negocio e Impacto Operacional para Lumina Motion</w:t>
+        <w:t xml:space="preserve">1.5.</w:t>
+      </w:r>
+      <w:r>
+        <w:rPr>
+          <w:rtl w:val="0"/>
+        </w:rPr>
+        <w:t xml:space="preserve">5</w:t>
+      </w:r>
+      <w:r>
+        <w:rPr>
+          <w:rtl w:val="0"/>
+        </w:rPr>
+        <w:t xml:space="preserve"> Modelo de Negócio e Impacto Operacional para </w:t>
+      </w:r>
+      <w:r>
+        <w:rPr>
+          <w:rtl w:val="0"/>
+        </w:rPr>
+        <w:t xml:space="preserve">Lumina</w:t>
+      </w:r>
+      <w:r>
+        <w:rPr>
+          <w:rtl w:val="0"/>
+        </w:rPr>
+        <w:t xml:space="preserve"> Motion</w:t>
       </w:r>
     </w:p>
     <w:p>
@@ -6027,7 +6110,7 @@
         </w:rPr>
         <w:t xml:space="preserve">A diferencia de las soluciones genéricas de cartelería digital que operan bajo suscripciones comerciales públicas tipo SaaS, el proyecto ACE adopta un modelo de software a medida para uso operacional interno (Internal Tooling) de Lumina Motion Studio. Este enfoque estratégico genera un triple impacto financiero y competitivo:</w:t>
         <w:br w:type="textWrapping"/>
-        <w:t xml:space="preserve">1. Eliminación de Licenciamiento Recurrente: Se sustituye el pago mensual por pantalla de licencias comerciales fragmentadas (como MadMapper y Arena.im) por una plataforma propia, escalable y sin costo marginal por dispositivo incorporado.</w:t>
+        <w:t xml:space="preserve">1. Eliminación de Licenciamiento Recurrente: Se sustituye el pago mensual por pantalla de licencias comerciales fragmentadas (como MagicINFO u OptiSigns) por una plataforma propia, escalable y sin costo marginal por dispositivo incorporado.</w:t>
         <w:br w:type="textWrapping"/>
         <w:t xml:space="preserve">2. Reducción a Cero de Gastos Logísticos: Se erradica la necesidad de traslados físicos de técnicos in situ para actualizaciones de anuncios vía dispositivos USB en centros comerciales, ahorrando costos directos en horas-hombre, traslados y viáticos.</w:t>
         <w:br w:type="textWrapping"/>
@@ -12265,7 +12348,7 @@
           <w:vertAlign w:val="baseline"/>
           <w:rtl w:val="0"/>
         </w:rPr>
-        <w:t xml:space="preserve"> Diagnóstico de la problemática en terreno: análisis de fragmentación entre MadMapper, pendrives y enlaces inestables.</w:t>
+        <w:t xml:space="preserve"> Diagnóstico de la problemática en terreno: análisis de fragmentación entre pendrives y enlaces inestables.</w:t>
       </w:r>
       <w:r>
         <w:rPr>
@@ -12991,10 +13074,18 @@
       </w:pPr>
       <w:r>
         <w:rPr>
+          <w:b w:val="1"/>
+          <w:bCs w:val="1"/>
+          <w:rtl w:val="0"/>
+        </w:rPr>
+        <w:t xml:space="preserve">S14 (09–14 Nov):</w:t>
+      </w:r>
+      <w:r>
+        <w:rPr>
           <w:rFonts w:ascii="Calibri" w:cs="Calibri" w:eastAsia="Calibri" w:hAnsi="Calibri"/>
           <w:rtl w:val="0"/>
         </w:rPr>
-        <w:t xml:space="preserve">S14 (09–14 Nov): Desarrollo del panel web local de emergencia en el nodo local NUC para control manual sin conectividad exterior.</w:t>
+        <w:t xml:space="preserve"> Desarrollo del panel web local de emergencia en el nodo local NUC para control manual sin conectividad exterior.</w:t>
       </w:r>
     </w:p>
     <w:p>
@@ -13265,35 +13356,191 @@
     </w:p>
     <w:p>
       <w:pPr>
+        <w:spacing w:after="240" w:before="240" w:lineRule="auto"/>
         <w:rPr/>
       </w:pPr>
       <w:r>
         <w:rPr>
           <w:rtl w:val="0"/>
         </w:rPr>
-        <w:t xml:space="preserve">La plataforma ACE implementa medidas de seguridad y privacidad en tres capas fundamentales:</w:t>
-        <w:br w:type="textWrapping"/>
-        <w:t xml:space="preserve">• Autenticación y Control de Accesos por Locación: El acceso a la interfaz web administrativa se gestiona mediante tokens JWT y Laravel Sanctum. Se aplican dos roles diferenciados: Administrador (acceso global irrestricto, utilizado por Cristóbal Manzo) y Operador (acceso estrictamente restringido a las locaciones autorizadas mediante la tabla relacional usuarios_locaciones), impidiendo la visualización o manipulación de contenidos no asignados.</w:t>
-        <w:br w:type="textWrapping"/>
-        <w:t xml:space="preserve">• Verificación de Integridad Criptográfica (SHA-256): Para mitigar el riesgo de inyección o corrupción de archivos multimedia durante transferencias de red, el reproductor local (NUC) calcula mandatoriamente el hash SHA-256 de cada archivo descargado y lo valida contra el catálogo central antes de autorizar su exhibición.</w:t>
-        <w:br w:type="textWrapping"/>
-        <w:t xml:space="preserve">• Seguridad en Comunicaciones y Aislamiento Offline: El canal de sincronización combina endpoints HTTPS REST con WebSockets autenticados (wss://). Ante la caída de conexión exterior, el reproductor no expone puertos vulnerables a internet y restringe la gestión manual de contingencia exclusivamente a la red de área local autorizada.</w:t>
-        <w:br w:type="textWrapping"/>
-        <w:t xml:space="preserve">• Privacidad y Protección de Datos Personales: En estricto cumplimiento de directrices éticas y de protección de identidad, ningún dato personal sensible de los integrantes (tales como números de RUT) se registra en repositorios Git públicos o archivos Markdown, reservándose exclusivamente para el canal privado de titulación.</w:t>
+        <w:t xml:space="preserve">La plataforma ACE implementa medidas de seguridad y privacidad en múltiples capas fundamentales:</w:t>
       </w:r>
     </w:p>
     <w:p>
       <w:pPr>
-        <w:rPr/>
-      </w:pPr>
-      <w:r>
-        <w:rPr>
-          <w:rtl w:val="0"/>
-        </w:rPr>
+        <w:numPr>
+          <w:ilvl w:val="0"/>
+          <w:numId w:val="2"/>
+        </w:numPr>
+        <w:spacing w:after="0" w:afterAutospacing="0" w:before="240" w:lineRule="auto"/>
+        <w:ind w:left="720" w:hanging="360"/>
+      </w:pPr>
+      <w:r>
+        <w:rPr>
+          <w:b w:val="1"/>
+          <w:bCs w:val="1"/>
+          <w:rtl w:val="0"/>
+        </w:rPr>
+        <w:t xml:space="preserve">Autenticación y Control de Accesos por Locación:</w:t>
+      </w:r>
+      <w:r>
+        <w:rPr>
+          <w:rtl w:val="0"/>
+        </w:rPr>
+        <w:t xml:space="preserve"> El acceso a la interfaz web administrativa se gestiona mediante tokens JWT y Laravel Sanctum. Se aplican dos roles diferenciados: Administrador (acceso global irrestricto, utilizado por Cristóbal Manzo) y Operador (acceso estrictamente restringido a las locaciones autorizadas mediante la tabla relacional usuarios_locaciones), impidiendo la visualización o manipulación de contenidos no asignados.</w:t>
       </w:r>
     </w:p>
     <w:p>
       <w:pPr>
+        <w:numPr>
+          <w:ilvl w:val="0"/>
+          <w:numId w:val="2"/>
+        </w:numPr>
+        <w:spacing w:after="0" w:afterAutospacing="0" w:before="0" w:beforeAutospacing="0" w:lineRule="auto"/>
+        <w:ind w:left="720" w:hanging="360"/>
+      </w:pPr>
+      <w:r>
+        <w:rPr>
+          <w:b w:val="1"/>
+          <w:bCs w:val="1"/>
+          <w:rtl w:val="0"/>
+        </w:rPr>
+        <w:t xml:space="preserve">Verificación de Integridad Criptográfica (SHA-256):</w:t>
+      </w:r>
+      <w:r>
+        <w:rPr>
+          <w:rtl w:val="0"/>
+        </w:rPr>
+        <w:t xml:space="preserve"> Para mitigar el riesgo de inyección o corrupción de archivos multimedia durante transferencias de red, el reproductor local (NUC) calcula mandatoriamente el hash SHA-256 de cada archivo descargado y lo valida contra el catálogo central antes de autorizar su exhibición.</w:t>
+      </w:r>
+    </w:p>
+    <w:p>
+      <w:pPr>
+        <w:numPr>
+          <w:ilvl w:val="0"/>
+          <w:numId w:val="2"/>
+        </w:numPr>
+        <w:spacing w:after="0" w:afterAutospacing="0" w:before="0" w:beforeAutospacing="0" w:lineRule="auto"/>
+        <w:ind w:left="720" w:hanging="360"/>
+      </w:pPr>
+      <w:r>
+        <w:rPr>
+          <w:b w:val="1"/>
+          <w:bCs w:val="1"/>
+          <w:rtl w:val="0"/>
+        </w:rPr>
+        <w:t xml:space="preserve">Seguridad en Comunicaciones y Aislamiento Offline:</w:t>
+      </w:r>
+      <w:r>
+        <w:rPr>
+          <w:rtl w:val="0"/>
+        </w:rPr>
+        <w:t xml:space="preserve"> El canal de sincronización combina endpoints HTTPS REST con WebSockets autenticados (wss://). Ante la caída de conexión exterior, el reproductor no expone puertos vulnerables a internet y restringe la gestión manual de contingencia exclusivamente a la red de área local autorizada.</w:t>
+      </w:r>
+    </w:p>
+    <w:p>
+      <w:pPr>
+        <w:numPr>
+          <w:ilvl w:val="0"/>
+          <w:numId w:val="2"/>
+        </w:numPr>
+        <w:spacing w:after="0" w:afterAutospacing="0" w:before="0" w:beforeAutospacing="0" w:lineRule="auto"/>
+        <w:ind w:left="720" w:hanging="360"/>
+      </w:pPr>
+      <w:r>
+        <w:rPr>
+          <w:b w:val="1"/>
+          <w:bCs w:val="1"/>
+          <w:rtl w:val="0"/>
+        </w:rPr>
+        <w:t xml:space="preserve">Privacidad y Protección de Datos Personales:</w:t>
+      </w:r>
+      <w:r>
+        <w:rPr>
+          <w:rtl w:val="0"/>
+        </w:rPr>
+        <w:t xml:space="preserve"> En estricto cumplimiento de directrices éticas y de protección de identidad, ningún dato personal sensible de los integrantes (tales como números de RUT) se registra en repositorios Git públicos o archivos Markdown, reservándose exclusivamente para el canal privado de titulación.</w:t>
+      </w:r>
+    </w:p>
+    <w:p>
+      <w:pPr>
+        <w:numPr>
+          <w:ilvl w:val="0"/>
+          <w:numId w:val="2"/>
+        </w:numPr>
+        <w:spacing w:after="0" w:afterAutospacing="0" w:before="0" w:beforeAutospacing="0" w:lineRule="auto"/>
+        <w:ind w:left="720" w:hanging="360"/>
+      </w:pPr>
+      <w:r>
+        <w:rPr>
+          <w:b w:val="1"/>
+          <w:bCs w:val="1"/>
+          <w:rtl w:val="0"/>
+        </w:rPr>
+        <w:t xml:space="preserve">Prevención de Inyección SQL (SQL Injection):</w:t>
+      </w:r>
+      <w:r>
+        <w:rPr>
+          <w:rtl w:val="0"/>
+        </w:rPr>
+        <w:t xml:space="preserve"> Las interacciones con la base de datos se gestionan de manera exclusiva mediante el uso de consultas parametrizadas y el ORM (Object-Relational Mapping) nativo del framework (Laravel Eloquent). Este enfoque garantiza la sanitización automática de todos los datos de entrada suministrados por los usuarios o clientes de la API, neutralizando eficazmente cualquier intento de ejecución de código SQL malicioso o manipulación no autorizada de la estructura de datos.</w:t>
+      </w:r>
+    </w:p>
+    <w:p>
+      <w:pPr>
+        <w:numPr>
+          <w:ilvl w:val="0"/>
+          <w:numId w:val="2"/>
+        </w:numPr>
+        <w:spacing w:after="0" w:afterAutospacing="0" w:before="0" w:beforeAutospacing="0" w:lineRule="auto"/>
+        <w:ind w:left="720" w:hanging="360"/>
+      </w:pPr>
+      <w:r>
+        <w:rPr>
+          <w:b w:val="1"/>
+          <w:bCs w:val="1"/>
+          <w:rtl w:val="0"/>
+        </w:rPr>
+        <w:t xml:space="preserve">Aislamiento de Infraestructura (Raw Isolation):</w:t>
+      </w:r>
+      <w:r>
+        <w:rPr>
+          <w:rtl w:val="0"/>
+        </w:rPr>
+        <w:t xml:space="preserve"> Se establece una arquitectura de segmentación estricta a nivel de sistema y red. Tanto en los servidores centrales como en los reproductores locales (NUC), los procesos críticos y el almacenamiento operan en entornos encapsulados y lógicamente separados. Este nivel de aislamiento impide el acceso lateral y el escalamiento de privilegios, asegurando que un fallo de seguridad en un componente periférico no comprometa el núcleo del sistema operativo ni los datos de telemetría.</w:t>
+      </w:r>
+    </w:p>
+    <w:p>
+      <w:pPr>
+        <w:numPr>
+          <w:ilvl w:val="0"/>
+          <w:numId w:val="2"/>
+        </w:numPr>
+        <w:spacing w:after="240" w:before="0" w:beforeAutospacing="0" w:lineRule="auto"/>
+        <w:ind w:left="720" w:hanging="360"/>
+      </w:pPr>
+      <w:r>
+        <w:rPr>
+          <w:b w:val="1"/>
+          <w:bCs w:val="1"/>
+          <w:rtl w:val="0"/>
+        </w:rPr>
+        <w:t xml:space="preserve">Alineación con la Familia de Normas ISO/IEC 27000:</w:t>
+      </w:r>
+      <w:r>
+        <w:rPr>
+          <w:rtl w:val="0"/>
+        </w:rPr>
+        <w:t xml:space="preserve"> El modelo integral de seguridad se fundamenta en el estándar ISO/IEC 27001 para la gestión continua de riesgos y protección de la información, aplicando los controles técnicos y operativos dictados por la ISO/IEC 27002. Asimismo, el tratamiento de información sensible se alinea con las directrices de privacidad de la ISO/IEC 27701 (y normativas Cloud aplicables), asegurando un marco riguroso para la confidencialidad, la validación criptográfica de multimedia y la disponibilidad operativa en todas las locaciones.</w:t>
+      </w:r>
+      <w:r>
+        <w:rPr>
+          <w:rtl w:val="0"/>
+        </w:rPr>
+      </w:r>
+    </w:p>
+    <w:p>
+      <w:pPr>
         <w:pStyle w:val="Heading2"/>
         <w:rPr/>
       </w:pPr>
@@ -13303,7 +13550,32 @@
         <w:rPr>
           <w:rtl w:val="0"/>
         </w:rPr>
-        <w:t xml:space="preserve">2.7 Prototipos Visuales y Wireframes de Interfaz (Mockups UI/UX)</w:t>
+        <w:t xml:space="preserve">2.7 Prototipos </w:t>
+      </w:r>
+      <w:sdt>
+        <w:sdtPr>
+          <w:id w:val="1539175818"/>
+          <w:tag w:val="goog_rdk_0"/>
+        </w:sdtPr>
+        <w:sdtContent>
+          <w:commentRangeStart w:id="0"/>
+        </w:sdtContent>
+      </w:sdt>
+      <w:r>
+        <w:rPr>
+          <w:rtl w:val="0"/>
+        </w:rPr>
+        <w:t xml:space="preserve">Visuales</w:t>
+      </w:r>
+      <w:commentRangeEnd w:id="0"/>
+      <w:r>
+        <w:commentReference w:id="0"/>
+      </w:r>
+      <w:r>
+        <w:rPr>
+          <w:rtl w:val="0"/>
+        </w:rPr>
+        <w:t xml:space="preserve"> y Wireframes de Interfaz (Mockups UI/UX)</w:t>
       </w:r>
     </w:p>
     <w:p>
@@ -13919,13 +14191,79 @@
       </w:r>
     </w:p>
     <w:sectPr>
-      <w:headerReference r:id="rId7" w:type="default"/>
+      <w:headerReference r:id="rId9" w:type="default"/>
       <w:pgSz w:h="15840" w:w="12240" w:orient="portrait"/>
       <w:pgMar w:bottom="1440" w:top="1440" w:left="1440" w:right="1440" w:header="720" w:footer="720"/>
       <w:pgNumType w:start="1"/>
     </w:sectPr>
   </w:body>
 </w:document>
+</file>
+
+<file path=word/comments.xml><?xml version="1.0" encoding="utf-8"?>
+<w:comments xmlns:mc="http://schemas.openxmlformats.org/markup-compatibility/2006" xmlns:o="urn:schemas-microsoft-com:office:office" xmlns:r="http://schemas.openxmlformats.org/officeDocument/2006/relationships" xmlns:m="http://schemas.openxmlformats.org/officeDocument/2006/math" xmlns:v="urn:schemas-microsoft-com:vml" xmlns:wp="http://schemas.openxmlformats.org/drawingml/2006/wordprocessingDrawing" xmlns:w10="urn:schemas-microsoft-com:office:word" xmlns:w="http://schemas.openxmlformats.org/wordprocessingml/2006/main" xmlns:wne="http://schemas.microsoft.com/office/word/2006/wordml" xmlns:sl="http://schemas.openxmlformats.org/schemaLibrary/2006/main" xmlns:a="http://schemas.openxmlformats.org/drawingml/2006/main" xmlns:pic="http://schemas.openxmlformats.org/drawingml/2006/picture" xmlns:c="http://schemas.openxmlformats.org/drawingml/2006/chart" xmlns:lc="http://schemas.openxmlformats.org/drawingml/2006/lockedCanvas" xmlns:dgm="http://schemas.openxmlformats.org/drawingml/2006/diagram" xmlns:wps="http://schemas.microsoft.com/office/word/2010/wordprocessingShape" xmlns:wpg="http://schemas.microsoft.com/office/word/2010/wordprocessingGroup" xmlns:w14="http://schemas.microsoft.com/office/word/2010/wordml" xmlns:w15="http://schemas.microsoft.com/office/word/2012/wordml" xmlns:w16="http://schemas.microsoft.com/office/word/2018/wordml" xmlns:w16cex="http://schemas.microsoft.com/office/word/2018/wordml/cex" xmlns:w16cid="http://schemas.microsoft.com/office/word/2016/wordml/cid" xmlns="http://schemas.microsoft.com/office/tasks/2019/documenttasks" xmlns:cr="http://schemas.microsoft.com/office/comments/2020/reactions">
+  <w:comment w:author="Paulo Loyola" w:id="0" w:date="2026-09-04T02:50:48Z">
+    <w:p>
+      <w:pPr>
+        <w:keepNext w:val="0"/>
+        <w:keepLines w:val="0"/>
+        <w:pageBreakBefore w:val="0"/>
+        <w:widowControl w:val="0"/>
+        <w:pBdr>
+          <w:top w:space="0" w:sz="0" w:val="nil"/>
+          <w:left w:space="0" w:sz="0" w:val="nil"/>
+          <w:bottom w:space="0" w:sz="0" w:val="nil"/>
+          <w:right w:space="0" w:sz="0" w:val="nil"/>
+          <w:between w:space="0" w:sz="0" w:val="nil"/>
+        </w:pBdr>
+        <w:shd w:fill="auto" w:val="clear"/>
+        <w:spacing w:after="0" w:before="0" w:line="240" w:lineRule="auto"/>
+        <w:ind w:left="0" w:right="0" w:firstLine="0"/>
+        <w:jc w:val="left"/>
+        <w:rPr>
+          <w:rFonts w:ascii="Arial" w:cs="Arial" w:eastAsia="Arial" w:hAnsi="Arial"/>
+          <w:b w:val="0"/>
+          <w:bCs w:val="0"/>
+          <w:i w:val="0"/>
+          <w:iCs w:val="0"/>
+          <w:smallCaps w:val="0"/>
+          <w:strike w:val="0"/>
+          <w:color w:val="000000"/>
+          <w:sz w:val="22"/>
+          <w:szCs w:val="22"/>
+          <w:u w:val="none"/>
+          <w:shd w:fill="auto" w:val="clear"/>
+          <w:vertAlign w:val="baseline"/>
+        </w:rPr>
+      </w:pPr>
+      <w:r>
+        <w:rPr>
+          <w:rFonts w:ascii="Arial" w:cs="Arial" w:eastAsia="Arial" w:hAnsi="Arial"/>
+          <w:b w:val="0"/>
+          <w:bCs w:val="0"/>
+          <w:i w:val="0"/>
+          <w:iCs w:val="0"/>
+          <w:smallCaps w:val="0"/>
+          <w:strike w:val="0"/>
+          <w:color w:val="000000"/>
+          <w:sz w:val="22"/>
+          <w:szCs w:val="22"/>
+          <w:u w:val="none"/>
+          <w:shd w:fill="auto" w:val="clear"/>
+          <w:vertAlign w:val="baseline"/>
+          <w:rtl w:val="0"/>
+        </w:rPr>
+        <w:t xml:space="preserve">@matnicsalas@gmail.com</w:t>
+      </w:r>
+    </w:p>
+  </w:comment>
+</w:comments>
+</file>
+
+<file path=word/commentsExtended.xml><?xml version="1.0" encoding="utf-8"?>
+<w15:commentsEx xmlns:mc="http://schemas.openxmlformats.org/markup-compatibility/2006" xmlns:o="urn:schemas-microsoft-com:office:office" xmlns:r="http://schemas.openxmlformats.org/officeDocument/2006/relationships" xmlns:m="http://schemas.openxmlformats.org/officeDocument/2006/math" xmlns:v="urn:schemas-microsoft-com:vml" xmlns:wp="http://schemas.openxmlformats.org/drawingml/2006/wordprocessingDrawing" xmlns:w10="urn:schemas-microsoft-com:office:word" xmlns:w="http://schemas.openxmlformats.org/wordprocessingml/2006/main" xmlns:wne="http://schemas.microsoft.com/office/word/2006/wordml" xmlns:sl="http://schemas.openxmlformats.org/schemaLibrary/2006/main" xmlns:a="http://schemas.openxmlformats.org/drawingml/2006/main" xmlns:pic="http://schemas.openxmlformats.org/drawingml/2006/picture" xmlns:c="http://schemas.openxmlformats.org/drawingml/2006/chart" xmlns:lc="http://schemas.openxmlformats.org/drawingml/2006/lockedCanvas" xmlns:dgm="http://schemas.openxmlformats.org/drawingml/2006/diagram" xmlns:wps="http://schemas.microsoft.com/office/word/2010/wordprocessingShape" xmlns:wpg="http://schemas.microsoft.com/office/word/2010/wordprocessingGroup" xmlns:w14="http://schemas.microsoft.com/office/word/2010/wordml" xmlns:w15="http://schemas.microsoft.com/office/word/2012/wordml" xmlns:w16="http://schemas.microsoft.com/office/word/2018/wordml" xmlns:w16cex="http://schemas.microsoft.com/office/word/2018/wordml/cex" xmlns:w16cid="http://schemas.microsoft.com/office/word/2016/wordml/cid" xmlns="http://schemas.microsoft.com/office/tasks/2019/documenttasks" xmlns:cr="http://schemas.microsoft.com/office/comments/2020/reactions">
+  <w15:commentEx w15:paraId="000001D7" w15:done="0"/>
+</w15:commentsEx>
 </file>
 
 <file path=word/header1.xml><?xml version="1.0" encoding="utf-8"?>
@@ -14076,8 +14414,121 @@
       <w:rPr/>
     </w:lvl>
   </w:abstractNum>
+  <w:abstractNum w:abstractNumId="2">
+    <w:lvl w:ilvl="0">
+      <w:start w:val="1"/>
+      <w:numFmt w:val="bullet"/>
+      <w:lvlText w:val="●"/>
+      <w:lvlJc w:val="left"/>
+      <w:pPr>
+        <w:ind w:left="720" w:hanging="360"/>
+      </w:pPr>
+      <w:rPr>
+        <w:u w:val="none"/>
+      </w:rPr>
+    </w:lvl>
+    <w:lvl w:ilvl="1">
+      <w:start w:val="1"/>
+      <w:numFmt w:val="bullet"/>
+      <w:lvlText w:val="○"/>
+      <w:lvlJc w:val="left"/>
+      <w:pPr>
+        <w:ind w:left="1440" w:hanging="360"/>
+      </w:pPr>
+      <w:rPr>
+        <w:u w:val="none"/>
+      </w:rPr>
+    </w:lvl>
+    <w:lvl w:ilvl="2">
+      <w:start w:val="1"/>
+      <w:numFmt w:val="bullet"/>
+      <w:lvlText w:val="■"/>
+      <w:lvlJc w:val="left"/>
+      <w:pPr>
+        <w:ind w:left="2160" w:hanging="360"/>
+      </w:pPr>
+      <w:rPr>
+        <w:u w:val="none"/>
+      </w:rPr>
+    </w:lvl>
+    <w:lvl w:ilvl="3">
+      <w:start w:val="1"/>
+      <w:numFmt w:val="bullet"/>
+      <w:lvlText w:val="●"/>
+      <w:lvlJc w:val="left"/>
+      <w:pPr>
+        <w:ind w:left="2880" w:hanging="360"/>
+      </w:pPr>
+      <w:rPr>
+        <w:u w:val="none"/>
+      </w:rPr>
+    </w:lvl>
+    <w:lvl w:ilvl="4">
+      <w:start w:val="1"/>
+      <w:numFmt w:val="bullet"/>
+      <w:lvlText w:val="○"/>
+      <w:lvlJc w:val="left"/>
+      <w:pPr>
+        <w:ind w:left="3600" w:hanging="360"/>
+      </w:pPr>
+      <w:rPr>
+        <w:u w:val="none"/>
+      </w:rPr>
+    </w:lvl>
+    <w:lvl w:ilvl="5">
+      <w:start w:val="1"/>
+      <w:numFmt w:val="bullet"/>
+      <w:lvlText w:val="■"/>
+      <w:lvlJc w:val="left"/>
+      <w:pPr>
+        <w:ind w:left="4320" w:hanging="360"/>
+      </w:pPr>
+      <w:rPr>
+        <w:u w:val="none"/>
+      </w:rPr>
+    </w:lvl>
+    <w:lvl w:ilvl="6">
+      <w:start w:val="1"/>
+      <w:numFmt w:val="bullet"/>
+      <w:lvlText w:val="●"/>
+      <w:lvlJc w:val="left"/>
+      <w:pPr>
+        <w:ind w:left="5040" w:hanging="360"/>
+      </w:pPr>
+      <w:rPr>
+        <w:u w:val="none"/>
+      </w:rPr>
+    </w:lvl>
+    <w:lvl w:ilvl="7">
+      <w:start w:val="1"/>
+      <w:numFmt w:val="bullet"/>
+      <w:lvlText w:val="○"/>
+      <w:lvlJc w:val="left"/>
+      <w:pPr>
+        <w:ind w:left="5760" w:hanging="360"/>
+      </w:pPr>
+      <w:rPr>
+        <w:u w:val="none"/>
+      </w:rPr>
+    </w:lvl>
+    <w:lvl w:ilvl="8">
+      <w:start w:val="1"/>
+      <w:numFmt w:val="bullet"/>
+      <w:lvlText w:val="■"/>
+      <w:lvlJc w:val="left"/>
+      <w:pPr>
+        <w:ind w:left="6480" w:hanging="360"/>
+      </w:pPr>
+      <w:rPr>
+        <w:u w:val="none"/>
+      </w:rPr>
+    </w:lvl>
+  </w:abstractNum>
   <w:num w:numId="1">
     <w:abstractNumId w:val="1"/>
+  </w:num>
+  <w:num w:numId="2">
+    <w:abstractNumId w:val="2"/>
   </w:num>
 </w:numbering>
 </file>
@@ -26341,7 +26792,7 @@
 
 <file path=customXML/item1.xml><?xml version="1.0" encoding="utf-8"?>
 <go:gDocsCustomXmlDataStorage xmlns:go="http://customooxmlschemas.google.com/" xmlns:r="http://schemas.openxmlformats.org/officeDocument/2006/relationships" uri="GoogleDocsCustomDataVersion2">
-  <go:docsCustomData xmlns:go="http://customooxmlschemas.google.com/" roundtripDataSignature="AMtx7mjb+cLvmjUdaCxGpgditIHy7+HhCw==">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</go:docsCustomData>
+  <go:docsCustomData xmlns:go="http://customooxmlschemas.google.com/" roundtripDataSignature="AMtx7mjGM+orutrLHtKXKllvgM7rZ0WOJw==">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</go:docsCustomData>
 </go:gDocsCustomXmlDataStorage>
 </file>
 

</xml_diff>

<commit_message>
docs(borradores): agregar mockups_ace y recursos graficos en Borradores
</commit_message>
<xml_diff>
--- a/Borradores/Entrega 1/INFORME_FASE_1_DEFINICION_PROYECTO_ACE.docx
+++ b/Borradores/Entrega 1/INFORME_FASE_1_DEFINICION_PROYECTO_ACE.docx
@@ -820,7 +820,7 @@
     </w:p>
     <w:sdt>
       <w:sdtPr>
-        <w:id w:val="-1394180750"/>
+        <w:id w:val="-2088928086"/>
         <w:docPartObj>
           <w:docPartGallery w:val="Table of Contents"/>
           <w:docPartUnique w:val="1"/>
@@ -13554,7 +13554,7 @@
       </w:r>
       <w:sdt>
         <w:sdtPr>
-          <w:id w:val="1539175818"/>
+          <w:id w:val="-2085512235"/>
           <w:tag w:val="goog_rdk_0"/>
         </w:sdtPr>
         <w:sdtContent>
@@ -13641,9 +13641,57 @@
                 <w:rtl w:val="0"/>
               </w:rPr>
               <w:br w:type="textWrapping"/>
-              <w:br w:type="textWrapping"/>
-              <w:t xml:space="preserve">🖼️ [ESPACIO RESERVADO PARA INSERCIÓN DE CAPTURAS / WIREFRAMES DE FIGMA]</w:t>
-              <w:br w:type="textWrapping"/>
+            </w:r>
+            <w:r>
+              <w:rPr>
+                <w:b w:val="1"/>
+                <w:bCs w:val="1"/>
+                <w:color w:val="003366"/>
+                <w:sz w:val="24"/>
+                <w:szCs w:val="24"/>
+              </w:rPr>
+              <w:drawing>
+                <wp:inline distB="114300" distT="114300" distL="114300" distR="114300">
+                  <wp:extent cx="5791200" cy="3238500"/>
+                  <wp:effectExtent b="0" l="0" r="0" t="0"/>
+                  <wp:docPr id="2" name="image2.png"/>
+                  <a:graphic>
+                    <a:graphicData uri="http://schemas.openxmlformats.org/drawingml/2006/picture">
+                      <pic:pic>
+                        <pic:nvPicPr>
+                          <pic:cNvPr id="0" name="image2.png"/>
+                          <pic:cNvPicPr preferRelativeResize="0"/>
+                        </pic:nvPicPr>
+                        <pic:blipFill>
+                          <a:blip r:embed="rId9"/>
+                          <a:srcRect b="0" l="0" r="0" t="0"/>
+                          <a:stretch>
+                            <a:fillRect/>
+                          </a:stretch>
+                        </pic:blipFill>
+                        <pic:spPr>
+                          <a:xfrm>
+                            <a:off x="0" y="0"/>
+                            <a:ext cx="5791200" cy="3238500"/>
+                          </a:xfrm>
+                          <a:prstGeom prst="rect"/>
+                          <a:ln/>
+                        </pic:spPr>
+                      </pic:pic>
+                    </a:graphicData>
+                  </a:graphic>
+                </wp:inline>
+              </w:drawing>
+            </w:r>
+            <w:r>
+              <w:rPr>
+                <w:b w:val="1"/>
+                <w:bCs w:val="1"/>
+                <w:color w:val="003366"/>
+                <w:sz w:val="24"/>
+                <w:szCs w:val="24"/>
+                <w:rtl w:val="0"/>
+              </w:rPr>
               <w:br w:type="textWrapping"/>
             </w:r>
             <w:r>
@@ -13655,9 +13703,6 @@
                 <w:szCs w:val="20"/>
                 <w:rtl w:val="0"/>
               </w:rPr>
-              <w:t xml:space="preserve">Panel Administrativo Centralizado • Parrilla Horaria de Pautas • Monitoreo de Pantallas NUC en Tiempo Real</w:t>
-              <w:br w:type="textWrapping"/>
-              <w:t xml:space="preserve">(Pegue o inserte aquí las imágenes de los prototipos diseñados en Figma antes de la exportación final a PDF)</w:t>
               <w:br w:type="textWrapping"/>
               <w:br w:type="textWrapping"/>
             </w:r>
@@ -14191,7 +14236,7 @@
       </w:r>
     </w:p>
     <w:sectPr>
-      <w:headerReference r:id="rId9" w:type="default"/>
+      <w:headerReference r:id="rId10" w:type="default"/>
       <w:pgSz w:h="15840" w:w="12240" w:orient="portrait"/>
       <w:pgMar w:bottom="1440" w:top="1440" w:left="1440" w:right="1440" w:header="720" w:footer="720"/>
       <w:pgNumType w:start="1"/>

</xml_diff>